<commit_message>
Add MATLAB scripts for generating audio data headers
- Created extract_1.m to generate a triangle wave signal, apply a FIR bandpass filter, and export the filtered signal to extract_1.h.
- Created extract_3.m to read the first 2 seconds of an MP3 file, apply a FIR bandpass filter, and export the filtered signal to extract_3.h.
</commit_message>
<xml_diff>
--- a/docs/22653991_Trần Tiến_B11.docx
+++ b/docs/22653991_Trần Tiến_B11.docx
@@ -1065,14 +1065,4725 @@
     </w:p>
     <w:p>
       <w:pPr>
+        <w:pStyle w:val="Heading3"/>
+        <w:rPr>
+          <w:lang w:val="vi-VN"/>
+        </w:rPr>
+      </w:pPr>
+      <w:r>
+        <w:rPr>
+          <w:lang w:val="vi-VN"/>
+        </w:rPr>
+        <w:t>Thiết kế Fir thông dải băng thông 3kHz, tần số trung tâm 4kHz, Fs = 32kHz</w:t>
+      </w:r>
+    </w:p>
+    <w:p>
+      <w:pPr>
+        <w:shd w:val="clear" w:color="auto" w:fill="0A0A0A"/>
+        <w:spacing w:line="285" w:lineRule="atLeast"/>
+        <w:jc w:val="left"/>
+        <w:rPr>
+          <w:rFonts w:ascii="Consolas" w:eastAsia="Times New Roman" w:hAnsi="Consolas" w:cs="Times New Roman"/>
+          <w:color w:val="EDEDED"/>
+          <w:kern w:val="0"/>
+          <w:sz w:val="21"/>
+          <w:szCs w:val="21"/>
+          <w14:ligatures w14:val="none"/>
+        </w:rPr>
+      </w:pPr>
+      <w:r>
+        <w:rPr>
+          <w:rFonts w:ascii="Consolas" w:eastAsia="Times New Roman" w:hAnsi="Consolas" w:cs="Times New Roman"/>
+          <w:color w:val="B675F1"/>
+          <w:kern w:val="0"/>
+          <w:sz w:val="21"/>
+          <w:szCs w:val="21"/>
+          <w14:ligatures w14:val="none"/>
+        </w:rPr>
+        <w:t>clear</w:t>
+      </w:r>
+      <w:r>
+        <w:rPr>
+          <w:rFonts w:ascii="Consolas" w:eastAsia="Times New Roman" w:hAnsi="Consolas" w:cs="Times New Roman"/>
+          <w:color w:val="EDEDED"/>
+          <w:kern w:val="0"/>
+          <w:sz w:val="21"/>
+          <w:szCs w:val="21"/>
+          <w14:ligatures w14:val="none"/>
+        </w:rPr>
+        <w:t xml:space="preserve"> </w:t>
+      </w:r>
+      <w:r>
+        <w:rPr>
+          <w:rFonts w:ascii="Consolas" w:eastAsia="Times New Roman" w:hAnsi="Consolas" w:cs="Times New Roman"/>
+          <w:color w:val="58C760"/>
+          <w:kern w:val="0"/>
+          <w:sz w:val="21"/>
+          <w:szCs w:val="21"/>
+          <w14:ligatures w14:val="none"/>
+        </w:rPr>
+        <w:t>all</w:t>
+      </w:r>
+      <w:r>
+        <w:rPr>
+          <w:rFonts w:ascii="Consolas" w:eastAsia="Times New Roman" w:hAnsi="Consolas" w:cs="Times New Roman"/>
+          <w:color w:val="EDEDED"/>
+          <w:kern w:val="0"/>
+          <w:sz w:val="21"/>
+          <w:szCs w:val="21"/>
+          <w14:ligatures w14:val="none"/>
+        </w:rPr>
+        <w:t>;</w:t>
+      </w:r>
+    </w:p>
+    <w:p>
+      <w:pPr>
+        <w:shd w:val="clear" w:color="auto" w:fill="0A0A0A"/>
+        <w:spacing w:line="285" w:lineRule="atLeast"/>
+        <w:jc w:val="left"/>
+        <w:rPr>
+          <w:rFonts w:ascii="Consolas" w:eastAsia="Times New Roman" w:hAnsi="Consolas" w:cs="Times New Roman"/>
+          <w:color w:val="EDEDED"/>
+          <w:kern w:val="0"/>
+          <w:sz w:val="21"/>
+          <w:szCs w:val="21"/>
+          <w14:ligatures w14:val="none"/>
+        </w:rPr>
+      </w:pPr>
+      <w:r>
+        <w:rPr>
+          <w:rFonts w:ascii="Consolas" w:eastAsia="Times New Roman" w:hAnsi="Consolas" w:cs="Times New Roman"/>
+          <w:color w:val="B675F1"/>
+          <w:kern w:val="0"/>
+          <w:sz w:val="21"/>
+          <w:szCs w:val="21"/>
+          <w14:ligatures w14:val="none"/>
+        </w:rPr>
+        <w:t>close</w:t>
+      </w:r>
+      <w:r>
+        <w:rPr>
+          <w:rFonts w:ascii="Consolas" w:eastAsia="Times New Roman" w:hAnsi="Consolas" w:cs="Times New Roman"/>
+          <w:color w:val="EDEDED"/>
+          <w:kern w:val="0"/>
+          <w:sz w:val="21"/>
+          <w:szCs w:val="21"/>
+          <w14:ligatures w14:val="none"/>
+        </w:rPr>
+        <w:t xml:space="preserve"> </w:t>
+      </w:r>
+      <w:r>
+        <w:rPr>
+          <w:rFonts w:ascii="Consolas" w:eastAsia="Times New Roman" w:hAnsi="Consolas" w:cs="Times New Roman"/>
+          <w:color w:val="58C760"/>
+          <w:kern w:val="0"/>
+          <w:sz w:val="21"/>
+          <w:szCs w:val="21"/>
+          <w14:ligatures w14:val="none"/>
+        </w:rPr>
+        <w:t>all</w:t>
+      </w:r>
+      <w:r>
+        <w:rPr>
+          <w:rFonts w:ascii="Consolas" w:eastAsia="Times New Roman" w:hAnsi="Consolas" w:cs="Times New Roman"/>
+          <w:color w:val="EDEDED"/>
+          <w:kern w:val="0"/>
+          <w:sz w:val="21"/>
+          <w:szCs w:val="21"/>
+          <w14:ligatures w14:val="none"/>
+        </w:rPr>
+        <w:t>;</w:t>
+      </w:r>
+    </w:p>
+    <w:p>
+      <w:pPr>
+        <w:shd w:val="clear" w:color="auto" w:fill="0A0A0A"/>
+        <w:spacing w:line="285" w:lineRule="atLeast"/>
+        <w:jc w:val="left"/>
+        <w:rPr>
+          <w:rFonts w:ascii="Consolas" w:eastAsia="Times New Roman" w:hAnsi="Consolas" w:cs="Times New Roman"/>
+          <w:color w:val="EDEDED"/>
+          <w:kern w:val="0"/>
+          <w:sz w:val="21"/>
+          <w:szCs w:val="21"/>
+          <w14:ligatures w14:val="none"/>
+        </w:rPr>
+      </w:pPr>
+    </w:p>
+    <w:p>
+      <w:pPr>
+        <w:shd w:val="clear" w:color="auto" w:fill="0A0A0A"/>
+        <w:spacing w:line="285" w:lineRule="atLeast"/>
+        <w:jc w:val="left"/>
+        <w:rPr>
+          <w:rFonts w:ascii="Consolas" w:eastAsia="Times New Roman" w:hAnsi="Consolas" w:cs="Times New Roman"/>
+          <w:color w:val="EDEDED"/>
+          <w:kern w:val="0"/>
+          <w:sz w:val="21"/>
+          <w:szCs w:val="21"/>
+          <w14:ligatures w14:val="none"/>
+        </w:rPr>
+      </w:pPr>
+      <w:r>
+        <w:rPr>
+          <w:rFonts w:ascii="Consolas" w:eastAsia="Times New Roman" w:hAnsi="Consolas" w:cs="Times New Roman"/>
+          <w:color w:val="EDEDED"/>
+          <w:kern w:val="0"/>
+          <w:sz w:val="21"/>
+          <w:szCs w:val="21"/>
+          <w14:ligatures w14:val="none"/>
+        </w:rPr>
+        <w:t xml:space="preserve">filename </w:t>
+      </w:r>
+      <w:r>
+        <w:rPr>
+          <w:rFonts w:ascii="Consolas" w:eastAsia="Times New Roman" w:hAnsi="Consolas" w:cs="Times New Roman"/>
+          <w:color w:val="F05B8D"/>
+          <w:kern w:val="0"/>
+          <w:sz w:val="21"/>
+          <w:szCs w:val="21"/>
+          <w14:ligatures w14:val="none"/>
+        </w:rPr>
+        <w:t>=</w:t>
+      </w:r>
+      <w:r>
+        <w:rPr>
+          <w:rFonts w:ascii="Consolas" w:eastAsia="Times New Roman" w:hAnsi="Consolas" w:cs="Times New Roman"/>
+          <w:color w:val="EDEDED"/>
+          <w:kern w:val="0"/>
+          <w:sz w:val="21"/>
+          <w:szCs w:val="21"/>
+          <w14:ligatures w14:val="none"/>
+        </w:rPr>
+        <w:t xml:space="preserve"> </w:t>
+      </w:r>
+      <w:r>
+        <w:rPr>
+          <w:rFonts w:ascii="Consolas" w:eastAsia="Times New Roman" w:hAnsi="Consolas" w:cs="Times New Roman"/>
+          <w:color w:val="58C760"/>
+          <w:kern w:val="0"/>
+          <w:sz w:val="21"/>
+          <w:szCs w:val="21"/>
+          <w14:ligatures w14:val="none"/>
+        </w:rPr>
+        <w:t>'music.mp3'</w:t>
+      </w:r>
+      <w:r>
+        <w:rPr>
+          <w:rFonts w:ascii="Consolas" w:eastAsia="Times New Roman" w:hAnsi="Consolas" w:cs="Times New Roman"/>
+          <w:color w:val="EDEDED"/>
+          <w:kern w:val="0"/>
+          <w:sz w:val="21"/>
+          <w:szCs w:val="21"/>
+          <w14:ligatures w14:val="none"/>
+        </w:rPr>
+        <w:t>;</w:t>
+      </w:r>
+    </w:p>
+    <w:p>
+      <w:pPr>
+        <w:shd w:val="clear" w:color="auto" w:fill="0A0A0A"/>
+        <w:spacing w:line="285" w:lineRule="atLeast"/>
+        <w:jc w:val="left"/>
+        <w:rPr>
+          <w:rFonts w:ascii="Consolas" w:eastAsia="Times New Roman" w:hAnsi="Consolas" w:cs="Times New Roman"/>
+          <w:color w:val="EDEDED"/>
+          <w:kern w:val="0"/>
+          <w:sz w:val="21"/>
+          <w:szCs w:val="21"/>
+          <w14:ligatures w14:val="none"/>
+        </w:rPr>
+      </w:pPr>
+      <w:r>
+        <w:rPr>
+          <w:rFonts w:ascii="Consolas" w:eastAsia="Times New Roman" w:hAnsi="Consolas" w:cs="Times New Roman"/>
+          <w:color w:val="EDEDED"/>
+          <w:kern w:val="0"/>
+          <w:sz w:val="21"/>
+          <w:szCs w:val="21"/>
+          <w14:ligatures w14:val="none"/>
+        </w:rPr>
+        <w:t xml:space="preserve">Fs_target </w:t>
+      </w:r>
+      <w:r>
+        <w:rPr>
+          <w:rFonts w:ascii="Consolas" w:eastAsia="Times New Roman" w:hAnsi="Consolas" w:cs="Times New Roman"/>
+          <w:color w:val="F05B8D"/>
+          <w:kern w:val="0"/>
+          <w:sz w:val="21"/>
+          <w:szCs w:val="21"/>
+          <w14:ligatures w14:val="none"/>
+        </w:rPr>
+        <w:t>=</w:t>
+      </w:r>
+      <w:r>
+        <w:rPr>
+          <w:rFonts w:ascii="Consolas" w:eastAsia="Times New Roman" w:hAnsi="Consolas" w:cs="Times New Roman"/>
+          <w:color w:val="EDEDED"/>
+          <w:kern w:val="0"/>
+          <w:sz w:val="21"/>
+          <w:szCs w:val="21"/>
+          <w14:ligatures w14:val="none"/>
+        </w:rPr>
+        <w:t xml:space="preserve"> </w:t>
+      </w:r>
+      <w:r>
+        <w:rPr>
+          <w:rFonts w:ascii="Consolas" w:eastAsia="Times New Roman" w:hAnsi="Consolas" w:cs="Times New Roman"/>
+          <w:color w:val="62A6FF"/>
+          <w:kern w:val="0"/>
+          <w:sz w:val="21"/>
+          <w:szCs w:val="21"/>
+          <w14:ligatures w14:val="none"/>
+        </w:rPr>
+        <w:t>32000</w:t>
+      </w:r>
+      <w:r>
+        <w:rPr>
+          <w:rFonts w:ascii="Consolas" w:eastAsia="Times New Roman" w:hAnsi="Consolas" w:cs="Times New Roman"/>
+          <w:color w:val="EDEDED"/>
+          <w:kern w:val="0"/>
+          <w:sz w:val="21"/>
+          <w:szCs w:val="21"/>
+          <w14:ligatures w14:val="none"/>
+        </w:rPr>
+        <w:t>;</w:t>
+      </w:r>
+    </w:p>
+    <w:p>
+      <w:pPr>
+        <w:shd w:val="clear" w:color="auto" w:fill="0A0A0A"/>
+        <w:spacing w:line="285" w:lineRule="atLeast"/>
+        <w:jc w:val="left"/>
+        <w:rPr>
+          <w:rFonts w:ascii="Consolas" w:eastAsia="Times New Roman" w:hAnsi="Consolas" w:cs="Times New Roman"/>
+          <w:color w:val="EDEDED"/>
+          <w:kern w:val="0"/>
+          <w:sz w:val="21"/>
+          <w:szCs w:val="21"/>
+          <w14:ligatures w14:val="none"/>
+        </w:rPr>
+      </w:pPr>
+      <w:r>
+        <w:rPr>
+          <w:rFonts w:ascii="Consolas" w:eastAsia="Times New Roman" w:hAnsi="Consolas" w:cs="Times New Roman"/>
+          <w:color w:val="EDEDED"/>
+          <w:kern w:val="0"/>
+          <w:sz w:val="21"/>
+          <w:szCs w:val="21"/>
+          <w14:ligatures w14:val="none"/>
+        </w:rPr>
+        <w:t xml:space="preserve">duration_sec </w:t>
+      </w:r>
+      <w:r>
+        <w:rPr>
+          <w:rFonts w:ascii="Consolas" w:eastAsia="Times New Roman" w:hAnsi="Consolas" w:cs="Times New Roman"/>
+          <w:color w:val="F05B8D"/>
+          <w:kern w:val="0"/>
+          <w:sz w:val="21"/>
+          <w:szCs w:val="21"/>
+          <w14:ligatures w14:val="none"/>
+        </w:rPr>
+        <w:t>=</w:t>
+      </w:r>
+      <w:r>
+        <w:rPr>
+          <w:rFonts w:ascii="Consolas" w:eastAsia="Times New Roman" w:hAnsi="Consolas" w:cs="Times New Roman"/>
+          <w:color w:val="EDEDED"/>
+          <w:kern w:val="0"/>
+          <w:sz w:val="21"/>
+          <w:szCs w:val="21"/>
+          <w14:ligatures w14:val="none"/>
+        </w:rPr>
+        <w:t xml:space="preserve"> </w:t>
+      </w:r>
+      <w:r>
+        <w:rPr>
+          <w:rFonts w:ascii="Consolas" w:eastAsia="Times New Roman" w:hAnsi="Consolas" w:cs="Times New Roman"/>
+          <w:color w:val="62A6FF"/>
+          <w:kern w:val="0"/>
+          <w:sz w:val="21"/>
+          <w:szCs w:val="21"/>
+          <w14:ligatures w14:val="none"/>
+        </w:rPr>
+        <w:t>2</w:t>
+      </w:r>
+      <w:r>
+        <w:rPr>
+          <w:rFonts w:ascii="Consolas" w:eastAsia="Times New Roman" w:hAnsi="Consolas" w:cs="Times New Roman"/>
+          <w:color w:val="EDEDED"/>
+          <w:kern w:val="0"/>
+          <w:sz w:val="21"/>
+          <w:szCs w:val="21"/>
+          <w14:ligatures w14:val="none"/>
+        </w:rPr>
+        <w:t>;</w:t>
+      </w:r>
+    </w:p>
+    <w:p>
+      <w:pPr>
+        <w:shd w:val="clear" w:color="auto" w:fill="0A0A0A"/>
+        <w:spacing w:line="285" w:lineRule="atLeast"/>
+        <w:jc w:val="left"/>
+        <w:rPr>
+          <w:rFonts w:ascii="Consolas" w:eastAsia="Times New Roman" w:hAnsi="Consolas" w:cs="Times New Roman"/>
+          <w:color w:val="EDEDED"/>
+          <w:kern w:val="0"/>
+          <w:sz w:val="21"/>
+          <w:szCs w:val="21"/>
+          <w14:ligatures w14:val="none"/>
+        </w:rPr>
+      </w:pPr>
+    </w:p>
+    <w:p>
+      <w:pPr>
+        <w:shd w:val="clear" w:color="auto" w:fill="0A0A0A"/>
+        <w:spacing w:line="285" w:lineRule="atLeast"/>
+        <w:jc w:val="left"/>
+        <w:rPr>
+          <w:rFonts w:ascii="Consolas" w:eastAsia="Times New Roman" w:hAnsi="Consolas" w:cs="Times New Roman"/>
+          <w:color w:val="EDEDED"/>
+          <w:kern w:val="0"/>
+          <w:sz w:val="21"/>
+          <w:szCs w:val="21"/>
+          <w14:ligatures w14:val="none"/>
+        </w:rPr>
+      </w:pPr>
+      <w:r>
+        <w:rPr>
+          <w:rFonts w:ascii="Consolas" w:eastAsia="Times New Roman" w:hAnsi="Consolas" w:cs="Times New Roman"/>
+          <w:color w:val="EDEDED"/>
+          <w:kern w:val="0"/>
+          <w:sz w:val="21"/>
+          <w:szCs w:val="21"/>
+          <w14:ligatures w14:val="none"/>
+        </w:rPr>
+        <w:t xml:space="preserve">f_center </w:t>
+      </w:r>
+      <w:r>
+        <w:rPr>
+          <w:rFonts w:ascii="Consolas" w:eastAsia="Times New Roman" w:hAnsi="Consolas" w:cs="Times New Roman"/>
+          <w:color w:val="F05B8D"/>
+          <w:kern w:val="0"/>
+          <w:sz w:val="21"/>
+          <w:szCs w:val="21"/>
+          <w14:ligatures w14:val="none"/>
+        </w:rPr>
+        <w:t>=</w:t>
+      </w:r>
+      <w:r>
+        <w:rPr>
+          <w:rFonts w:ascii="Consolas" w:eastAsia="Times New Roman" w:hAnsi="Consolas" w:cs="Times New Roman"/>
+          <w:color w:val="EDEDED"/>
+          <w:kern w:val="0"/>
+          <w:sz w:val="21"/>
+          <w:szCs w:val="21"/>
+          <w14:ligatures w14:val="none"/>
+        </w:rPr>
+        <w:t xml:space="preserve"> </w:t>
+      </w:r>
+      <w:r>
+        <w:rPr>
+          <w:rFonts w:ascii="Consolas" w:eastAsia="Times New Roman" w:hAnsi="Consolas" w:cs="Times New Roman"/>
+          <w:color w:val="62A6FF"/>
+          <w:kern w:val="0"/>
+          <w:sz w:val="21"/>
+          <w:szCs w:val="21"/>
+          <w14:ligatures w14:val="none"/>
+        </w:rPr>
+        <w:t>4000</w:t>
+      </w:r>
+      <w:r>
+        <w:rPr>
+          <w:rFonts w:ascii="Consolas" w:eastAsia="Times New Roman" w:hAnsi="Consolas" w:cs="Times New Roman"/>
+          <w:color w:val="EDEDED"/>
+          <w:kern w:val="0"/>
+          <w:sz w:val="21"/>
+          <w:szCs w:val="21"/>
+          <w14:ligatures w14:val="none"/>
+        </w:rPr>
+        <w:t>;</w:t>
+      </w:r>
+    </w:p>
+    <w:p>
+      <w:pPr>
+        <w:shd w:val="clear" w:color="auto" w:fill="0A0A0A"/>
+        <w:spacing w:line="285" w:lineRule="atLeast"/>
+        <w:jc w:val="left"/>
+        <w:rPr>
+          <w:rFonts w:ascii="Consolas" w:eastAsia="Times New Roman" w:hAnsi="Consolas" w:cs="Times New Roman"/>
+          <w:color w:val="EDEDED"/>
+          <w:kern w:val="0"/>
+          <w:sz w:val="21"/>
+          <w:szCs w:val="21"/>
+          <w14:ligatures w14:val="none"/>
+        </w:rPr>
+      </w:pPr>
+      <w:r>
+        <w:rPr>
+          <w:rFonts w:ascii="Consolas" w:eastAsia="Times New Roman" w:hAnsi="Consolas" w:cs="Times New Roman"/>
+          <w:color w:val="EDEDED"/>
+          <w:kern w:val="0"/>
+          <w:sz w:val="21"/>
+          <w:szCs w:val="21"/>
+          <w14:ligatures w14:val="none"/>
+        </w:rPr>
+        <w:lastRenderedPageBreak/>
+        <w:t xml:space="preserve">bandwidth </w:t>
+      </w:r>
+      <w:r>
+        <w:rPr>
+          <w:rFonts w:ascii="Consolas" w:eastAsia="Times New Roman" w:hAnsi="Consolas" w:cs="Times New Roman"/>
+          <w:color w:val="F05B8D"/>
+          <w:kern w:val="0"/>
+          <w:sz w:val="21"/>
+          <w:szCs w:val="21"/>
+          <w14:ligatures w14:val="none"/>
+        </w:rPr>
+        <w:t>=</w:t>
+      </w:r>
+      <w:r>
+        <w:rPr>
+          <w:rFonts w:ascii="Consolas" w:eastAsia="Times New Roman" w:hAnsi="Consolas" w:cs="Times New Roman"/>
+          <w:color w:val="EDEDED"/>
+          <w:kern w:val="0"/>
+          <w:sz w:val="21"/>
+          <w:szCs w:val="21"/>
+          <w14:ligatures w14:val="none"/>
+        </w:rPr>
+        <w:t xml:space="preserve"> </w:t>
+      </w:r>
+      <w:r>
+        <w:rPr>
+          <w:rFonts w:ascii="Consolas" w:eastAsia="Times New Roman" w:hAnsi="Consolas" w:cs="Times New Roman"/>
+          <w:color w:val="62A6FF"/>
+          <w:kern w:val="0"/>
+          <w:sz w:val="21"/>
+          <w:szCs w:val="21"/>
+          <w14:ligatures w14:val="none"/>
+        </w:rPr>
+        <w:t>3000</w:t>
+      </w:r>
+      <w:r>
+        <w:rPr>
+          <w:rFonts w:ascii="Consolas" w:eastAsia="Times New Roman" w:hAnsi="Consolas" w:cs="Times New Roman"/>
+          <w:color w:val="EDEDED"/>
+          <w:kern w:val="0"/>
+          <w:sz w:val="21"/>
+          <w:szCs w:val="21"/>
+          <w14:ligatures w14:val="none"/>
+        </w:rPr>
+        <w:t>;</w:t>
+      </w:r>
+    </w:p>
+    <w:p>
+      <w:pPr>
+        <w:shd w:val="clear" w:color="auto" w:fill="0A0A0A"/>
+        <w:spacing w:line="285" w:lineRule="atLeast"/>
+        <w:jc w:val="left"/>
+        <w:rPr>
+          <w:rFonts w:ascii="Consolas" w:eastAsia="Times New Roman" w:hAnsi="Consolas" w:cs="Times New Roman"/>
+          <w:color w:val="EDEDED"/>
+          <w:kern w:val="0"/>
+          <w:sz w:val="21"/>
+          <w:szCs w:val="21"/>
+          <w:lang w:val="vi-VN"/>
+          <w14:ligatures w14:val="none"/>
+        </w:rPr>
+      </w:pPr>
+      <w:r>
+        <w:rPr>
+          <w:rFonts w:ascii="Consolas" w:eastAsia="Times New Roman" w:hAnsi="Consolas" w:cs="Times New Roman"/>
+          <w:color w:val="EDEDED"/>
+          <w:kern w:val="0"/>
+          <w:sz w:val="21"/>
+          <w:szCs w:val="21"/>
+          <w14:ligatures w14:val="none"/>
+        </w:rPr>
+        <w:t xml:space="preserve">f1 </w:t>
+      </w:r>
+      <w:r>
+        <w:rPr>
+          <w:rFonts w:ascii="Consolas" w:eastAsia="Times New Roman" w:hAnsi="Consolas" w:cs="Times New Roman"/>
+          <w:color w:val="F05B8D"/>
+          <w:kern w:val="0"/>
+          <w:sz w:val="21"/>
+          <w:szCs w:val="21"/>
+          <w14:ligatures w14:val="none"/>
+        </w:rPr>
+        <w:t>=</w:t>
+      </w:r>
+      <w:r>
+        <w:rPr>
+          <w:rFonts w:ascii="Consolas" w:eastAsia="Times New Roman" w:hAnsi="Consolas" w:cs="Times New Roman"/>
+          <w:color w:val="EDEDED"/>
+          <w:kern w:val="0"/>
+          <w:sz w:val="21"/>
+          <w:szCs w:val="21"/>
+          <w14:ligatures w14:val="none"/>
+        </w:rPr>
+        <w:t xml:space="preserve"> f_center </w:t>
+      </w:r>
+      <w:r>
+        <w:rPr>
+          <w:rFonts w:ascii="Consolas" w:eastAsia="Times New Roman" w:hAnsi="Consolas" w:cs="Times New Roman"/>
+          <w:color w:val="F05B8D"/>
+          <w:kern w:val="0"/>
+          <w:sz w:val="21"/>
+          <w:szCs w:val="21"/>
+          <w14:ligatures w14:val="none"/>
+        </w:rPr>
+        <w:t>-</w:t>
+      </w:r>
+      <w:r>
+        <w:rPr>
+          <w:rFonts w:ascii="Consolas" w:eastAsia="Times New Roman" w:hAnsi="Consolas" w:cs="Times New Roman"/>
+          <w:color w:val="EDEDED"/>
+          <w:kern w:val="0"/>
+          <w:sz w:val="21"/>
+          <w:szCs w:val="21"/>
+          <w14:ligatures w14:val="none"/>
+        </w:rPr>
+        <w:t xml:space="preserve"> bandwidth </w:t>
+      </w:r>
+      <w:r>
+        <w:rPr>
+          <w:rFonts w:ascii="Consolas" w:eastAsia="Times New Roman" w:hAnsi="Consolas" w:cs="Times New Roman"/>
+          <w:color w:val="F05B8D"/>
+          <w:kern w:val="0"/>
+          <w:sz w:val="21"/>
+          <w:szCs w:val="21"/>
+          <w14:ligatures w14:val="none"/>
+        </w:rPr>
+        <w:t>/</w:t>
+      </w:r>
+      <w:r>
+        <w:rPr>
+          <w:rFonts w:ascii="Consolas" w:eastAsia="Times New Roman" w:hAnsi="Consolas" w:cs="Times New Roman"/>
+          <w:color w:val="EDEDED"/>
+          <w:kern w:val="0"/>
+          <w:sz w:val="21"/>
+          <w:szCs w:val="21"/>
+          <w14:ligatures w14:val="none"/>
+        </w:rPr>
+        <w:t xml:space="preserve"> </w:t>
+      </w:r>
+      <w:r>
+        <w:rPr>
+          <w:rFonts w:ascii="Consolas" w:eastAsia="Times New Roman" w:hAnsi="Consolas" w:cs="Times New Roman"/>
+          <w:color w:val="62A6FF"/>
+          <w:kern w:val="0"/>
+          <w:sz w:val="21"/>
+          <w:szCs w:val="21"/>
+          <w14:ligatures w14:val="none"/>
+        </w:rPr>
+        <w:t>2</w:t>
+      </w:r>
+      <w:r>
+        <w:rPr>
+          <w:rFonts w:ascii="Consolas" w:eastAsia="Times New Roman" w:hAnsi="Consolas" w:cs="Times New Roman"/>
+          <w:color w:val="EDEDED"/>
+          <w:kern w:val="0"/>
+          <w:sz w:val="21"/>
+          <w:szCs w:val="21"/>
+          <w14:ligatures w14:val="none"/>
+        </w:rPr>
+        <w:t>;</w:t>
+      </w:r>
+    </w:p>
+    <w:p>
+      <w:pPr>
+        <w:shd w:val="clear" w:color="auto" w:fill="0A0A0A"/>
+        <w:spacing w:line="285" w:lineRule="atLeast"/>
+        <w:jc w:val="left"/>
+        <w:rPr>
+          <w:rFonts w:ascii="Consolas" w:eastAsia="Times New Roman" w:hAnsi="Consolas" w:cs="Times New Roman"/>
+          <w:color w:val="EDEDED"/>
+          <w:kern w:val="0"/>
+          <w:sz w:val="21"/>
+          <w:szCs w:val="21"/>
+          <w:lang w:val="vi-VN"/>
+          <w14:ligatures w14:val="none"/>
+        </w:rPr>
+      </w:pPr>
+      <w:r>
+        <w:rPr>
+          <w:rFonts w:ascii="Consolas" w:eastAsia="Times New Roman" w:hAnsi="Consolas" w:cs="Times New Roman"/>
+          <w:color w:val="EDEDED"/>
+          <w:kern w:val="0"/>
+          <w:sz w:val="21"/>
+          <w:szCs w:val="21"/>
+          <w14:ligatures w14:val="none"/>
+        </w:rPr>
+        <w:t xml:space="preserve">f2 </w:t>
+      </w:r>
+      <w:r>
+        <w:rPr>
+          <w:rFonts w:ascii="Consolas" w:eastAsia="Times New Roman" w:hAnsi="Consolas" w:cs="Times New Roman"/>
+          <w:color w:val="F05B8D"/>
+          <w:kern w:val="0"/>
+          <w:sz w:val="21"/>
+          <w:szCs w:val="21"/>
+          <w14:ligatures w14:val="none"/>
+        </w:rPr>
+        <w:t>=</w:t>
+      </w:r>
+      <w:r>
+        <w:rPr>
+          <w:rFonts w:ascii="Consolas" w:eastAsia="Times New Roman" w:hAnsi="Consolas" w:cs="Times New Roman"/>
+          <w:color w:val="EDEDED"/>
+          <w:kern w:val="0"/>
+          <w:sz w:val="21"/>
+          <w:szCs w:val="21"/>
+          <w14:ligatures w14:val="none"/>
+        </w:rPr>
+        <w:t xml:space="preserve"> f_center </w:t>
+      </w:r>
+      <w:r>
+        <w:rPr>
+          <w:rFonts w:ascii="Consolas" w:eastAsia="Times New Roman" w:hAnsi="Consolas" w:cs="Times New Roman"/>
+          <w:color w:val="F05B8D"/>
+          <w:kern w:val="0"/>
+          <w:sz w:val="21"/>
+          <w:szCs w:val="21"/>
+          <w14:ligatures w14:val="none"/>
+        </w:rPr>
+        <w:t>+</w:t>
+      </w:r>
+      <w:r>
+        <w:rPr>
+          <w:rFonts w:ascii="Consolas" w:eastAsia="Times New Roman" w:hAnsi="Consolas" w:cs="Times New Roman"/>
+          <w:color w:val="EDEDED"/>
+          <w:kern w:val="0"/>
+          <w:sz w:val="21"/>
+          <w:szCs w:val="21"/>
+          <w14:ligatures w14:val="none"/>
+        </w:rPr>
+        <w:t xml:space="preserve"> bandwidth </w:t>
+      </w:r>
+      <w:r>
+        <w:rPr>
+          <w:rFonts w:ascii="Consolas" w:eastAsia="Times New Roman" w:hAnsi="Consolas" w:cs="Times New Roman"/>
+          <w:color w:val="F05B8D"/>
+          <w:kern w:val="0"/>
+          <w:sz w:val="21"/>
+          <w:szCs w:val="21"/>
+          <w14:ligatures w14:val="none"/>
+        </w:rPr>
+        <w:t>/</w:t>
+      </w:r>
+      <w:r>
+        <w:rPr>
+          <w:rFonts w:ascii="Consolas" w:eastAsia="Times New Roman" w:hAnsi="Consolas" w:cs="Times New Roman"/>
+          <w:color w:val="EDEDED"/>
+          <w:kern w:val="0"/>
+          <w:sz w:val="21"/>
+          <w:szCs w:val="21"/>
+          <w14:ligatures w14:val="none"/>
+        </w:rPr>
+        <w:t xml:space="preserve"> </w:t>
+      </w:r>
+      <w:r>
+        <w:rPr>
+          <w:rFonts w:ascii="Consolas" w:eastAsia="Times New Roman" w:hAnsi="Consolas" w:cs="Times New Roman"/>
+          <w:color w:val="62A6FF"/>
+          <w:kern w:val="0"/>
+          <w:sz w:val="21"/>
+          <w:szCs w:val="21"/>
+          <w14:ligatures w14:val="none"/>
+        </w:rPr>
+        <w:t>2</w:t>
+      </w:r>
+      <w:r>
+        <w:rPr>
+          <w:rFonts w:ascii="Consolas" w:eastAsia="Times New Roman" w:hAnsi="Consolas" w:cs="Times New Roman"/>
+          <w:color w:val="EDEDED"/>
+          <w:kern w:val="0"/>
+          <w:sz w:val="21"/>
+          <w:szCs w:val="21"/>
+          <w14:ligatures w14:val="none"/>
+        </w:rPr>
+        <w:t>;</w:t>
+      </w:r>
+    </w:p>
+    <w:p>
+      <w:pPr>
+        <w:shd w:val="clear" w:color="auto" w:fill="0A0A0A"/>
+        <w:spacing w:line="285" w:lineRule="atLeast"/>
+        <w:jc w:val="left"/>
+        <w:rPr>
+          <w:rFonts w:ascii="Consolas" w:eastAsia="Times New Roman" w:hAnsi="Consolas" w:cs="Times New Roman"/>
+          <w:color w:val="EDEDED"/>
+          <w:kern w:val="0"/>
+          <w:sz w:val="21"/>
+          <w:szCs w:val="21"/>
+          <w14:ligatures w14:val="none"/>
+        </w:rPr>
+      </w:pPr>
+    </w:p>
+    <w:p>
+      <w:pPr>
+        <w:shd w:val="clear" w:color="auto" w:fill="0A0A0A"/>
+        <w:spacing w:line="285" w:lineRule="atLeast"/>
+        <w:jc w:val="left"/>
+        <w:rPr>
+          <w:rFonts w:ascii="Consolas" w:eastAsia="Times New Roman" w:hAnsi="Consolas" w:cs="Times New Roman"/>
+          <w:color w:val="EDEDED"/>
+          <w:kern w:val="0"/>
+          <w:sz w:val="21"/>
+          <w:szCs w:val="21"/>
+          <w14:ligatures w14:val="none"/>
+        </w:rPr>
+      </w:pPr>
+      <w:r>
+        <w:rPr>
+          <w:rFonts w:ascii="Consolas" w:eastAsia="Times New Roman" w:hAnsi="Consolas" w:cs="Times New Roman"/>
+          <w:color w:val="EDEDED"/>
+          <w:kern w:val="0"/>
+          <w:sz w:val="21"/>
+          <w:szCs w:val="21"/>
+          <w14:ligatures w14:val="none"/>
+        </w:rPr>
+        <w:t xml:space="preserve">info </w:t>
+      </w:r>
+      <w:r>
+        <w:rPr>
+          <w:rFonts w:ascii="Consolas" w:eastAsia="Times New Roman" w:hAnsi="Consolas" w:cs="Times New Roman"/>
+          <w:color w:val="F05B8D"/>
+          <w:kern w:val="0"/>
+          <w:sz w:val="21"/>
+          <w:szCs w:val="21"/>
+          <w14:ligatures w14:val="none"/>
+        </w:rPr>
+        <w:t>=</w:t>
+      </w:r>
+      <w:r>
+        <w:rPr>
+          <w:rFonts w:ascii="Consolas" w:eastAsia="Times New Roman" w:hAnsi="Consolas" w:cs="Times New Roman"/>
+          <w:color w:val="EDEDED"/>
+          <w:kern w:val="0"/>
+          <w:sz w:val="21"/>
+          <w:szCs w:val="21"/>
+          <w14:ligatures w14:val="none"/>
+        </w:rPr>
+        <w:t xml:space="preserve"> </w:t>
+      </w:r>
+      <w:r>
+        <w:rPr>
+          <w:rFonts w:ascii="Consolas" w:eastAsia="Times New Roman" w:hAnsi="Consolas" w:cs="Times New Roman"/>
+          <w:color w:val="B675F1"/>
+          <w:kern w:val="0"/>
+          <w:sz w:val="21"/>
+          <w:szCs w:val="21"/>
+          <w14:ligatures w14:val="none"/>
+        </w:rPr>
+        <w:t>audioinfo</w:t>
+      </w:r>
+      <w:r>
+        <w:rPr>
+          <w:rFonts w:ascii="Consolas" w:eastAsia="Times New Roman" w:hAnsi="Consolas" w:cs="Times New Roman"/>
+          <w:color w:val="EDEDED"/>
+          <w:kern w:val="0"/>
+          <w:sz w:val="21"/>
+          <w:szCs w:val="21"/>
+          <w14:ligatures w14:val="none"/>
+        </w:rPr>
+        <w:t>(filename);</w:t>
+      </w:r>
+    </w:p>
+    <w:p>
+      <w:pPr>
+        <w:shd w:val="clear" w:color="auto" w:fill="0A0A0A"/>
+        <w:spacing w:line="285" w:lineRule="atLeast"/>
+        <w:jc w:val="left"/>
+        <w:rPr>
+          <w:rFonts w:ascii="Consolas" w:eastAsia="Times New Roman" w:hAnsi="Consolas" w:cs="Times New Roman"/>
+          <w:color w:val="EDEDED"/>
+          <w:kern w:val="0"/>
+          <w:sz w:val="21"/>
+          <w:szCs w:val="21"/>
+          <w14:ligatures w14:val="none"/>
+        </w:rPr>
+      </w:pPr>
+      <w:r>
+        <w:rPr>
+          <w:rFonts w:ascii="Consolas" w:eastAsia="Times New Roman" w:hAnsi="Consolas" w:cs="Times New Roman"/>
+          <w:color w:val="EDEDED"/>
+          <w:kern w:val="0"/>
+          <w:sz w:val="21"/>
+          <w:szCs w:val="21"/>
+          <w14:ligatures w14:val="none"/>
+        </w:rPr>
+        <w:t xml:space="preserve">numSamplesIn </w:t>
+      </w:r>
+      <w:r>
+        <w:rPr>
+          <w:rFonts w:ascii="Consolas" w:eastAsia="Times New Roman" w:hAnsi="Consolas" w:cs="Times New Roman"/>
+          <w:color w:val="F05B8D"/>
+          <w:kern w:val="0"/>
+          <w:sz w:val="21"/>
+          <w:szCs w:val="21"/>
+          <w14:ligatures w14:val="none"/>
+        </w:rPr>
+        <w:t>=</w:t>
+      </w:r>
+      <w:r>
+        <w:rPr>
+          <w:rFonts w:ascii="Consolas" w:eastAsia="Times New Roman" w:hAnsi="Consolas" w:cs="Times New Roman"/>
+          <w:color w:val="EDEDED"/>
+          <w:kern w:val="0"/>
+          <w:sz w:val="21"/>
+          <w:szCs w:val="21"/>
+          <w14:ligatures w14:val="none"/>
+        </w:rPr>
+        <w:t xml:space="preserve"> </w:t>
+      </w:r>
+      <w:r>
+        <w:rPr>
+          <w:rFonts w:ascii="Consolas" w:eastAsia="Times New Roman" w:hAnsi="Consolas" w:cs="Times New Roman"/>
+          <w:color w:val="B675F1"/>
+          <w:kern w:val="0"/>
+          <w:sz w:val="21"/>
+          <w:szCs w:val="21"/>
+          <w14:ligatures w14:val="none"/>
+        </w:rPr>
+        <w:t>min</w:t>
+      </w:r>
+      <w:r>
+        <w:rPr>
+          <w:rFonts w:ascii="Consolas" w:eastAsia="Times New Roman" w:hAnsi="Consolas" w:cs="Times New Roman"/>
+          <w:color w:val="EDEDED"/>
+          <w:kern w:val="0"/>
+          <w:sz w:val="21"/>
+          <w:szCs w:val="21"/>
+          <w14:ligatures w14:val="none"/>
+        </w:rPr>
+        <w:t>(</w:t>
+      </w:r>
+      <w:r>
+        <w:rPr>
+          <w:rFonts w:ascii="Consolas" w:eastAsia="Times New Roman" w:hAnsi="Consolas" w:cs="Times New Roman"/>
+          <w:color w:val="B675F1"/>
+          <w:kern w:val="0"/>
+          <w:sz w:val="21"/>
+          <w:szCs w:val="21"/>
+          <w14:ligatures w14:val="none"/>
+        </w:rPr>
+        <w:t>round</w:t>
+      </w:r>
+      <w:r>
+        <w:rPr>
+          <w:rFonts w:ascii="Consolas" w:eastAsia="Times New Roman" w:hAnsi="Consolas" w:cs="Times New Roman"/>
+          <w:color w:val="EDEDED"/>
+          <w:kern w:val="0"/>
+          <w:sz w:val="21"/>
+          <w:szCs w:val="21"/>
+          <w14:ligatures w14:val="none"/>
+        </w:rPr>
+        <w:t xml:space="preserve">(duration_sec </w:t>
+      </w:r>
+      <w:r>
+        <w:rPr>
+          <w:rFonts w:ascii="Consolas" w:eastAsia="Times New Roman" w:hAnsi="Consolas" w:cs="Times New Roman"/>
+          <w:color w:val="F05B8D"/>
+          <w:kern w:val="0"/>
+          <w:sz w:val="21"/>
+          <w:szCs w:val="21"/>
+          <w14:ligatures w14:val="none"/>
+        </w:rPr>
+        <w:t>*</w:t>
+      </w:r>
+      <w:r>
+        <w:rPr>
+          <w:rFonts w:ascii="Consolas" w:eastAsia="Times New Roman" w:hAnsi="Consolas" w:cs="Times New Roman"/>
+          <w:color w:val="EDEDED"/>
+          <w:kern w:val="0"/>
+          <w:sz w:val="21"/>
+          <w:szCs w:val="21"/>
+          <w14:ligatures w14:val="none"/>
+        </w:rPr>
+        <w:t xml:space="preserve"> info.SampleRate), info.TotalSamples);</w:t>
+      </w:r>
+    </w:p>
+    <w:p>
+      <w:pPr>
+        <w:shd w:val="clear" w:color="auto" w:fill="0A0A0A"/>
+        <w:spacing w:line="285" w:lineRule="atLeast"/>
+        <w:jc w:val="left"/>
+        <w:rPr>
+          <w:rFonts w:ascii="Consolas" w:eastAsia="Times New Roman" w:hAnsi="Consolas" w:cs="Times New Roman"/>
+          <w:color w:val="EDEDED"/>
+          <w:kern w:val="0"/>
+          <w:sz w:val="21"/>
+          <w:szCs w:val="21"/>
+          <w14:ligatures w14:val="none"/>
+        </w:rPr>
+      </w:pPr>
+      <w:r>
+        <w:rPr>
+          <w:rFonts w:ascii="Consolas" w:eastAsia="Times New Roman" w:hAnsi="Consolas" w:cs="Times New Roman"/>
+          <w:color w:val="EDEDED"/>
+          <w:kern w:val="0"/>
+          <w:sz w:val="21"/>
+          <w:szCs w:val="21"/>
+          <w14:ligatures w14:val="none"/>
+        </w:rPr>
+        <w:t xml:space="preserve">[x, Fs_in] </w:t>
+      </w:r>
+      <w:r>
+        <w:rPr>
+          <w:rFonts w:ascii="Consolas" w:eastAsia="Times New Roman" w:hAnsi="Consolas" w:cs="Times New Roman"/>
+          <w:color w:val="F05B8D"/>
+          <w:kern w:val="0"/>
+          <w:sz w:val="21"/>
+          <w:szCs w:val="21"/>
+          <w14:ligatures w14:val="none"/>
+        </w:rPr>
+        <w:t>=</w:t>
+      </w:r>
+      <w:r>
+        <w:rPr>
+          <w:rFonts w:ascii="Consolas" w:eastAsia="Times New Roman" w:hAnsi="Consolas" w:cs="Times New Roman"/>
+          <w:color w:val="EDEDED"/>
+          <w:kern w:val="0"/>
+          <w:sz w:val="21"/>
+          <w:szCs w:val="21"/>
+          <w14:ligatures w14:val="none"/>
+        </w:rPr>
+        <w:t xml:space="preserve"> </w:t>
+      </w:r>
+      <w:r>
+        <w:rPr>
+          <w:rFonts w:ascii="Consolas" w:eastAsia="Times New Roman" w:hAnsi="Consolas" w:cs="Times New Roman"/>
+          <w:color w:val="B675F1"/>
+          <w:kern w:val="0"/>
+          <w:sz w:val="21"/>
+          <w:szCs w:val="21"/>
+          <w14:ligatures w14:val="none"/>
+        </w:rPr>
+        <w:t>audioread</w:t>
+      </w:r>
+      <w:r>
+        <w:rPr>
+          <w:rFonts w:ascii="Consolas" w:eastAsia="Times New Roman" w:hAnsi="Consolas" w:cs="Times New Roman"/>
+          <w:color w:val="EDEDED"/>
+          <w:kern w:val="0"/>
+          <w:sz w:val="21"/>
+          <w:szCs w:val="21"/>
+          <w14:ligatures w14:val="none"/>
+        </w:rPr>
+        <w:t>(filename, [</w:t>
+      </w:r>
+      <w:r>
+        <w:rPr>
+          <w:rFonts w:ascii="Consolas" w:eastAsia="Times New Roman" w:hAnsi="Consolas" w:cs="Times New Roman"/>
+          <w:color w:val="62A6FF"/>
+          <w:kern w:val="0"/>
+          <w:sz w:val="21"/>
+          <w:szCs w:val="21"/>
+          <w14:ligatures w14:val="none"/>
+        </w:rPr>
+        <w:t>1</w:t>
+      </w:r>
+      <w:r>
+        <w:rPr>
+          <w:rFonts w:ascii="Consolas" w:eastAsia="Times New Roman" w:hAnsi="Consolas" w:cs="Times New Roman"/>
+          <w:color w:val="EDEDED"/>
+          <w:kern w:val="0"/>
+          <w:sz w:val="21"/>
+          <w:szCs w:val="21"/>
+          <w14:ligatures w14:val="none"/>
+        </w:rPr>
+        <w:t>, numSamplesIn]);</w:t>
+      </w:r>
+    </w:p>
+    <w:p>
+      <w:pPr>
+        <w:shd w:val="clear" w:color="auto" w:fill="0A0A0A"/>
+        <w:spacing w:line="285" w:lineRule="atLeast"/>
+        <w:jc w:val="left"/>
+        <w:rPr>
+          <w:rFonts w:ascii="Consolas" w:eastAsia="Times New Roman" w:hAnsi="Consolas" w:cs="Times New Roman"/>
+          <w:color w:val="EDEDED"/>
+          <w:kern w:val="0"/>
+          <w:sz w:val="21"/>
+          <w:szCs w:val="21"/>
+          <w14:ligatures w14:val="none"/>
+        </w:rPr>
+      </w:pPr>
+    </w:p>
+    <w:p>
+      <w:pPr>
+        <w:shd w:val="clear" w:color="auto" w:fill="0A0A0A"/>
+        <w:spacing w:line="285" w:lineRule="atLeast"/>
+        <w:jc w:val="left"/>
+        <w:rPr>
+          <w:rFonts w:ascii="Consolas" w:eastAsia="Times New Roman" w:hAnsi="Consolas" w:cs="Times New Roman"/>
+          <w:color w:val="EDEDED"/>
+          <w:kern w:val="0"/>
+          <w:sz w:val="21"/>
+          <w:szCs w:val="21"/>
+          <w14:ligatures w14:val="none"/>
+        </w:rPr>
+      </w:pPr>
+      <w:r>
+        <w:rPr>
+          <w:rFonts w:ascii="Consolas" w:eastAsia="Times New Roman" w:hAnsi="Consolas" w:cs="Times New Roman"/>
+          <w:color w:val="F05B8D"/>
+          <w:kern w:val="0"/>
+          <w:sz w:val="21"/>
+          <w:szCs w:val="21"/>
+          <w14:ligatures w14:val="none"/>
+        </w:rPr>
+        <w:t>if</w:t>
+      </w:r>
+      <w:r>
+        <w:rPr>
+          <w:rFonts w:ascii="Consolas" w:eastAsia="Times New Roman" w:hAnsi="Consolas" w:cs="Times New Roman"/>
+          <w:color w:val="EDEDED"/>
+          <w:kern w:val="0"/>
+          <w:sz w:val="21"/>
+          <w:szCs w:val="21"/>
+          <w14:ligatures w14:val="none"/>
+        </w:rPr>
+        <w:t xml:space="preserve"> </w:t>
+      </w:r>
+      <w:r>
+        <w:rPr>
+          <w:rFonts w:ascii="Consolas" w:eastAsia="Times New Roman" w:hAnsi="Consolas" w:cs="Times New Roman"/>
+          <w:color w:val="B675F1"/>
+          <w:kern w:val="0"/>
+          <w:sz w:val="21"/>
+          <w:szCs w:val="21"/>
+          <w14:ligatures w14:val="none"/>
+        </w:rPr>
+        <w:t>size</w:t>
+      </w:r>
+      <w:r>
+        <w:rPr>
+          <w:rFonts w:ascii="Consolas" w:eastAsia="Times New Roman" w:hAnsi="Consolas" w:cs="Times New Roman"/>
+          <w:color w:val="EDEDED"/>
+          <w:kern w:val="0"/>
+          <w:sz w:val="21"/>
+          <w:szCs w:val="21"/>
+          <w14:ligatures w14:val="none"/>
+        </w:rPr>
+        <w:t xml:space="preserve">(x, </w:t>
+      </w:r>
+      <w:r>
+        <w:rPr>
+          <w:rFonts w:ascii="Consolas" w:eastAsia="Times New Roman" w:hAnsi="Consolas" w:cs="Times New Roman"/>
+          <w:color w:val="62A6FF"/>
+          <w:kern w:val="0"/>
+          <w:sz w:val="21"/>
+          <w:szCs w:val="21"/>
+          <w14:ligatures w14:val="none"/>
+        </w:rPr>
+        <w:t>2</w:t>
+      </w:r>
+      <w:r>
+        <w:rPr>
+          <w:rFonts w:ascii="Consolas" w:eastAsia="Times New Roman" w:hAnsi="Consolas" w:cs="Times New Roman"/>
+          <w:color w:val="EDEDED"/>
+          <w:kern w:val="0"/>
+          <w:sz w:val="21"/>
+          <w:szCs w:val="21"/>
+          <w14:ligatures w14:val="none"/>
+        </w:rPr>
+        <w:t xml:space="preserve">) </w:t>
+      </w:r>
+      <w:r>
+        <w:rPr>
+          <w:rFonts w:ascii="Consolas" w:eastAsia="Times New Roman" w:hAnsi="Consolas" w:cs="Times New Roman"/>
+          <w:color w:val="F05B8D"/>
+          <w:kern w:val="0"/>
+          <w:sz w:val="21"/>
+          <w:szCs w:val="21"/>
+          <w14:ligatures w14:val="none"/>
+        </w:rPr>
+        <w:t>&gt;</w:t>
+      </w:r>
+      <w:r>
+        <w:rPr>
+          <w:rFonts w:ascii="Consolas" w:eastAsia="Times New Roman" w:hAnsi="Consolas" w:cs="Times New Roman"/>
+          <w:color w:val="EDEDED"/>
+          <w:kern w:val="0"/>
+          <w:sz w:val="21"/>
+          <w:szCs w:val="21"/>
+          <w14:ligatures w14:val="none"/>
+        </w:rPr>
+        <w:t xml:space="preserve"> </w:t>
+      </w:r>
+      <w:r>
+        <w:rPr>
+          <w:rFonts w:ascii="Consolas" w:eastAsia="Times New Roman" w:hAnsi="Consolas" w:cs="Times New Roman"/>
+          <w:color w:val="62A6FF"/>
+          <w:kern w:val="0"/>
+          <w:sz w:val="21"/>
+          <w:szCs w:val="21"/>
+          <w14:ligatures w14:val="none"/>
+        </w:rPr>
+        <w:t>1</w:t>
+      </w:r>
+    </w:p>
+    <w:p>
+      <w:pPr>
+        <w:shd w:val="clear" w:color="auto" w:fill="0A0A0A"/>
+        <w:spacing w:line="285" w:lineRule="atLeast"/>
+        <w:jc w:val="left"/>
+        <w:rPr>
+          <w:rFonts w:ascii="Consolas" w:eastAsia="Times New Roman" w:hAnsi="Consolas" w:cs="Times New Roman"/>
+          <w:color w:val="EDEDED"/>
+          <w:kern w:val="0"/>
+          <w:sz w:val="21"/>
+          <w:szCs w:val="21"/>
+          <w14:ligatures w14:val="none"/>
+        </w:rPr>
+      </w:pPr>
+      <w:r>
+        <w:rPr>
+          <w:rFonts w:ascii="Consolas" w:eastAsia="Times New Roman" w:hAnsi="Consolas" w:cs="Times New Roman"/>
+          <w:color w:val="EDEDED"/>
+          <w:kern w:val="0"/>
+          <w:sz w:val="21"/>
+          <w:szCs w:val="21"/>
+          <w14:ligatures w14:val="none"/>
+        </w:rPr>
+        <w:t xml:space="preserve">    x </w:t>
+      </w:r>
+      <w:r>
+        <w:rPr>
+          <w:rFonts w:ascii="Consolas" w:eastAsia="Times New Roman" w:hAnsi="Consolas" w:cs="Times New Roman"/>
+          <w:color w:val="F05B8D"/>
+          <w:kern w:val="0"/>
+          <w:sz w:val="21"/>
+          <w:szCs w:val="21"/>
+          <w14:ligatures w14:val="none"/>
+        </w:rPr>
+        <w:t>=</w:t>
+      </w:r>
+      <w:r>
+        <w:rPr>
+          <w:rFonts w:ascii="Consolas" w:eastAsia="Times New Roman" w:hAnsi="Consolas" w:cs="Times New Roman"/>
+          <w:color w:val="EDEDED"/>
+          <w:kern w:val="0"/>
+          <w:sz w:val="21"/>
+          <w:szCs w:val="21"/>
+          <w14:ligatures w14:val="none"/>
+        </w:rPr>
+        <w:t xml:space="preserve"> </w:t>
+      </w:r>
+      <w:r>
+        <w:rPr>
+          <w:rFonts w:ascii="Consolas" w:eastAsia="Times New Roman" w:hAnsi="Consolas" w:cs="Times New Roman"/>
+          <w:color w:val="B675F1"/>
+          <w:kern w:val="0"/>
+          <w:sz w:val="21"/>
+          <w:szCs w:val="21"/>
+          <w14:ligatures w14:val="none"/>
+        </w:rPr>
+        <w:t>mean</w:t>
+      </w:r>
+      <w:r>
+        <w:rPr>
+          <w:rFonts w:ascii="Consolas" w:eastAsia="Times New Roman" w:hAnsi="Consolas" w:cs="Times New Roman"/>
+          <w:color w:val="EDEDED"/>
+          <w:kern w:val="0"/>
+          <w:sz w:val="21"/>
+          <w:szCs w:val="21"/>
+          <w14:ligatures w14:val="none"/>
+        </w:rPr>
+        <w:t xml:space="preserve">(x, </w:t>
+      </w:r>
+      <w:r>
+        <w:rPr>
+          <w:rFonts w:ascii="Consolas" w:eastAsia="Times New Roman" w:hAnsi="Consolas" w:cs="Times New Roman"/>
+          <w:color w:val="62A6FF"/>
+          <w:kern w:val="0"/>
+          <w:sz w:val="21"/>
+          <w:szCs w:val="21"/>
+          <w14:ligatures w14:val="none"/>
+        </w:rPr>
+        <w:t>2</w:t>
+      </w:r>
+      <w:r>
+        <w:rPr>
+          <w:rFonts w:ascii="Consolas" w:eastAsia="Times New Roman" w:hAnsi="Consolas" w:cs="Times New Roman"/>
+          <w:color w:val="EDEDED"/>
+          <w:kern w:val="0"/>
+          <w:sz w:val="21"/>
+          <w:szCs w:val="21"/>
+          <w14:ligatures w14:val="none"/>
+        </w:rPr>
+        <w:t>);</w:t>
+      </w:r>
+    </w:p>
+    <w:p>
+      <w:pPr>
+        <w:shd w:val="clear" w:color="auto" w:fill="0A0A0A"/>
+        <w:spacing w:line="285" w:lineRule="atLeast"/>
+        <w:jc w:val="left"/>
+        <w:rPr>
+          <w:rFonts w:ascii="Consolas" w:eastAsia="Times New Roman" w:hAnsi="Consolas" w:cs="Times New Roman"/>
+          <w:color w:val="EDEDED"/>
+          <w:kern w:val="0"/>
+          <w:sz w:val="21"/>
+          <w:szCs w:val="21"/>
+          <w14:ligatures w14:val="none"/>
+        </w:rPr>
+      </w:pPr>
+      <w:r>
+        <w:rPr>
+          <w:rFonts w:ascii="Consolas" w:eastAsia="Times New Roman" w:hAnsi="Consolas" w:cs="Times New Roman"/>
+          <w:color w:val="F05B8D"/>
+          <w:kern w:val="0"/>
+          <w:sz w:val="21"/>
+          <w:szCs w:val="21"/>
+          <w14:ligatures w14:val="none"/>
+        </w:rPr>
+        <w:t>end</w:t>
+      </w:r>
+    </w:p>
+    <w:p>
+      <w:pPr>
+        <w:shd w:val="clear" w:color="auto" w:fill="0A0A0A"/>
+        <w:spacing w:line="285" w:lineRule="atLeast"/>
+        <w:jc w:val="left"/>
+        <w:rPr>
+          <w:rFonts w:ascii="Consolas" w:eastAsia="Times New Roman" w:hAnsi="Consolas" w:cs="Times New Roman"/>
+          <w:color w:val="EDEDED"/>
+          <w:kern w:val="0"/>
+          <w:sz w:val="21"/>
+          <w:szCs w:val="21"/>
+          <w14:ligatures w14:val="none"/>
+        </w:rPr>
+      </w:pPr>
+    </w:p>
+    <w:p>
+      <w:pPr>
+        <w:shd w:val="clear" w:color="auto" w:fill="0A0A0A"/>
+        <w:spacing w:line="285" w:lineRule="atLeast"/>
+        <w:jc w:val="left"/>
+        <w:rPr>
+          <w:rFonts w:ascii="Consolas" w:eastAsia="Times New Roman" w:hAnsi="Consolas" w:cs="Times New Roman"/>
+          <w:color w:val="EDEDED"/>
+          <w:kern w:val="0"/>
+          <w:sz w:val="21"/>
+          <w:szCs w:val="21"/>
+          <w14:ligatures w14:val="none"/>
+        </w:rPr>
+      </w:pPr>
+      <w:r>
+        <w:rPr>
+          <w:rFonts w:ascii="Consolas" w:eastAsia="Times New Roman" w:hAnsi="Consolas" w:cs="Times New Roman"/>
+          <w:color w:val="EDEDED"/>
+          <w:kern w:val="0"/>
+          <w:sz w:val="21"/>
+          <w:szCs w:val="21"/>
+          <w14:ligatures w14:val="none"/>
+        </w:rPr>
+        <w:t xml:space="preserve">N_target </w:t>
+      </w:r>
+      <w:r>
+        <w:rPr>
+          <w:rFonts w:ascii="Consolas" w:eastAsia="Times New Roman" w:hAnsi="Consolas" w:cs="Times New Roman"/>
+          <w:color w:val="F05B8D"/>
+          <w:kern w:val="0"/>
+          <w:sz w:val="21"/>
+          <w:szCs w:val="21"/>
+          <w14:ligatures w14:val="none"/>
+        </w:rPr>
+        <w:t>=</w:t>
+      </w:r>
+      <w:r>
+        <w:rPr>
+          <w:rFonts w:ascii="Consolas" w:eastAsia="Times New Roman" w:hAnsi="Consolas" w:cs="Times New Roman"/>
+          <w:color w:val="EDEDED"/>
+          <w:kern w:val="0"/>
+          <w:sz w:val="21"/>
+          <w:szCs w:val="21"/>
+          <w14:ligatures w14:val="none"/>
+        </w:rPr>
+        <w:t xml:space="preserve"> </w:t>
+      </w:r>
+      <w:r>
+        <w:rPr>
+          <w:rFonts w:ascii="Consolas" w:eastAsia="Times New Roman" w:hAnsi="Consolas" w:cs="Times New Roman"/>
+          <w:color w:val="B675F1"/>
+          <w:kern w:val="0"/>
+          <w:sz w:val="21"/>
+          <w:szCs w:val="21"/>
+          <w14:ligatures w14:val="none"/>
+        </w:rPr>
+        <w:t>round</w:t>
+      </w:r>
+      <w:r>
+        <w:rPr>
+          <w:rFonts w:ascii="Consolas" w:eastAsia="Times New Roman" w:hAnsi="Consolas" w:cs="Times New Roman"/>
+          <w:color w:val="EDEDED"/>
+          <w:kern w:val="0"/>
+          <w:sz w:val="21"/>
+          <w:szCs w:val="21"/>
+          <w14:ligatures w14:val="none"/>
+        </w:rPr>
+        <w:t xml:space="preserve">(duration_sec </w:t>
+      </w:r>
+      <w:r>
+        <w:rPr>
+          <w:rFonts w:ascii="Consolas" w:eastAsia="Times New Roman" w:hAnsi="Consolas" w:cs="Times New Roman"/>
+          <w:color w:val="F05B8D"/>
+          <w:kern w:val="0"/>
+          <w:sz w:val="21"/>
+          <w:szCs w:val="21"/>
+          <w14:ligatures w14:val="none"/>
+        </w:rPr>
+        <w:t>*</w:t>
+      </w:r>
+      <w:r>
+        <w:rPr>
+          <w:rFonts w:ascii="Consolas" w:eastAsia="Times New Roman" w:hAnsi="Consolas" w:cs="Times New Roman"/>
+          <w:color w:val="EDEDED"/>
+          <w:kern w:val="0"/>
+          <w:sz w:val="21"/>
+          <w:szCs w:val="21"/>
+          <w14:ligatures w14:val="none"/>
+        </w:rPr>
+        <w:t xml:space="preserve"> Fs_target);</w:t>
+      </w:r>
+    </w:p>
+    <w:p>
+      <w:pPr>
+        <w:shd w:val="clear" w:color="auto" w:fill="0A0A0A"/>
+        <w:spacing w:line="285" w:lineRule="atLeast"/>
+        <w:jc w:val="left"/>
+        <w:rPr>
+          <w:rFonts w:ascii="Consolas" w:eastAsia="Times New Roman" w:hAnsi="Consolas" w:cs="Times New Roman"/>
+          <w:color w:val="EDEDED"/>
+          <w:kern w:val="0"/>
+          <w:sz w:val="21"/>
+          <w:szCs w:val="21"/>
+          <w14:ligatures w14:val="none"/>
+        </w:rPr>
+      </w:pPr>
+      <w:r>
+        <w:rPr>
+          <w:rFonts w:ascii="Consolas" w:eastAsia="Times New Roman" w:hAnsi="Consolas" w:cs="Times New Roman"/>
+          <w:color w:val="EDEDED"/>
+          <w:kern w:val="0"/>
+          <w:sz w:val="21"/>
+          <w:szCs w:val="21"/>
+          <w14:ligatures w14:val="none"/>
+        </w:rPr>
+        <w:t xml:space="preserve">t_in </w:t>
+      </w:r>
+      <w:r>
+        <w:rPr>
+          <w:rFonts w:ascii="Consolas" w:eastAsia="Times New Roman" w:hAnsi="Consolas" w:cs="Times New Roman"/>
+          <w:color w:val="F05B8D"/>
+          <w:kern w:val="0"/>
+          <w:sz w:val="21"/>
+          <w:szCs w:val="21"/>
+          <w14:ligatures w14:val="none"/>
+        </w:rPr>
+        <w:t>=</w:t>
+      </w:r>
+      <w:r>
+        <w:rPr>
+          <w:rFonts w:ascii="Consolas" w:eastAsia="Times New Roman" w:hAnsi="Consolas" w:cs="Times New Roman"/>
+          <w:color w:val="EDEDED"/>
+          <w:kern w:val="0"/>
+          <w:sz w:val="21"/>
+          <w:szCs w:val="21"/>
+          <w14:ligatures w14:val="none"/>
+        </w:rPr>
+        <w:t xml:space="preserve"> (</w:t>
+      </w:r>
+      <w:r>
+        <w:rPr>
+          <w:rFonts w:ascii="Consolas" w:eastAsia="Times New Roman" w:hAnsi="Consolas" w:cs="Times New Roman"/>
+          <w:color w:val="62A6FF"/>
+          <w:kern w:val="0"/>
+          <w:sz w:val="21"/>
+          <w:szCs w:val="21"/>
+          <w14:ligatures w14:val="none"/>
+        </w:rPr>
+        <w:t>0</w:t>
+      </w:r>
+      <w:r>
+        <w:rPr>
+          <w:rFonts w:ascii="Consolas" w:eastAsia="Times New Roman" w:hAnsi="Consolas" w:cs="Times New Roman"/>
+          <w:color w:val="F05B8D"/>
+          <w:kern w:val="0"/>
+          <w:sz w:val="21"/>
+          <w:szCs w:val="21"/>
+          <w14:ligatures w14:val="none"/>
+        </w:rPr>
+        <w:t>:</w:t>
+      </w:r>
+      <w:r>
+        <w:rPr>
+          <w:rFonts w:ascii="Consolas" w:eastAsia="Times New Roman" w:hAnsi="Consolas" w:cs="Times New Roman"/>
+          <w:color w:val="B675F1"/>
+          <w:kern w:val="0"/>
+          <w:sz w:val="21"/>
+          <w:szCs w:val="21"/>
+          <w14:ligatures w14:val="none"/>
+        </w:rPr>
+        <w:t>length</w:t>
+      </w:r>
+      <w:r>
+        <w:rPr>
+          <w:rFonts w:ascii="Consolas" w:eastAsia="Times New Roman" w:hAnsi="Consolas" w:cs="Times New Roman"/>
+          <w:color w:val="EDEDED"/>
+          <w:kern w:val="0"/>
+          <w:sz w:val="21"/>
+          <w:szCs w:val="21"/>
+          <w14:ligatures w14:val="none"/>
+        </w:rPr>
+        <w:t>(x)-</w:t>
+      </w:r>
+      <w:r>
+        <w:rPr>
+          <w:rFonts w:ascii="Consolas" w:eastAsia="Times New Roman" w:hAnsi="Consolas" w:cs="Times New Roman"/>
+          <w:color w:val="62A6FF"/>
+          <w:kern w:val="0"/>
+          <w:sz w:val="21"/>
+          <w:szCs w:val="21"/>
+          <w14:ligatures w14:val="none"/>
+        </w:rPr>
+        <w:t>1</w:t>
+      </w:r>
+      <w:r>
+        <w:rPr>
+          <w:rFonts w:ascii="Consolas" w:eastAsia="Times New Roman" w:hAnsi="Consolas" w:cs="Times New Roman"/>
+          <w:color w:val="EDEDED"/>
+          <w:kern w:val="0"/>
+          <w:sz w:val="21"/>
+          <w:szCs w:val="21"/>
+          <w14:ligatures w14:val="none"/>
+        </w:rPr>
+        <w:t>)</w:t>
+      </w:r>
+      <w:r>
+        <w:rPr>
+          <w:rFonts w:ascii="Consolas" w:eastAsia="Times New Roman" w:hAnsi="Consolas" w:cs="Times New Roman"/>
+          <w:color w:val="F05B8D"/>
+          <w:kern w:val="0"/>
+          <w:sz w:val="21"/>
+          <w:szCs w:val="21"/>
+          <w14:ligatures w14:val="none"/>
+        </w:rPr>
+        <w:t>'</w:t>
+      </w:r>
+      <w:r>
+        <w:rPr>
+          <w:rFonts w:ascii="Consolas" w:eastAsia="Times New Roman" w:hAnsi="Consolas" w:cs="Times New Roman"/>
+          <w:color w:val="EDEDED"/>
+          <w:kern w:val="0"/>
+          <w:sz w:val="21"/>
+          <w:szCs w:val="21"/>
+          <w14:ligatures w14:val="none"/>
+        </w:rPr>
+        <w:t xml:space="preserve"> </w:t>
+      </w:r>
+      <w:r>
+        <w:rPr>
+          <w:rFonts w:ascii="Consolas" w:eastAsia="Times New Roman" w:hAnsi="Consolas" w:cs="Times New Roman"/>
+          <w:color w:val="F05B8D"/>
+          <w:kern w:val="0"/>
+          <w:sz w:val="21"/>
+          <w:szCs w:val="21"/>
+          <w14:ligatures w14:val="none"/>
+        </w:rPr>
+        <w:t>/</w:t>
+      </w:r>
+      <w:r>
+        <w:rPr>
+          <w:rFonts w:ascii="Consolas" w:eastAsia="Times New Roman" w:hAnsi="Consolas" w:cs="Times New Roman"/>
+          <w:color w:val="EDEDED"/>
+          <w:kern w:val="0"/>
+          <w:sz w:val="21"/>
+          <w:szCs w:val="21"/>
+          <w14:ligatures w14:val="none"/>
+        </w:rPr>
+        <w:t xml:space="preserve"> Fs_in;</w:t>
+      </w:r>
+    </w:p>
+    <w:p>
+      <w:pPr>
+        <w:shd w:val="clear" w:color="auto" w:fill="0A0A0A"/>
+        <w:spacing w:line="285" w:lineRule="atLeast"/>
+        <w:jc w:val="left"/>
+        <w:rPr>
+          <w:rFonts w:ascii="Consolas" w:eastAsia="Times New Roman" w:hAnsi="Consolas" w:cs="Times New Roman"/>
+          <w:color w:val="EDEDED"/>
+          <w:kern w:val="0"/>
+          <w:sz w:val="21"/>
+          <w:szCs w:val="21"/>
+          <w14:ligatures w14:val="none"/>
+        </w:rPr>
+      </w:pPr>
+      <w:r>
+        <w:rPr>
+          <w:rFonts w:ascii="Consolas" w:eastAsia="Times New Roman" w:hAnsi="Consolas" w:cs="Times New Roman"/>
+          <w:color w:val="EDEDED"/>
+          <w:kern w:val="0"/>
+          <w:sz w:val="21"/>
+          <w:szCs w:val="21"/>
+          <w14:ligatures w14:val="none"/>
+        </w:rPr>
+        <w:t xml:space="preserve">t_out </w:t>
+      </w:r>
+      <w:r>
+        <w:rPr>
+          <w:rFonts w:ascii="Consolas" w:eastAsia="Times New Roman" w:hAnsi="Consolas" w:cs="Times New Roman"/>
+          <w:color w:val="F05B8D"/>
+          <w:kern w:val="0"/>
+          <w:sz w:val="21"/>
+          <w:szCs w:val="21"/>
+          <w14:ligatures w14:val="none"/>
+        </w:rPr>
+        <w:t>=</w:t>
+      </w:r>
+      <w:r>
+        <w:rPr>
+          <w:rFonts w:ascii="Consolas" w:eastAsia="Times New Roman" w:hAnsi="Consolas" w:cs="Times New Roman"/>
+          <w:color w:val="EDEDED"/>
+          <w:kern w:val="0"/>
+          <w:sz w:val="21"/>
+          <w:szCs w:val="21"/>
+          <w14:ligatures w14:val="none"/>
+        </w:rPr>
+        <w:t xml:space="preserve"> (</w:t>
+      </w:r>
+      <w:r>
+        <w:rPr>
+          <w:rFonts w:ascii="Consolas" w:eastAsia="Times New Roman" w:hAnsi="Consolas" w:cs="Times New Roman"/>
+          <w:color w:val="62A6FF"/>
+          <w:kern w:val="0"/>
+          <w:sz w:val="21"/>
+          <w:szCs w:val="21"/>
+          <w14:ligatures w14:val="none"/>
+        </w:rPr>
+        <w:t>0</w:t>
+      </w:r>
+      <w:r>
+        <w:rPr>
+          <w:rFonts w:ascii="Consolas" w:eastAsia="Times New Roman" w:hAnsi="Consolas" w:cs="Times New Roman"/>
+          <w:color w:val="F05B8D"/>
+          <w:kern w:val="0"/>
+          <w:sz w:val="21"/>
+          <w:szCs w:val="21"/>
+          <w14:ligatures w14:val="none"/>
+        </w:rPr>
+        <w:t>:</w:t>
+      </w:r>
+      <w:r>
+        <w:rPr>
+          <w:rFonts w:ascii="Consolas" w:eastAsia="Times New Roman" w:hAnsi="Consolas" w:cs="Times New Roman"/>
+          <w:color w:val="EDEDED"/>
+          <w:kern w:val="0"/>
+          <w:sz w:val="21"/>
+          <w:szCs w:val="21"/>
+          <w14:ligatures w14:val="none"/>
+        </w:rPr>
+        <w:t>N_target</w:t>
+      </w:r>
+      <w:r>
+        <w:rPr>
+          <w:rFonts w:ascii="Consolas" w:eastAsia="Times New Roman" w:hAnsi="Consolas" w:cs="Times New Roman"/>
+          <w:color w:val="F05B8D"/>
+          <w:kern w:val="0"/>
+          <w:sz w:val="21"/>
+          <w:szCs w:val="21"/>
+          <w14:ligatures w14:val="none"/>
+        </w:rPr>
+        <w:t>-</w:t>
+      </w:r>
+      <w:r>
+        <w:rPr>
+          <w:rFonts w:ascii="Consolas" w:eastAsia="Times New Roman" w:hAnsi="Consolas" w:cs="Times New Roman"/>
+          <w:color w:val="62A6FF"/>
+          <w:kern w:val="0"/>
+          <w:sz w:val="21"/>
+          <w:szCs w:val="21"/>
+          <w14:ligatures w14:val="none"/>
+        </w:rPr>
+        <w:t>1</w:t>
+      </w:r>
+      <w:r>
+        <w:rPr>
+          <w:rFonts w:ascii="Consolas" w:eastAsia="Times New Roman" w:hAnsi="Consolas" w:cs="Times New Roman"/>
+          <w:color w:val="EDEDED"/>
+          <w:kern w:val="0"/>
+          <w:sz w:val="21"/>
+          <w:szCs w:val="21"/>
+          <w14:ligatures w14:val="none"/>
+        </w:rPr>
+        <w:t>)</w:t>
+      </w:r>
+      <w:r>
+        <w:rPr>
+          <w:rFonts w:ascii="Consolas" w:eastAsia="Times New Roman" w:hAnsi="Consolas" w:cs="Times New Roman"/>
+          <w:color w:val="F05B8D"/>
+          <w:kern w:val="0"/>
+          <w:sz w:val="21"/>
+          <w:szCs w:val="21"/>
+          <w14:ligatures w14:val="none"/>
+        </w:rPr>
+        <w:t>'</w:t>
+      </w:r>
+      <w:r>
+        <w:rPr>
+          <w:rFonts w:ascii="Consolas" w:eastAsia="Times New Roman" w:hAnsi="Consolas" w:cs="Times New Roman"/>
+          <w:color w:val="EDEDED"/>
+          <w:kern w:val="0"/>
+          <w:sz w:val="21"/>
+          <w:szCs w:val="21"/>
+          <w14:ligatures w14:val="none"/>
+        </w:rPr>
+        <w:t xml:space="preserve"> </w:t>
+      </w:r>
+      <w:r>
+        <w:rPr>
+          <w:rFonts w:ascii="Consolas" w:eastAsia="Times New Roman" w:hAnsi="Consolas" w:cs="Times New Roman"/>
+          <w:color w:val="F05B8D"/>
+          <w:kern w:val="0"/>
+          <w:sz w:val="21"/>
+          <w:szCs w:val="21"/>
+          <w14:ligatures w14:val="none"/>
+        </w:rPr>
+        <w:t>/</w:t>
+      </w:r>
+      <w:r>
+        <w:rPr>
+          <w:rFonts w:ascii="Consolas" w:eastAsia="Times New Roman" w:hAnsi="Consolas" w:cs="Times New Roman"/>
+          <w:color w:val="EDEDED"/>
+          <w:kern w:val="0"/>
+          <w:sz w:val="21"/>
+          <w:szCs w:val="21"/>
+          <w14:ligatures w14:val="none"/>
+        </w:rPr>
+        <w:t xml:space="preserve"> Fs_target;</w:t>
+      </w:r>
+    </w:p>
+    <w:p>
+      <w:pPr>
+        <w:shd w:val="clear" w:color="auto" w:fill="0A0A0A"/>
+        <w:spacing w:line="285" w:lineRule="atLeast"/>
+        <w:jc w:val="left"/>
+        <w:rPr>
+          <w:rFonts w:ascii="Consolas" w:eastAsia="Times New Roman" w:hAnsi="Consolas" w:cs="Times New Roman"/>
+          <w:color w:val="EDEDED"/>
+          <w:kern w:val="0"/>
+          <w:sz w:val="21"/>
+          <w:szCs w:val="21"/>
+          <w14:ligatures w14:val="none"/>
+        </w:rPr>
+      </w:pPr>
+      <w:r>
+        <w:rPr>
+          <w:rFonts w:ascii="Consolas" w:eastAsia="Times New Roman" w:hAnsi="Consolas" w:cs="Times New Roman"/>
+          <w:color w:val="EDEDED"/>
+          <w:kern w:val="0"/>
+          <w:sz w:val="21"/>
+          <w:szCs w:val="21"/>
+          <w14:ligatures w14:val="none"/>
+        </w:rPr>
+        <w:t xml:space="preserve">x </w:t>
+      </w:r>
+      <w:r>
+        <w:rPr>
+          <w:rFonts w:ascii="Consolas" w:eastAsia="Times New Roman" w:hAnsi="Consolas" w:cs="Times New Roman"/>
+          <w:color w:val="F05B8D"/>
+          <w:kern w:val="0"/>
+          <w:sz w:val="21"/>
+          <w:szCs w:val="21"/>
+          <w14:ligatures w14:val="none"/>
+        </w:rPr>
+        <w:t>=</w:t>
+      </w:r>
+      <w:r>
+        <w:rPr>
+          <w:rFonts w:ascii="Consolas" w:eastAsia="Times New Roman" w:hAnsi="Consolas" w:cs="Times New Roman"/>
+          <w:color w:val="EDEDED"/>
+          <w:kern w:val="0"/>
+          <w:sz w:val="21"/>
+          <w:szCs w:val="21"/>
+          <w14:ligatures w14:val="none"/>
+        </w:rPr>
+        <w:t xml:space="preserve"> </w:t>
+      </w:r>
+      <w:r>
+        <w:rPr>
+          <w:rFonts w:ascii="Consolas" w:eastAsia="Times New Roman" w:hAnsi="Consolas" w:cs="Times New Roman"/>
+          <w:color w:val="B675F1"/>
+          <w:kern w:val="0"/>
+          <w:sz w:val="21"/>
+          <w:szCs w:val="21"/>
+          <w14:ligatures w14:val="none"/>
+        </w:rPr>
+        <w:t>interp1</w:t>
+      </w:r>
+      <w:r>
+        <w:rPr>
+          <w:rFonts w:ascii="Consolas" w:eastAsia="Times New Roman" w:hAnsi="Consolas" w:cs="Times New Roman"/>
+          <w:color w:val="EDEDED"/>
+          <w:kern w:val="0"/>
+          <w:sz w:val="21"/>
+          <w:szCs w:val="21"/>
+          <w14:ligatures w14:val="none"/>
+        </w:rPr>
+        <w:t xml:space="preserve">(t_in, x, t_out, </w:t>
+      </w:r>
+      <w:r>
+        <w:rPr>
+          <w:rFonts w:ascii="Consolas" w:eastAsia="Times New Roman" w:hAnsi="Consolas" w:cs="Times New Roman"/>
+          <w:color w:val="58C760"/>
+          <w:kern w:val="0"/>
+          <w:sz w:val="21"/>
+          <w:szCs w:val="21"/>
+          <w14:ligatures w14:val="none"/>
+        </w:rPr>
+        <w:t>'linear'</w:t>
+      </w:r>
+      <w:r>
+        <w:rPr>
+          <w:rFonts w:ascii="Consolas" w:eastAsia="Times New Roman" w:hAnsi="Consolas" w:cs="Times New Roman"/>
+          <w:color w:val="EDEDED"/>
+          <w:kern w:val="0"/>
+          <w:sz w:val="21"/>
+          <w:szCs w:val="21"/>
+          <w14:ligatures w14:val="none"/>
+        </w:rPr>
+        <w:t xml:space="preserve">, </w:t>
+      </w:r>
+      <w:r>
+        <w:rPr>
+          <w:rFonts w:ascii="Consolas" w:eastAsia="Times New Roman" w:hAnsi="Consolas" w:cs="Times New Roman"/>
+          <w:color w:val="62A6FF"/>
+          <w:kern w:val="0"/>
+          <w:sz w:val="21"/>
+          <w:szCs w:val="21"/>
+          <w14:ligatures w14:val="none"/>
+        </w:rPr>
+        <w:t>0</w:t>
+      </w:r>
+      <w:r>
+        <w:rPr>
+          <w:rFonts w:ascii="Consolas" w:eastAsia="Times New Roman" w:hAnsi="Consolas" w:cs="Times New Roman"/>
+          <w:color w:val="EDEDED"/>
+          <w:kern w:val="0"/>
+          <w:sz w:val="21"/>
+          <w:szCs w:val="21"/>
+          <w14:ligatures w14:val="none"/>
+        </w:rPr>
+        <w:t>);</w:t>
+      </w:r>
+    </w:p>
+    <w:p>
+      <w:pPr>
+        <w:shd w:val="clear" w:color="auto" w:fill="0A0A0A"/>
+        <w:spacing w:line="285" w:lineRule="atLeast"/>
+        <w:jc w:val="left"/>
+        <w:rPr>
+          <w:rFonts w:ascii="Consolas" w:eastAsia="Times New Roman" w:hAnsi="Consolas" w:cs="Times New Roman"/>
+          <w:color w:val="EDEDED"/>
+          <w:kern w:val="0"/>
+          <w:sz w:val="21"/>
+          <w:szCs w:val="21"/>
+          <w14:ligatures w14:val="none"/>
+        </w:rPr>
+      </w:pPr>
+    </w:p>
+    <w:p>
+      <w:pPr>
+        <w:shd w:val="clear" w:color="auto" w:fill="0A0A0A"/>
+        <w:spacing w:line="285" w:lineRule="atLeast"/>
+        <w:jc w:val="left"/>
+        <w:rPr>
+          <w:rFonts w:ascii="Consolas" w:eastAsia="Times New Roman" w:hAnsi="Consolas" w:cs="Times New Roman"/>
+          <w:color w:val="EDEDED"/>
+          <w:kern w:val="0"/>
+          <w:sz w:val="21"/>
+          <w:szCs w:val="21"/>
+          <w:lang w:val="vi-VN"/>
+          <w14:ligatures w14:val="none"/>
+        </w:rPr>
+      </w:pPr>
+      <w:r>
+        <w:rPr>
+          <w:rFonts w:ascii="Consolas" w:eastAsia="Times New Roman" w:hAnsi="Consolas" w:cs="Times New Roman"/>
+          <w:color w:val="EDEDED"/>
+          <w:kern w:val="0"/>
+          <w:sz w:val="21"/>
+          <w:szCs w:val="21"/>
+          <w14:ligatures w14:val="none"/>
+        </w:rPr>
+        <w:t xml:space="preserve">N </w:t>
+      </w:r>
+      <w:r>
+        <w:rPr>
+          <w:rFonts w:ascii="Consolas" w:eastAsia="Times New Roman" w:hAnsi="Consolas" w:cs="Times New Roman"/>
+          <w:color w:val="F05B8D"/>
+          <w:kern w:val="0"/>
+          <w:sz w:val="21"/>
+          <w:szCs w:val="21"/>
+          <w14:ligatures w14:val="none"/>
+        </w:rPr>
+        <w:t>=</w:t>
+      </w:r>
+      <w:r>
+        <w:rPr>
+          <w:rFonts w:ascii="Consolas" w:eastAsia="Times New Roman" w:hAnsi="Consolas" w:cs="Times New Roman"/>
+          <w:color w:val="EDEDED"/>
+          <w:kern w:val="0"/>
+          <w:sz w:val="21"/>
+          <w:szCs w:val="21"/>
+          <w14:ligatures w14:val="none"/>
+        </w:rPr>
+        <w:t xml:space="preserve"> </w:t>
+      </w:r>
+      <w:r>
+        <w:rPr>
+          <w:rFonts w:ascii="Consolas" w:eastAsia="Times New Roman" w:hAnsi="Consolas" w:cs="Times New Roman"/>
+          <w:color w:val="62A6FF"/>
+          <w:kern w:val="0"/>
+          <w:sz w:val="21"/>
+          <w:szCs w:val="21"/>
+          <w14:ligatures w14:val="none"/>
+        </w:rPr>
+        <w:t>200</w:t>
+      </w:r>
+      <w:r>
+        <w:rPr>
+          <w:rFonts w:ascii="Consolas" w:eastAsia="Times New Roman" w:hAnsi="Consolas" w:cs="Times New Roman"/>
+          <w:color w:val="EDEDED"/>
+          <w:kern w:val="0"/>
+          <w:sz w:val="21"/>
+          <w:szCs w:val="21"/>
+          <w14:ligatures w14:val="none"/>
+        </w:rPr>
+        <w:t>;</w:t>
+      </w:r>
+    </w:p>
+    <w:p>
+      <w:pPr>
+        <w:shd w:val="clear" w:color="auto" w:fill="0A0A0A"/>
+        <w:spacing w:line="285" w:lineRule="atLeast"/>
+        <w:jc w:val="left"/>
+        <w:rPr>
+          <w:rFonts w:ascii="Consolas" w:eastAsia="Times New Roman" w:hAnsi="Consolas" w:cs="Times New Roman"/>
+          <w:color w:val="EDEDED"/>
+          <w:kern w:val="0"/>
+          <w:sz w:val="21"/>
+          <w:szCs w:val="21"/>
+          <w14:ligatures w14:val="none"/>
+        </w:rPr>
+      </w:pPr>
+      <w:r>
+        <w:rPr>
+          <w:rFonts w:ascii="Consolas" w:eastAsia="Times New Roman" w:hAnsi="Consolas" w:cs="Times New Roman"/>
+          <w:color w:val="EDEDED"/>
+          <w:kern w:val="0"/>
+          <w:sz w:val="21"/>
+          <w:szCs w:val="21"/>
+          <w14:ligatures w14:val="none"/>
+        </w:rPr>
+        <w:t xml:space="preserve">Wn </w:t>
+      </w:r>
+      <w:r>
+        <w:rPr>
+          <w:rFonts w:ascii="Consolas" w:eastAsia="Times New Roman" w:hAnsi="Consolas" w:cs="Times New Roman"/>
+          <w:color w:val="F05B8D"/>
+          <w:kern w:val="0"/>
+          <w:sz w:val="21"/>
+          <w:szCs w:val="21"/>
+          <w14:ligatures w14:val="none"/>
+        </w:rPr>
+        <w:t>=</w:t>
+      </w:r>
+      <w:r>
+        <w:rPr>
+          <w:rFonts w:ascii="Consolas" w:eastAsia="Times New Roman" w:hAnsi="Consolas" w:cs="Times New Roman"/>
+          <w:color w:val="EDEDED"/>
+          <w:kern w:val="0"/>
+          <w:sz w:val="21"/>
+          <w:szCs w:val="21"/>
+          <w14:ligatures w14:val="none"/>
+        </w:rPr>
+        <w:t xml:space="preserve"> [f1, f2] </w:t>
+      </w:r>
+      <w:r>
+        <w:rPr>
+          <w:rFonts w:ascii="Consolas" w:eastAsia="Times New Roman" w:hAnsi="Consolas" w:cs="Times New Roman"/>
+          <w:color w:val="F05B8D"/>
+          <w:kern w:val="0"/>
+          <w:sz w:val="21"/>
+          <w:szCs w:val="21"/>
+          <w14:ligatures w14:val="none"/>
+        </w:rPr>
+        <w:t>/</w:t>
+      </w:r>
+      <w:r>
+        <w:rPr>
+          <w:rFonts w:ascii="Consolas" w:eastAsia="Times New Roman" w:hAnsi="Consolas" w:cs="Times New Roman"/>
+          <w:color w:val="EDEDED"/>
+          <w:kern w:val="0"/>
+          <w:sz w:val="21"/>
+          <w:szCs w:val="21"/>
+          <w14:ligatures w14:val="none"/>
+        </w:rPr>
+        <w:t xml:space="preserve"> (Fs_target </w:t>
+      </w:r>
+      <w:r>
+        <w:rPr>
+          <w:rFonts w:ascii="Consolas" w:eastAsia="Times New Roman" w:hAnsi="Consolas" w:cs="Times New Roman"/>
+          <w:color w:val="F05B8D"/>
+          <w:kern w:val="0"/>
+          <w:sz w:val="21"/>
+          <w:szCs w:val="21"/>
+          <w14:ligatures w14:val="none"/>
+        </w:rPr>
+        <w:t>/</w:t>
+      </w:r>
+      <w:r>
+        <w:rPr>
+          <w:rFonts w:ascii="Consolas" w:eastAsia="Times New Roman" w:hAnsi="Consolas" w:cs="Times New Roman"/>
+          <w:color w:val="EDEDED"/>
+          <w:kern w:val="0"/>
+          <w:sz w:val="21"/>
+          <w:szCs w:val="21"/>
+          <w14:ligatures w14:val="none"/>
+        </w:rPr>
+        <w:t xml:space="preserve"> </w:t>
+      </w:r>
+      <w:r>
+        <w:rPr>
+          <w:rFonts w:ascii="Consolas" w:eastAsia="Times New Roman" w:hAnsi="Consolas" w:cs="Times New Roman"/>
+          <w:color w:val="62A6FF"/>
+          <w:kern w:val="0"/>
+          <w:sz w:val="21"/>
+          <w:szCs w:val="21"/>
+          <w14:ligatures w14:val="none"/>
+        </w:rPr>
+        <w:t>2</w:t>
+      </w:r>
+      <w:r>
+        <w:rPr>
+          <w:rFonts w:ascii="Consolas" w:eastAsia="Times New Roman" w:hAnsi="Consolas" w:cs="Times New Roman"/>
+          <w:color w:val="EDEDED"/>
+          <w:kern w:val="0"/>
+          <w:sz w:val="21"/>
+          <w:szCs w:val="21"/>
+          <w14:ligatures w14:val="none"/>
+        </w:rPr>
+        <w:t>);</w:t>
+      </w:r>
+    </w:p>
+    <w:p>
+      <w:pPr>
+        <w:shd w:val="clear" w:color="auto" w:fill="0A0A0A"/>
+        <w:spacing w:line="285" w:lineRule="atLeast"/>
+        <w:jc w:val="left"/>
+        <w:rPr>
+          <w:rFonts w:ascii="Consolas" w:eastAsia="Times New Roman" w:hAnsi="Consolas" w:cs="Times New Roman"/>
+          <w:color w:val="EDEDED"/>
+          <w:kern w:val="0"/>
+          <w:sz w:val="21"/>
+          <w:szCs w:val="21"/>
+          <w14:ligatures w14:val="none"/>
+        </w:rPr>
+      </w:pPr>
+      <w:r>
+        <w:rPr>
+          <w:rFonts w:ascii="Consolas" w:eastAsia="Times New Roman" w:hAnsi="Consolas" w:cs="Times New Roman"/>
+          <w:color w:val="EDEDED"/>
+          <w:kern w:val="0"/>
+          <w:sz w:val="21"/>
+          <w:szCs w:val="21"/>
+          <w14:ligatures w14:val="none"/>
+        </w:rPr>
+        <w:t xml:space="preserve">b </w:t>
+      </w:r>
+      <w:r>
+        <w:rPr>
+          <w:rFonts w:ascii="Consolas" w:eastAsia="Times New Roman" w:hAnsi="Consolas" w:cs="Times New Roman"/>
+          <w:color w:val="F05B8D"/>
+          <w:kern w:val="0"/>
+          <w:sz w:val="21"/>
+          <w:szCs w:val="21"/>
+          <w14:ligatures w14:val="none"/>
+        </w:rPr>
+        <w:t>=</w:t>
+      </w:r>
+      <w:r>
+        <w:rPr>
+          <w:rFonts w:ascii="Consolas" w:eastAsia="Times New Roman" w:hAnsi="Consolas" w:cs="Times New Roman"/>
+          <w:color w:val="EDEDED"/>
+          <w:kern w:val="0"/>
+          <w:sz w:val="21"/>
+          <w:szCs w:val="21"/>
+          <w14:ligatures w14:val="none"/>
+        </w:rPr>
+        <w:t xml:space="preserve"> </w:t>
+      </w:r>
+      <w:r>
+        <w:rPr>
+          <w:rFonts w:ascii="Consolas" w:eastAsia="Times New Roman" w:hAnsi="Consolas" w:cs="Times New Roman"/>
+          <w:color w:val="B675F1"/>
+          <w:kern w:val="0"/>
+          <w:sz w:val="21"/>
+          <w:szCs w:val="21"/>
+          <w14:ligatures w14:val="none"/>
+        </w:rPr>
+        <w:t>fir1</w:t>
+      </w:r>
+      <w:r>
+        <w:rPr>
+          <w:rFonts w:ascii="Consolas" w:eastAsia="Times New Roman" w:hAnsi="Consolas" w:cs="Times New Roman"/>
+          <w:color w:val="EDEDED"/>
+          <w:kern w:val="0"/>
+          <w:sz w:val="21"/>
+          <w:szCs w:val="21"/>
+          <w14:ligatures w14:val="none"/>
+        </w:rPr>
+        <w:t xml:space="preserve">(N, Wn, </w:t>
+      </w:r>
+      <w:r>
+        <w:rPr>
+          <w:rFonts w:ascii="Consolas" w:eastAsia="Times New Roman" w:hAnsi="Consolas" w:cs="Times New Roman"/>
+          <w:color w:val="58C760"/>
+          <w:kern w:val="0"/>
+          <w:sz w:val="21"/>
+          <w:szCs w:val="21"/>
+          <w14:ligatures w14:val="none"/>
+        </w:rPr>
+        <w:t>'bandpass'</w:t>
+      </w:r>
+      <w:r>
+        <w:rPr>
+          <w:rFonts w:ascii="Consolas" w:eastAsia="Times New Roman" w:hAnsi="Consolas" w:cs="Times New Roman"/>
+          <w:color w:val="EDEDED"/>
+          <w:kern w:val="0"/>
+          <w:sz w:val="21"/>
+          <w:szCs w:val="21"/>
+          <w14:ligatures w14:val="none"/>
+        </w:rPr>
+        <w:t>);</w:t>
+      </w:r>
+    </w:p>
+    <w:p>
+      <w:pPr>
+        <w:shd w:val="clear" w:color="auto" w:fill="0A0A0A"/>
+        <w:spacing w:line="285" w:lineRule="atLeast"/>
+        <w:jc w:val="left"/>
+        <w:rPr>
+          <w:rFonts w:ascii="Consolas" w:eastAsia="Times New Roman" w:hAnsi="Consolas" w:cs="Times New Roman"/>
+          <w:color w:val="EDEDED"/>
+          <w:kern w:val="0"/>
+          <w:sz w:val="21"/>
+          <w:szCs w:val="21"/>
+          <w14:ligatures w14:val="none"/>
+        </w:rPr>
+      </w:pPr>
+    </w:p>
+    <w:p>
+      <w:pPr>
+        <w:shd w:val="clear" w:color="auto" w:fill="0A0A0A"/>
+        <w:spacing w:line="285" w:lineRule="atLeast"/>
+        <w:jc w:val="left"/>
+        <w:rPr>
+          <w:rFonts w:ascii="Consolas" w:eastAsia="Times New Roman" w:hAnsi="Consolas" w:cs="Times New Roman"/>
+          <w:color w:val="EDEDED"/>
+          <w:kern w:val="0"/>
+          <w:sz w:val="21"/>
+          <w:szCs w:val="21"/>
+          <w14:ligatures w14:val="none"/>
+        </w:rPr>
+      </w:pPr>
+      <w:r>
+        <w:rPr>
+          <w:rFonts w:ascii="Consolas" w:eastAsia="Times New Roman" w:hAnsi="Consolas" w:cs="Times New Roman"/>
+          <w:color w:val="EDEDED"/>
+          <w:kern w:val="0"/>
+          <w:sz w:val="21"/>
+          <w:szCs w:val="21"/>
+          <w14:ligatures w14:val="none"/>
+        </w:rPr>
+        <w:t xml:space="preserve">y </w:t>
+      </w:r>
+      <w:r>
+        <w:rPr>
+          <w:rFonts w:ascii="Consolas" w:eastAsia="Times New Roman" w:hAnsi="Consolas" w:cs="Times New Roman"/>
+          <w:color w:val="F05B8D"/>
+          <w:kern w:val="0"/>
+          <w:sz w:val="21"/>
+          <w:szCs w:val="21"/>
+          <w14:ligatures w14:val="none"/>
+        </w:rPr>
+        <w:t>=</w:t>
+      </w:r>
+      <w:r>
+        <w:rPr>
+          <w:rFonts w:ascii="Consolas" w:eastAsia="Times New Roman" w:hAnsi="Consolas" w:cs="Times New Roman"/>
+          <w:color w:val="EDEDED"/>
+          <w:kern w:val="0"/>
+          <w:sz w:val="21"/>
+          <w:szCs w:val="21"/>
+          <w14:ligatures w14:val="none"/>
+        </w:rPr>
+        <w:t xml:space="preserve"> </w:t>
+      </w:r>
+      <w:r>
+        <w:rPr>
+          <w:rFonts w:ascii="Consolas" w:eastAsia="Times New Roman" w:hAnsi="Consolas" w:cs="Times New Roman"/>
+          <w:color w:val="B675F1"/>
+          <w:kern w:val="0"/>
+          <w:sz w:val="21"/>
+          <w:szCs w:val="21"/>
+          <w14:ligatures w14:val="none"/>
+        </w:rPr>
+        <w:t>filter</w:t>
+      </w:r>
+      <w:r>
+        <w:rPr>
+          <w:rFonts w:ascii="Consolas" w:eastAsia="Times New Roman" w:hAnsi="Consolas" w:cs="Times New Roman"/>
+          <w:color w:val="EDEDED"/>
+          <w:kern w:val="0"/>
+          <w:sz w:val="21"/>
+          <w:szCs w:val="21"/>
+          <w14:ligatures w14:val="none"/>
+        </w:rPr>
+        <w:t xml:space="preserve">(b, </w:t>
+      </w:r>
+      <w:r>
+        <w:rPr>
+          <w:rFonts w:ascii="Consolas" w:eastAsia="Times New Roman" w:hAnsi="Consolas" w:cs="Times New Roman"/>
+          <w:color w:val="62A6FF"/>
+          <w:kern w:val="0"/>
+          <w:sz w:val="21"/>
+          <w:szCs w:val="21"/>
+          <w14:ligatures w14:val="none"/>
+        </w:rPr>
+        <w:t>1</w:t>
+      </w:r>
+      <w:r>
+        <w:rPr>
+          <w:rFonts w:ascii="Consolas" w:eastAsia="Times New Roman" w:hAnsi="Consolas" w:cs="Times New Roman"/>
+          <w:color w:val="EDEDED"/>
+          <w:kern w:val="0"/>
+          <w:sz w:val="21"/>
+          <w:szCs w:val="21"/>
+          <w14:ligatures w14:val="none"/>
+        </w:rPr>
+        <w:t>, x);</w:t>
+      </w:r>
+    </w:p>
+    <w:p>
+      <w:pPr>
+        <w:shd w:val="clear" w:color="auto" w:fill="0A0A0A"/>
+        <w:spacing w:line="285" w:lineRule="atLeast"/>
+        <w:jc w:val="left"/>
+        <w:rPr>
+          <w:rFonts w:ascii="Consolas" w:eastAsia="Times New Roman" w:hAnsi="Consolas" w:cs="Times New Roman"/>
+          <w:color w:val="EDEDED"/>
+          <w:kern w:val="0"/>
+          <w:sz w:val="21"/>
+          <w:szCs w:val="21"/>
+          <w14:ligatures w14:val="none"/>
+        </w:rPr>
+      </w:pPr>
+    </w:p>
+    <w:p>
+      <w:pPr>
+        <w:shd w:val="clear" w:color="auto" w:fill="0A0A0A"/>
+        <w:spacing w:line="285" w:lineRule="atLeast"/>
+        <w:jc w:val="left"/>
+        <w:rPr>
+          <w:rFonts w:ascii="Consolas" w:eastAsia="Times New Roman" w:hAnsi="Consolas" w:cs="Times New Roman"/>
+          <w:color w:val="EDEDED"/>
+          <w:kern w:val="0"/>
+          <w:sz w:val="21"/>
+          <w:szCs w:val="21"/>
+          <w14:ligatures w14:val="none"/>
+        </w:rPr>
+      </w:pPr>
+      <w:r>
+        <w:rPr>
+          <w:rFonts w:ascii="Consolas" w:eastAsia="Times New Roman" w:hAnsi="Consolas" w:cs="Times New Roman"/>
+          <w:color w:val="EDEDED"/>
+          <w:kern w:val="0"/>
+          <w:sz w:val="21"/>
+          <w:szCs w:val="21"/>
+          <w14:ligatures w14:val="none"/>
+        </w:rPr>
+        <w:t xml:space="preserve">y_short </w:t>
+      </w:r>
+      <w:r>
+        <w:rPr>
+          <w:rFonts w:ascii="Consolas" w:eastAsia="Times New Roman" w:hAnsi="Consolas" w:cs="Times New Roman"/>
+          <w:color w:val="F05B8D"/>
+          <w:kern w:val="0"/>
+          <w:sz w:val="21"/>
+          <w:szCs w:val="21"/>
+          <w14:ligatures w14:val="none"/>
+        </w:rPr>
+        <w:t>=</w:t>
+      </w:r>
+      <w:r>
+        <w:rPr>
+          <w:rFonts w:ascii="Consolas" w:eastAsia="Times New Roman" w:hAnsi="Consolas" w:cs="Times New Roman"/>
+          <w:color w:val="EDEDED"/>
+          <w:kern w:val="0"/>
+          <w:sz w:val="21"/>
+          <w:szCs w:val="21"/>
+          <w14:ligatures w14:val="none"/>
+        </w:rPr>
+        <w:t xml:space="preserve"> </w:t>
+      </w:r>
+      <w:r>
+        <w:rPr>
+          <w:rFonts w:ascii="Consolas" w:eastAsia="Times New Roman" w:hAnsi="Consolas" w:cs="Times New Roman"/>
+          <w:color w:val="B675F1"/>
+          <w:kern w:val="0"/>
+          <w:sz w:val="21"/>
+          <w:szCs w:val="21"/>
+          <w14:ligatures w14:val="none"/>
+        </w:rPr>
+        <w:t>int16</w:t>
+      </w:r>
+      <w:r>
+        <w:rPr>
+          <w:rFonts w:ascii="Consolas" w:eastAsia="Times New Roman" w:hAnsi="Consolas" w:cs="Times New Roman"/>
+          <w:color w:val="EDEDED"/>
+          <w:kern w:val="0"/>
+          <w:sz w:val="21"/>
+          <w:szCs w:val="21"/>
+          <w14:ligatures w14:val="none"/>
+        </w:rPr>
+        <w:t>(</w:t>
+      </w:r>
+      <w:r>
+        <w:rPr>
+          <w:rFonts w:ascii="Consolas" w:eastAsia="Times New Roman" w:hAnsi="Consolas" w:cs="Times New Roman"/>
+          <w:color w:val="B675F1"/>
+          <w:kern w:val="0"/>
+          <w:sz w:val="21"/>
+          <w:szCs w:val="21"/>
+          <w14:ligatures w14:val="none"/>
+        </w:rPr>
+        <w:t>max</w:t>
+      </w:r>
+      <w:r>
+        <w:rPr>
+          <w:rFonts w:ascii="Consolas" w:eastAsia="Times New Roman" w:hAnsi="Consolas" w:cs="Times New Roman"/>
+          <w:color w:val="EDEDED"/>
+          <w:kern w:val="0"/>
+          <w:sz w:val="21"/>
+          <w:szCs w:val="21"/>
+          <w14:ligatures w14:val="none"/>
+        </w:rPr>
+        <w:t>(</w:t>
+      </w:r>
+      <w:r>
+        <w:rPr>
+          <w:rFonts w:ascii="Consolas" w:eastAsia="Times New Roman" w:hAnsi="Consolas" w:cs="Times New Roman"/>
+          <w:color w:val="B675F1"/>
+          <w:kern w:val="0"/>
+          <w:sz w:val="21"/>
+          <w:szCs w:val="21"/>
+          <w14:ligatures w14:val="none"/>
+        </w:rPr>
+        <w:t>min</w:t>
+      </w:r>
+      <w:r>
+        <w:rPr>
+          <w:rFonts w:ascii="Consolas" w:eastAsia="Times New Roman" w:hAnsi="Consolas" w:cs="Times New Roman"/>
+          <w:color w:val="EDEDED"/>
+          <w:kern w:val="0"/>
+          <w:sz w:val="21"/>
+          <w:szCs w:val="21"/>
+          <w14:ligatures w14:val="none"/>
+        </w:rPr>
+        <w:t xml:space="preserve">(y, </w:t>
+      </w:r>
+      <w:r>
+        <w:rPr>
+          <w:rFonts w:ascii="Consolas" w:eastAsia="Times New Roman" w:hAnsi="Consolas" w:cs="Times New Roman"/>
+          <w:color w:val="62A6FF"/>
+          <w:kern w:val="0"/>
+          <w:sz w:val="21"/>
+          <w:szCs w:val="21"/>
+          <w14:ligatures w14:val="none"/>
+        </w:rPr>
+        <w:t>1</w:t>
+      </w:r>
+      <w:r>
+        <w:rPr>
+          <w:rFonts w:ascii="Consolas" w:eastAsia="Times New Roman" w:hAnsi="Consolas" w:cs="Times New Roman"/>
+          <w:color w:val="EDEDED"/>
+          <w:kern w:val="0"/>
+          <w:sz w:val="21"/>
+          <w:szCs w:val="21"/>
+          <w14:ligatures w14:val="none"/>
+        </w:rPr>
+        <w:t xml:space="preserve">), </w:t>
+      </w:r>
+      <w:r>
+        <w:rPr>
+          <w:rFonts w:ascii="Consolas" w:eastAsia="Times New Roman" w:hAnsi="Consolas" w:cs="Times New Roman"/>
+          <w:color w:val="F05B8D"/>
+          <w:kern w:val="0"/>
+          <w:sz w:val="21"/>
+          <w:szCs w:val="21"/>
+          <w14:ligatures w14:val="none"/>
+        </w:rPr>
+        <w:t>-</w:t>
+      </w:r>
+      <w:r>
+        <w:rPr>
+          <w:rFonts w:ascii="Consolas" w:eastAsia="Times New Roman" w:hAnsi="Consolas" w:cs="Times New Roman"/>
+          <w:color w:val="62A6FF"/>
+          <w:kern w:val="0"/>
+          <w:sz w:val="21"/>
+          <w:szCs w:val="21"/>
+          <w14:ligatures w14:val="none"/>
+        </w:rPr>
+        <w:t>1</w:t>
+      </w:r>
+      <w:r>
+        <w:rPr>
+          <w:rFonts w:ascii="Consolas" w:eastAsia="Times New Roman" w:hAnsi="Consolas" w:cs="Times New Roman"/>
+          <w:color w:val="EDEDED"/>
+          <w:kern w:val="0"/>
+          <w:sz w:val="21"/>
+          <w:szCs w:val="21"/>
+          <w14:ligatures w14:val="none"/>
+        </w:rPr>
+        <w:t xml:space="preserve">) </w:t>
+      </w:r>
+      <w:r>
+        <w:rPr>
+          <w:rFonts w:ascii="Consolas" w:eastAsia="Times New Roman" w:hAnsi="Consolas" w:cs="Times New Roman"/>
+          <w:color w:val="F05B8D"/>
+          <w:kern w:val="0"/>
+          <w:sz w:val="21"/>
+          <w:szCs w:val="21"/>
+          <w14:ligatures w14:val="none"/>
+        </w:rPr>
+        <w:t>*</w:t>
+      </w:r>
+      <w:r>
+        <w:rPr>
+          <w:rFonts w:ascii="Consolas" w:eastAsia="Times New Roman" w:hAnsi="Consolas" w:cs="Times New Roman"/>
+          <w:color w:val="EDEDED"/>
+          <w:kern w:val="0"/>
+          <w:sz w:val="21"/>
+          <w:szCs w:val="21"/>
+          <w14:ligatures w14:val="none"/>
+        </w:rPr>
+        <w:t xml:space="preserve"> </w:t>
+      </w:r>
+      <w:r>
+        <w:rPr>
+          <w:rFonts w:ascii="Consolas" w:eastAsia="Times New Roman" w:hAnsi="Consolas" w:cs="Times New Roman"/>
+          <w:color w:val="62A6FF"/>
+          <w:kern w:val="0"/>
+          <w:sz w:val="21"/>
+          <w:szCs w:val="21"/>
+          <w14:ligatures w14:val="none"/>
+        </w:rPr>
+        <w:t>1000</w:t>
+      </w:r>
+      <w:r>
+        <w:rPr>
+          <w:rFonts w:ascii="Consolas" w:eastAsia="Times New Roman" w:hAnsi="Consolas" w:cs="Times New Roman"/>
+          <w:color w:val="EDEDED"/>
+          <w:kern w:val="0"/>
+          <w:sz w:val="21"/>
+          <w:szCs w:val="21"/>
+          <w14:ligatures w14:val="none"/>
+        </w:rPr>
+        <w:t>);</w:t>
+      </w:r>
+    </w:p>
+    <w:p>
+      <w:pPr>
+        <w:shd w:val="clear" w:color="auto" w:fill="0A0A0A"/>
+        <w:spacing w:line="285" w:lineRule="atLeast"/>
+        <w:jc w:val="left"/>
+        <w:rPr>
+          <w:rFonts w:ascii="Consolas" w:eastAsia="Times New Roman" w:hAnsi="Consolas" w:cs="Times New Roman"/>
+          <w:color w:val="EDEDED"/>
+          <w:kern w:val="0"/>
+          <w:sz w:val="21"/>
+          <w:szCs w:val="21"/>
+          <w14:ligatures w14:val="none"/>
+        </w:rPr>
+      </w:pPr>
+      <w:r>
+        <w:rPr>
+          <w:rFonts w:ascii="Consolas" w:eastAsia="Times New Roman" w:hAnsi="Consolas" w:cs="Times New Roman"/>
+          <w:color w:val="EDEDED"/>
+          <w:kern w:val="0"/>
+          <w:sz w:val="21"/>
+          <w:szCs w:val="21"/>
+          <w14:ligatures w14:val="none"/>
+        </w:rPr>
+        <w:t xml:space="preserve">L </w:t>
+      </w:r>
+      <w:r>
+        <w:rPr>
+          <w:rFonts w:ascii="Consolas" w:eastAsia="Times New Roman" w:hAnsi="Consolas" w:cs="Times New Roman"/>
+          <w:color w:val="F05B8D"/>
+          <w:kern w:val="0"/>
+          <w:sz w:val="21"/>
+          <w:szCs w:val="21"/>
+          <w14:ligatures w14:val="none"/>
+        </w:rPr>
+        <w:t>=</w:t>
+      </w:r>
+      <w:r>
+        <w:rPr>
+          <w:rFonts w:ascii="Consolas" w:eastAsia="Times New Roman" w:hAnsi="Consolas" w:cs="Times New Roman"/>
+          <w:color w:val="EDEDED"/>
+          <w:kern w:val="0"/>
+          <w:sz w:val="21"/>
+          <w:szCs w:val="21"/>
+          <w14:ligatures w14:val="none"/>
+        </w:rPr>
+        <w:t xml:space="preserve"> </w:t>
+      </w:r>
+      <w:r>
+        <w:rPr>
+          <w:rFonts w:ascii="Consolas" w:eastAsia="Times New Roman" w:hAnsi="Consolas" w:cs="Times New Roman"/>
+          <w:color w:val="B675F1"/>
+          <w:kern w:val="0"/>
+          <w:sz w:val="21"/>
+          <w:szCs w:val="21"/>
+          <w14:ligatures w14:val="none"/>
+        </w:rPr>
+        <w:t>length</w:t>
+      </w:r>
+      <w:r>
+        <w:rPr>
+          <w:rFonts w:ascii="Consolas" w:eastAsia="Times New Roman" w:hAnsi="Consolas" w:cs="Times New Roman"/>
+          <w:color w:val="EDEDED"/>
+          <w:kern w:val="0"/>
+          <w:sz w:val="21"/>
+          <w:szCs w:val="21"/>
+          <w14:ligatures w14:val="none"/>
+        </w:rPr>
+        <w:t>(y_short);</w:t>
+      </w:r>
+    </w:p>
+    <w:p>
+      <w:pPr>
+        <w:shd w:val="clear" w:color="auto" w:fill="0A0A0A"/>
+        <w:spacing w:line="285" w:lineRule="atLeast"/>
+        <w:jc w:val="left"/>
+        <w:rPr>
+          <w:rFonts w:ascii="Consolas" w:eastAsia="Times New Roman" w:hAnsi="Consolas" w:cs="Times New Roman"/>
+          <w:color w:val="EDEDED"/>
+          <w:kern w:val="0"/>
+          <w:sz w:val="21"/>
+          <w:szCs w:val="21"/>
+          <w14:ligatures w14:val="none"/>
+        </w:rPr>
+      </w:pPr>
+    </w:p>
+    <w:p>
+      <w:pPr>
+        <w:shd w:val="clear" w:color="auto" w:fill="0A0A0A"/>
+        <w:spacing w:line="285" w:lineRule="atLeast"/>
+        <w:jc w:val="left"/>
+        <w:rPr>
+          <w:rFonts w:ascii="Consolas" w:eastAsia="Times New Roman" w:hAnsi="Consolas" w:cs="Times New Roman"/>
+          <w:color w:val="EDEDED"/>
+          <w:kern w:val="0"/>
+          <w:sz w:val="21"/>
+          <w:szCs w:val="21"/>
+          <w14:ligatures w14:val="none"/>
+        </w:rPr>
+      </w:pPr>
+      <w:r>
+        <w:rPr>
+          <w:rFonts w:ascii="Consolas" w:eastAsia="Times New Roman" w:hAnsi="Consolas" w:cs="Times New Roman"/>
+          <w:color w:val="EDEDED"/>
+          <w:kern w:val="0"/>
+          <w:sz w:val="21"/>
+          <w:szCs w:val="21"/>
+          <w14:ligatures w14:val="none"/>
+        </w:rPr>
+        <w:t xml:space="preserve">fid </w:t>
+      </w:r>
+      <w:r>
+        <w:rPr>
+          <w:rFonts w:ascii="Consolas" w:eastAsia="Times New Roman" w:hAnsi="Consolas" w:cs="Times New Roman"/>
+          <w:color w:val="F05B8D"/>
+          <w:kern w:val="0"/>
+          <w:sz w:val="21"/>
+          <w:szCs w:val="21"/>
+          <w14:ligatures w14:val="none"/>
+        </w:rPr>
+        <w:t>=</w:t>
+      </w:r>
+      <w:r>
+        <w:rPr>
+          <w:rFonts w:ascii="Consolas" w:eastAsia="Times New Roman" w:hAnsi="Consolas" w:cs="Times New Roman"/>
+          <w:color w:val="EDEDED"/>
+          <w:kern w:val="0"/>
+          <w:sz w:val="21"/>
+          <w:szCs w:val="21"/>
+          <w14:ligatures w14:val="none"/>
+        </w:rPr>
+        <w:t xml:space="preserve"> </w:t>
+      </w:r>
+      <w:r>
+        <w:rPr>
+          <w:rFonts w:ascii="Consolas" w:eastAsia="Times New Roman" w:hAnsi="Consolas" w:cs="Times New Roman"/>
+          <w:color w:val="B675F1"/>
+          <w:kern w:val="0"/>
+          <w:sz w:val="21"/>
+          <w:szCs w:val="21"/>
+          <w14:ligatures w14:val="none"/>
+        </w:rPr>
+        <w:t>fopen</w:t>
+      </w:r>
+      <w:r>
+        <w:rPr>
+          <w:rFonts w:ascii="Consolas" w:eastAsia="Times New Roman" w:hAnsi="Consolas" w:cs="Times New Roman"/>
+          <w:color w:val="EDEDED"/>
+          <w:kern w:val="0"/>
+          <w:sz w:val="21"/>
+          <w:szCs w:val="21"/>
+          <w14:ligatures w14:val="none"/>
+        </w:rPr>
+        <w:t>(</w:t>
+      </w:r>
+      <w:r>
+        <w:rPr>
+          <w:rFonts w:ascii="Consolas" w:eastAsia="Times New Roman" w:hAnsi="Consolas" w:cs="Times New Roman"/>
+          <w:color w:val="58C760"/>
+          <w:kern w:val="0"/>
+          <w:sz w:val="21"/>
+          <w:szCs w:val="21"/>
+          <w14:ligatures w14:val="none"/>
+        </w:rPr>
+        <w:t>'extract_1.h'</w:t>
+      </w:r>
+      <w:r>
+        <w:rPr>
+          <w:rFonts w:ascii="Consolas" w:eastAsia="Times New Roman" w:hAnsi="Consolas" w:cs="Times New Roman"/>
+          <w:color w:val="EDEDED"/>
+          <w:kern w:val="0"/>
+          <w:sz w:val="21"/>
+          <w:szCs w:val="21"/>
+          <w14:ligatures w14:val="none"/>
+        </w:rPr>
+        <w:t xml:space="preserve">, </w:t>
+      </w:r>
+      <w:r>
+        <w:rPr>
+          <w:rFonts w:ascii="Consolas" w:eastAsia="Times New Roman" w:hAnsi="Consolas" w:cs="Times New Roman"/>
+          <w:color w:val="58C760"/>
+          <w:kern w:val="0"/>
+          <w:sz w:val="21"/>
+          <w:szCs w:val="21"/>
+          <w14:ligatures w14:val="none"/>
+        </w:rPr>
+        <w:t>'w'</w:t>
+      </w:r>
+      <w:r>
+        <w:rPr>
+          <w:rFonts w:ascii="Consolas" w:eastAsia="Times New Roman" w:hAnsi="Consolas" w:cs="Times New Roman"/>
+          <w:color w:val="EDEDED"/>
+          <w:kern w:val="0"/>
+          <w:sz w:val="21"/>
+          <w:szCs w:val="21"/>
+          <w14:ligatures w14:val="none"/>
+        </w:rPr>
+        <w:t>);</w:t>
+      </w:r>
+    </w:p>
+    <w:p>
+      <w:pPr>
+        <w:shd w:val="clear" w:color="auto" w:fill="0A0A0A"/>
+        <w:spacing w:line="285" w:lineRule="atLeast"/>
+        <w:jc w:val="left"/>
+        <w:rPr>
+          <w:rFonts w:ascii="Consolas" w:eastAsia="Times New Roman" w:hAnsi="Consolas" w:cs="Times New Roman"/>
+          <w:color w:val="EDEDED"/>
+          <w:kern w:val="0"/>
+          <w:sz w:val="21"/>
+          <w:szCs w:val="21"/>
+          <w14:ligatures w14:val="none"/>
+        </w:rPr>
+      </w:pPr>
+      <w:r>
+        <w:rPr>
+          <w:rFonts w:ascii="Consolas" w:eastAsia="Times New Roman" w:hAnsi="Consolas" w:cs="Times New Roman"/>
+          <w:color w:val="B675F1"/>
+          <w:kern w:val="0"/>
+          <w:sz w:val="21"/>
+          <w:szCs w:val="21"/>
+          <w14:ligatures w14:val="none"/>
+        </w:rPr>
+        <w:t>fprintf</w:t>
+      </w:r>
+      <w:r>
+        <w:rPr>
+          <w:rFonts w:ascii="Consolas" w:eastAsia="Times New Roman" w:hAnsi="Consolas" w:cs="Times New Roman"/>
+          <w:color w:val="EDEDED"/>
+          <w:kern w:val="0"/>
+          <w:sz w:val="21"/>
+          <w:szCs w:val="21"/>
+          <w14:ligatures w14:val="none"/>
+        </w:rPr>
+        <w:t xml:space="preserve">(fid, </w:t>
+      </w:r>
+      <w:r>
+        <w:rPr>
+          <w:rFonts w:ascii="Consolas" w:eastAsia="Times New Roman" w:hAnsi="Consolas" w:cs="Times New Roman"/>
+          <w:color w:val="58C760"/>
+          <w:kern w:val="0"/>
+          <w:sz w:val="21"/>
+          <w:szCs w:val="21"/>
+          <w14:ligatures w14:val="none"/>
+        </w:rPr>
+        <w:t>'#ifndef EXTRACT_1_H</w:t>
+      </w:r>
+      <w:r>
+        <w:rPr>
+          <w:rFonts w:ascii="Consolas" w:eastAsia="Times New Roman" w:hAnsi="Consolas" w:cs="Times New Roman"/>
+          <w:color w:val="62A6FF"/>
+          <w:kern w:val="0"/>
+          <w:sz w:val="21"/>
+          <w:szCs w:val="21"/>
+          <w14:ligatures w14:val="none"/>
+        </w:rPr>
+        <w:t>\n</w:t>
+      </w:r>
+      <w:r>
+        <w:rPr>
+          <w:rFonts w:ascii="Consolas" w:eastAsia="Times New Roman" w:hAnsi="Consolas" w:cs="Times New Roman"/>
+          <w:color w:val="58C760"/>
+          <w:kern w:val="0"/>
+          <w:sz w:val="21"/>
+          <w:szCs w:val="21"/>
+          <w14:ligatures w14:val="none"/>
+        </w:rPr>
+        <w:t>'</w:t>
+      </w:r>
+      <w:r>
+        <w:rPr>
+          <w:rFonts w:ascii="Consolas" w:eastAsia="Times New Roman" w:hAnsi="Consolas" w:cs="Times New Roman"/>
+          <w:color w:val="EDEDED"/>
+          <w:kern w:val="0"/>
+          <w:sz w:val="21"/>
+          <w:szCs w:val="21"/>
+          <w14:ligatures w14:val="none"/>
+        </w:rPr>
+        <w:t>);</w:t>
+      </w:r>
+    </w:p>
+    <w:p>
+      <w:pPr>
+        <w:shd w:val="clear" w:color="auto" w:fill="0A0A0A"/>
+        <w:spacing w:line="285" w:lineRule="atLeast"/>
+        <w:jc w:val="left"/>
+        <w:rPr>
+          <w:rFonts w:ascii="Consolas" w:eastAsia="Times New Roman" w:hAnsi="Consolas" w:cs="Times New Roman"/>
+          <w:color w:val="EDEDED"/>
+          <w:kern w:val="0"/>
+          <w:sz w:val="21"/>
+          <w:szCs w:val="21"/>
+          <w14:ligatures w14:val="none"/>
+        </w:rPr>
+      </w:pPr>
+      <w:r>
+        <w:rPr>
+          <w:rFonts w:ascii="Consolas" w:eastAsia="Times New Roman" w:hAnsi="Consolas" w:cs="Times New Roman"/>
+          <w:color w:val="B675F1"/>
+          <w:kern w:val="0"/>
+          <w:sz w:val="21"/>
+          <w:szCs w:val="21"/>
+          <w14:ligatures w14:val="none"/>
+        </w:rPr>
+        <w:t>fprintf</w:t>
+      </w:r>
+      <w:r>
+        <w:rPr>
+          <w:rFonts w:ascii="Consolas" w:eastAsia="Times New Roman" w:hAnsi="Consolas" w:cs="Times New Roman"/>
+          <w:color w:val="EDEDED"/>
+          <w:kern w:val="0"/>
+          <w:sz w:val="21"/>
+          <w:szCs w:val="21"/>
+          <w14:ligatures w14:val="none"/>
+        </w:rPr>
+        <w:t xml:space="preserve">(fid, </w:t>
+      </w:r>
+      <w:r>
+        <w:rPr>
+          <w:rFonts w:ascii="Consolas" w:eastAsia="Times New Roman" w:hAnsi="Consolas" w:cs="Times New Roman"/>
+          <w:color w:val="58C760"/>
+          <w:kern w:val="0"/>
+          <w:sz w:val="21"/>
+          <w:szCs w:val="21"/>
+          <w14:ligatures w14:val="none"/>
+        </w:rPr>
+        <w:t>'#define EXTRACT_1_H</w:t>
+      </w:r>
+      <w:r>
+        <w:rPr>
+          <w:rFonts w:ascii="Consolas" w:eastAsia="Times New Roman" w:hAnsi="Consolas" w:cs="Times New Roman"/>
+          <w:color w:val="62A6FF"/>
+          <w:kern w:val="0"/>
+          <w:sz w:val="21"/>
+          <w:szCs w:val="21"/>
+          <w14:ligatures w14:val="none"/>
+        </w:rPr>
+        <w:t>\n\n</w:t>
+      </w:r>
+      <w:r>
+        <w:rPr>
+          <w:rFonts w:ascii="Consolas" w:eastAsia="Times New Roman" w:hAnsi="Consolas" w:cs="Times New Roman"/>
+          <w:color w:val="58C760"/>
+          <w:kern w:val="0"/>
+          <w:sz w:val="21"/>
+          <w:szCs w:val="21"/>
+          <w14:ligatures w14:val="none"/>
+        </w:rPr>
+        <w:t>'</w:t>
+      </w:r>
+      <w:r>
+        <w:rPr>
+          <w:rFonts w:ascii="Consolas" w:eastAsia="Times New Roman" w:hAnsi="Consolas" w:cs="Times New Roman"/>
+          <w:color w:val="EDEDED"/>
+          <w:kern w:val="0"/>
+          <w:sz w:val="21"/>
+          <w:szCs w:val="21"/>
+          <w14:ligatures w14:val="none"/>
+        </w:rPr>
+        <w:t>);</w:t>
+      </w:r>
+    </w:p>
+    <w:p>
+      <w:pPr>
+        <w:shd w:val="clear" w:color="auto" w:fill="0A0A0A"/>
+        <w:spacing w:line="285" w:lineRule="atLeast"/>
+        <w:jc w:val="left"/>
+        <w:rPr>
+          <w:rFonts w:ascii="Consolas" w:eastAsia="Times New Roman" w:hAnsi="Consolas" w:cs="Times New Roman"/>
+          <w:color w:val="EDEDED"/>
+          <w:kern w:val="0"/>
+          <w:sz w:val="21"/>
+          <w:szCs w:val="21"/>
+          <w14:ligatures w14:val="none"/>
+        </w:rPr>
+      </w:pPr>
+      <w:r>
+        <w:rPr>
+          <w:rFonts w:ascii="Consolas" w:eastAsia="Times New Roman" w:hAnsi="Consolas" w:cs="Times New Roman"/>
+          <w:color w:val="B675F1"/>
+          <w:kern w:val="0"/>
+          <w:sz w:val="21"/>
+          <w:szCs w:val="21"/>
+          <w14:ligatures w14:val="none"/>
+        </w:rPr>
+        <w:t>fprintf</w:t>
+      </w:r>
+      <w:r>
+        <w:rPr>
+          <w:rFonts w:ascii="Consolas" w:eastAsia="Times New Roman" w:hAnsi="Consolas" w:cs="Times New Roman"/>
+          <w:color w:val="EDEDED"/>
+          <w:kern w:val="0"/>
+          <w:sz w:val="21"/>
+          <w:szCs w:val="21"/>
+          <w14:ligatures w14:val="none"/>
+        </w:rPr>
+        <w:t xml:space="preserve">(fid, </w:t>
+      </w:r>
+      <w:r>
+        <w:rPr>
+          <w:rFonts w:ascii="Consolas" w:eastAsia="Times New Roman" w:hAnsi="Consolas" w:cs="Times New Roman"/>
+          <w:color w:val="58C760"/>
+          <w:kern w:val="0"/>
+          <w:sz w:val="21"/>
+          <w:szCs w:val="21"/>
+          <w14:ligatures w14:val="none"/>
+        </w:rPr>
+        <w:t xml:space="preserve">'#define SPEECHBUF </w:t>
+      </w:r>
+      <w:r>
+        <w:rPr>
+          <w:rFonts w:ascii="Consolas" w:eastAsia="Times New Roman" w:hAnsi="Consolas" w:cs="Times New Roman"/>
+          <w:color w:val="62A6FF"/>
+          <w:kern w:val="0"/>
+          <w:sz w:val="21"/>
+          <w:szCs w:val="21"/>
+          <w14:ligatures w14:val="none"/>
+        </w:rPr>
+        <w:t>%d\n\n</w:t>
+      </w:r>
+      <w:r>
+        <w:rPr>
+          <w:rFonts w:ascii="Consolas" w:eastAsia="Times New Roman" w:hAnsi="Consolas" w:cs="Times New Roman"/>
+          <w:color w:val="58C760"/>
+          <w:kern w:val="0"/>
+          <w:sz w:val="21"/>
+          <w:szCs w:val="21"/>
+          <w14:ligatures w14:val="none"/>
+        </w:rPr>
+        <w:t>'</w:t>
+      </w:r>
+      <w:r>
+        <w:rPr>
+          <w:rFonts w:ascii="Consolas" w:eastAsia="Times New Roman" w:hAnsi="Consolas" w:cs="Times New Roman"/>
+          <w:color w:val="EDEDED"/>
+          <w:kern w:val="0"/>
+          <w:sz w:val="21"/>
+          <w:szCs w:val="21"/>
+          <w14:ligatures w14:val="none"/>
+        </w:rPr>
+        <w:t>, L);</w:t>
+      </w:r>
+    </w:p>
+    <w:p>
+      <w:pPr>
+        <w:shd w:val="clear" w:color="auto" w:fill="0A0A0A"/>
+        <w:spacing w:line="285" w:lineRule="atLeast"/>
+        <w:jc w:val="left"/>
+        <w:rPr>
+          <w:rFonts w:ascii="Consolas" w:eastAsia="Times New Roman" w:hAnsi="Consolas" w:cs="Times New Roman"/>
+          <w:color w:val="EDEDED"/>
+          <w:kern w:val="0"/>
+          <w:sz w:val="21"/>
+          <w:szCs w:val="21"/>
+          <w14:ligatures w14:val="none"/>
+        </w:rPr>
+      </w:pPr>
+      <w:r>
+        <w:rPr>
+          <w:rFonts w:ascii="Consolas" w:eastAsia="Times New Roman" w:hAnsi="Consolas" w:cs="Times New Roman"/>
+          <w:color w:val="B675F1"/>
+          <w:kern w:val="0"/>
+          <w:sz w:val="21"/>
+          <w:szCs w:val="21"/>
+          <w14:ligatures w14:val="none"/>
+        </w:rPr>
+        <w:t>fprintf</w:t>
+      </w:r>
+      <w:r>
+        <w:rPr>
+          <w:rFonts w:ascii="Consolas" w:eastAsia="Times New Roman" w:hAnsi="Consolas" w:cs="Times New Roman"/>
+          <w:color w:val="EDEDED"/>
+          <w:kern w:val="0"/>
+          <w:sz w:val="21"/>
+          <w:szCs w:val="21"/>
+          <w14:ligatures w14:val="none"/>
+        </w:rPr>
+        <w:t xml:space="preserve">(fid, </w:t>
+      </w:r>
+      <w:r>
+        <w:rPr>
+          <w:rFonts w:ascii="Consolas" w:eastAsia="Times New Roman" w:hAnsi="Consolas" w:cs="Times New Roman"/>
+          <w:color w:val="58C760"/>
+          <w:kern w:val="0"/>
+          <w:sz w:val="21"/>
+          <w:szCs w:val="21"/>
+          <w14:ligatures w14:val="none"/>
+        </w:rPr>
+        <w:t>'short Speech[SPEECHBUF+1] = {</w:t>
+      </w:r>
+      <w:r>
+        <w:rPr>
+          <w:rFonts w:ascii="Consolas" w:eastAsia="Times New Roman" w:hAnsi="Consolas" w:cs="Times New Roman"/>
+          <w:color w:val="62A6FF"/>
+          <w:kern w:val="0"/>
+          <w:sz w:val="21"/>
+          <w:szCs w:val="21"/>
+          <w14:ligatures w14:val="none"/>
+        </w:rPr>
+        <w:t>\n</w:t>
+      </w:r>
+      <w:r>
+        <w:rPr>
+          <w:rFonts w:ascii="Consolas" w:eastAsia="Times New Roman" w:hAnsi="Consolas" w:cs="Times New Roman"/>
+          <w:color w:val="58C760"/>
+          <w:kern w:val="0"/>
+          <w:sz w:val="21"/>
+          <w:szCs w:val="21"/>
+          <w14:ligatures w14:val="none"/>
+        </w:rPr>
+        <w:t>'</w:t>
+      </w:r>
+      <w:r>
+        <w:rPr>
+          <w:rFonts w:ascii="Consolas" w:eastAsia="Times New Roman" w:hAnsi="Consolas" w:cs="Times New Roman"/>
+          <w:color w:val="EDEDED"/>
+          <w:kern w:val="0"/>
+          <w:sz w:val="21"/>
+          <w:szCs w:val="21"/>
+          <w14:ligatures w14:val="none"/>
+        </w:rPr>
+        <w:t>);</w:t>
+      </w:r>
+    </w:p>
+    <w:p>
+      <w:pPr>
+        <w:shd w:val="clear" w:color="auto" w:fill="0A0A0A"/>
+        <w:spacing w:line="285" w:lineRule="atLeast"/>
+        <w:jc w:val="left"/>
+        <w:rPr>
+          <w:rFonts w:ascii="Consolas" w:eastAsia="Times New Roman" w:hAnsi="Consolas" w:cs="Times New Roman"/>
+          <w:color w:val="EDEDED"/>
+          <w:kern w:val="0"/>
+          <w:sz w:val="21"/>
+          <w:szCs w:val="21"/>
+          <w14:ligatures w14:val="none"/>
+        </w:rPr>
+      </w:pPr>
+    </w:p>
+    <w:p>
+      <w:pPr>
+        <w:shd w:val="clear" w:color="auto" w:fill="0A0A0A"/>
+        <w:spacing w:line="285" w:lineRule="atLeast"/>
+        <w:jc w:val="left"/>
+        <w:rPr>
+          <w:rFonts w:ascii="Consolas" w:eastAsia="Times New Roman" w:hAnsi="Consolas" w:cs="Times New Roman"/>
+          <w:color w:val="EDEDED"/>
+          <w:kern w:val="0"/>
+          <w:sz w:val="21"/>
+          <w:szCs w:val="21"/>
+          <w14:ligatures w14:val="none"/>
+        </w:rPr>
+      </w:pPr>
+      <w:r>
+        <w:rPr>
+          <w:rFonts w:ascii="Consolas" w:eastAsia="Times New Roman" w:hAnsi="Consolas" w:cs="Times New Roman"/>
+          <w:color w:val="EDEDED"/>
+          <w:kern w:val="0"/>
+          <w:sz w:val="21"/>
+          <w:szCs w:val="21"/>
+          <w14:ligatures w14:val="none"/>
+        </w:rPr>
+        <w:t xml:space="preserve">chunkSize </w:t>
+      </w:r>
+      <w:r>
+        <w:rPr>
+          <w:rFonts w:ascii="Consolas" w:eastAsia="Times New Roman" w:hAnsi="Consolas" w:cs="Times New Roman"/>
+          <w:color w:val="F05B8D"/>
+          <w:kern w:val="0"/>
+          <w:sz w:val="21"/>
+          <w:szCs w:val="21"/>
+          <w14:ligatures w14:val="none"/>
+        </w:rPr>
+        <w:t>=</w:t>
+      </w:r>
+      <w:r>
+        <w:rPr>
+          <w:rFonts w:ascii="Consolas" w:eastAsia="Times New Roman" w:hAnsi="Consolas" w:cs="Times New Roman"/>
+          <w:color w:val="EDEDED"/>
+          <w:kern w:val="0"/>
+          <w:sz w:val="21"/>
+          <w:szCs w:val="21"/>
+          <w14:ligatures w14:val="none"/>
+        </w:rPr>
+        <w:t xml:space="preserve"> </w:t>
+      </w:r>
+      <w:r>
+        <w:rPr>
+          <w:rFonts w:ascii="Consolas" w:eastAsia="Times New Roman" w:hAnsi="Consolas" w:cs="Times New Roman"/>
+          <w:color w:val="62A6FF"/>
+          <w:kern w:val="0"/>
+          <w:sz w:val="21"/>
+          <w:szCs w:val="21"/>
+          <w14:ligatures w14:val="none"/>
+        </w:rPr>
+        <w:t>4096</w:t>
+      </w:r>
+      <w:r>
+        <w:rPr>
+          <w:rFonts w:ascii="Consolas" w:eastAsia="Times New Roman" w:hAnsi="Consolas" w:cs="Times New Roman"/>
+          <w:color w:val="EDEDED"/>
+          <w:kern w:val="0"/>
+          <w:sz w:val="21"/>
+          <w:szCs w:val="21"/>
+          <w14:ligatures w14:val="none"/>
+        </w:rPr>
+        <w:t>;</w:t>
+      </w:r>
+    </w:p>
+    <w:p>
+      <w:pPr>
+        <w:shd w:val="clear" w:color="auto" w:fill="0A0A0A"/>
+        <w:spacing w:line="285" w:lineRule="atLeast"/>
+        <w:jc w:val="left"/>
+        <w:rPr>
+          <w:rFonts w:ascii="Consolas" w:eastAsia="Times New Roman" w:hAnsi="Consolas" w:cs="Times New Roman"/>
+          <w:color w:val="EDEDED"/>
+          <w:kern w:val="0"/>
+          <w:sz w:val="21"/>
+          <w:szCs w:val="21"/>
+          <w14:ligatures w14:val="none"/>
+        </w:rPr>
+      </w:pPr>
+      <w:r>
+        <w:rPr>
+          <w:rFonts w:ascii="Consolas" w:eastAsia="Times New Roman" w:hAnsi="Consolas" w:cs="Times New Roman"/>
+          <w:color w:val="F05B8D"/>
+          <w:kern w:val="0"/>
+          <w:sz w:val="21"/>
+          <w:szCs w:val="21"/>
+          <w14:ligatures w14:val="none"/>
+        </w:rPr>
+        <w:t>for</w:t>
+      </w:r>
+      <w:r>
+        <w:rPr>
+          <w:rFonts w:ascii="Consolas" w:eastAsia="Times New Roman" w:hAnsi="Consolas" w:cs="Times New Roman"/>
+          <w:color w:val="EDEDED"/>
+          <w:kern w:val="0"/>
+          <w:sz w:val="21"/>
+          <w:szCs w:val="21"/>
+          <w14:ligatures w14:val="none"/>
+        </w:rPr>
+        <w:t xml:space="preserve"> k </w:t>
+      </w:r>
+      <w:r>
+        <w:rPr>
+          <w:rFonts w:ascii="Consolas" w:eastAsia="Times New Roman" w:hAnsi="Consolas" w:cs="Times New Roman"/>
+          <w:color w:val="F05B8D"/>
+          <w:kern w:val="0"/>
+          <w:sz w:val="21"/>
+          <w:szCs w:val="21"/>
+          <w14:ligatures w14:val="none"/>
+        </w:rPr>
+        <w:t>=</w:t>
+      </w:r>
+      <w:r>
+        <w:rPr>
+          <w:rFonts w:ascii="Consolas" w:eastAsia="Times New Roman" w:hAnsi="Consolas" w:cs="Times New Roman"/>
+          <w:color w:val="EDEDED"/>
+          <w:kern w:val="0"/>
+          <w:sz w:val="21"/>
+          <w:szCs w:val="21"/>
+          <w14:ligatures w14:val="none"/>
+        </w:rPr>
+        <w:t xml:space="preserve"> </w:t>
+      </w:r>
+      <w:r>
+        <w:rPr>
+          <w:rFonts w:ascii="Consolas" w:eastAsia="Times New Roman" w:hAnsi="Consolas" w:cs="Times New Roman"/>
+          <w:color w:val="62A6FF"/>
+          <w:kern w:val="0"/>
+          <w:sz w:val="21"/>
+          <w:szCs w:val="21"/>
+          <w14:ligatures w14:val="none"/>
+        </w:rPr>
+        <w:t>1</w:t>
+      </w:r>
+      <w:r>
+        <w:rPr>
+          <w:rFonts w:ascii="Consolas" w:eastAsia="Times New Roman" w:hAnsi="Consolas" w:cs="Times New Roman"/>
+          <w:color w:val="F05B8D"/>
+          <w:kern w:val="0"/>
+          <w:sz w:val="21"/>
+          <w:szCs w:val="21"/>
+          <w14:ligatures w14:val="none"/>
+        </w:rPr>
+        <w:t>:</w:t>
+      </w:r>
+      <w:r>
+        <w:rPr>
+          <w:rFonts w:ascii="Consolas" w:eastAsia="Times New Roman" w:hAnsi="Consolas" w:cs="Times New Roman"/>
+          <w:color w:val="EDEDED"/>
+          <w:kern w:val="0"/>
+          <w:sz w:val="21"/>
+          <w:szCs w:val="21"/>
+          <w14:ligatures w14:val="none"/>
+        </w:rPr>
+        <w:t>chunkSize</w:t>
+      </w:r>
+      <w:r>
+        <w:rPr>
+          <w:rFonts w:ascii="Consolas" w:eastAsia="Times New Roman" w:hAnsi="Consolas" w:cs="Times New Roman"/>
+          <w:color w:val="F05B8D"/>
+          <w:kern w:val="0"/>
+          <w:sz w:val="21"/>
+          <w:szCs w:val="21"/>
+          <w14:ligatures w14:val="none"/>
+        </w:rPr>
+        <w:t>:</w:t>
+      </w:r>
+      <w:r>
+        <w:rPr>
+          <w:rFonts w:ascii="Consolas" w:eastAsia="Times New Roman" w:hAnsi="Consolas" w:cs="Times New Roman"/>
+          <w:color w:val="EDEDED"/>
+          <w:kern w:val="0"/>
+          <w:sz w:val="21"/>
+          <w:szCs w:val="21"/>
+          <w14:ligatures w14:val="none"/>
+        </w:rPr>
+        <w:t>L</w:t>
+      </w:r>
+    </w:p>
+    <w:p>
+      <w:pPr>
+        <w:shd w:val="clear" w:color="auto" w:fill="0A0A0A"/>
+        <w:spacing w:line="285" w:lineRule="atLeast"/>
+        <w:jc w:val="left"/>
+        <w:rPr>
+          <w:rFonts w:ascii="Consolas" w:eastAsia="Times New Roman" w:hAnsi="Consolas" w:cs="Times New Roman"/>
+          <w:color w:val="EDEDED"/>
+          <w:kern w:val="0"/>
+          <w:sz w:val="21"/>
+          <w:szCs w:val="21"/>
+          <w14:ligatures w14:val="none"/>
+        </w:rPr>
+      </w:pPr>
+      <w:r>
+        <w:rPr>
+          <w:rFonts w:ascii="Consolas" w:eastAsia="Times New Roman" w:hAnsi="Consolas" w:cs="Times New Roman"/>
+          <w:color w:val="EDEDED"/>
+          <w:kern w:val="0"/>
+          <w:sz w:val="21"/>
+          <w:szCs w:val="21"/>
+          <w14:ligatures w14:val="none"/>
+        </w:rPr>
+        <w:t xml:space="preserve">    e </w:t>
+      </w:r>
+      <w:r>
+        <w:rPr>
+          <w:rFonts w:ascii="Consolas" w:eastAsia="Times New Roman" w:hAnsi="Consolas" w:cs="Times New Roman"/>
+          <w:color w:val="F05B8D"/>
+          <w:kern w:val="0"/>
+          <w:sz w:val="21"/>
+          <w:szCs w:val="21"/>
+          <w14:ligatures w14:val="none"/>
+        </w:rPr>
+        <w:t>=</w:t>
+      </w:r>
+      <w:r>
+        <w:rPr>
+          <w:rFonts w:ascii="Consolas" w:eastAsia="Times New Roman" w:hAnsi="Consolas" w:cs="Times New Roman"/>
+          <w:color w:val="EDEDED"/>
+          <w:kern w:val="0"/>
+          <w:sz w:val="21"/>
+          <w:szCs w:val="21"/>
+          <w14:ligatures w14:val="none"/>
+        </w:rPr>
+        <w:t xml:space="preserve"> </w:t>
+      </w:r>
+      <w:r>
+        <w:rPr>
+          <w:rFonts w:ascii="Consolas" w:eastAsia="Times New Roman" w:hAnsi="Consolas" w:cs="Times New Roman"/>
+          <w:color w:val="B675F1"/>
+          <w:kern w:val="0"/>
+          <w:sz w:val="21"/>
+          <w:szCs w:val="21"/>
+          <w14:ligatures w14:val="none"/>
+        </w:rPr>
+        <w:t>min</w:t>
+      </w:r>
+      <w:r>
+        <w:rPr>
+          <w:rFonts w:ascii="Consolas" w:eastAsia="Times New Roman" w:hAnsi="Consolas" w:cs="Times New Roman"/>
+          <w:color w:val="EDEDED"/>
+          <w:kern w:val="0"/>
+          <w:sz w:val="21"/>
+          <w:szCs w:val="21"/>
+          <w14:ligatures w14:val="none"/>
+        </w:rPr>
+        <w:t xml:space="preserve">(k </w:t>
+      </w:r>
+      <w:r>
+        <w:rPr>
+          <w:rFonts w:ascii="Consolas" w:eastAsia="Times New Roman" w:hAnsi="Consolas" w:cs="Times New Roman"/>
+          <w:color w:val="F05B8D"/>
+          <w:kern w:val="0"/>
+          <w:sz w:val="21"/>
+          <w:szCs w:val="21"/>
+          <w14:ligatures w14:val="none"/>
+        </w:rPr>
+        <w:t>+</w:t>
+      </w:r>
+      <w:r>
+        <w:rPr>
+          <w:rFonts w:ascii="Consolas" w:eastAsia="Times New Roman" w:hAnsi="Consolas" w:cs="Times New Roman"/>
+          <w:color w:val="EDEDED"/>
+          <w:kern w:val="0"/>
+          <w:sz w:val="21"/>
+          <w:szCs w:val="21"/>
+          <w14:ligatures w14:val="none"/>
+        </w:rPr>
+        <w:t xml:space="preserve"> chunkSize </w:t>
+      </w:r>
+      <w:r>
+        <w:rPr>
+          <w:rFonts w:ascii="Consolas" w:eastAsia="Times New Roman" w:hAnsi="Consolas" w:cs="Times New Roman"/>
+          <w:color w:val="F05B8D"/>
+          <w:kern w:val="0"/>
+          <w:sz w:val="21"/>
+          <w:szCs w:val="21"/>
+          <w14:ligatures w14:val="none"/>
+        </w:rPr>
+        <w:t>-</w:t>
+      </w:r>
+      <w:r>
+        <w:rPr>
+          <w:rFonts w:ascii="Consolas" w:eastAsia="Times New Roman" w:hAnsi="Consolas" w:cs="Times New Roman"/>
+          <w:color w:val="EDEDED"/>
+          <w:kern w:val="0"/>
+          <w:sz w:val="21"/>
+          <w:szCs w:val="21"/>
+          <w14:ligatures w14:val="none"/>
+        </w:rPr>
+        <w:t xml:space="preserve"> </w:t>
+      </w:r>
+      <w:r>
+        <w:rPr>
+          <w:rFonts w:ascii="Consolas" w:eastAsia="Times New Roman" w:hAnsi="Consolas" w:cs="Times New Roman"/>
+          <w:color w:val="62A6FF"/>
+          <w:kern w:val="0"/>
+          <w:sz w:val="21"/>
+          <w:szCs w:val="21"/>
+          <w14:ligatures w14:val="none"/>
+        </w:rPr>
+        <w:t>1</w:t>
+      </w:r>
+      <w:r>
+        <w:rPr>
+          <w:rFonts w:ascii="Consolas" w:eastAsia="Times New Roman" w:hAnsi="Consolas" w:cs="Times New Roman"/>
+          <w:color w:val="EDEDED"/>
+          <w:kern w:val="0"/>
+          <w:sz w:val="21"/>
+          <w:szCs w:val="21"/>
+          <w14:ligatures w14:val="none"/>
+        </w:rPr>
+        <w:t>, L);</w:t>
+      </w:r>
+    </w:p>
+    <w:p>
+      <w:pPr>
+        <w:shd w:val="clear" w:color="auto" w:fill="0A0A0A"/>
+        <w:spacing w:line="285" w:lineRule="atLeast"/>
+        <w:jc w:val="left"/>
+        <w:rPr>
+          <w:rFonts w:ascii="Consolas" w:eastAsia="Times New Roman" w:hAnsi="Consolas" w:cs="Times New Roman"/>
+          <w:color w:val="EDEDED"/>
+          <w:kern w:val="0"/>
+          <w:sz w:val="21"/>
+          <w:szCs w:val="21"/>
+          <w14:ligatures w14:val="none"/>
+        </w:rPr>
+      </w:pPr>
+      <w:r>
+        <w:rPr>
+          <w:rFonts w:ascii="Consolas" w:eastAsia="Times New Roman" w:hAnsi="Consolas" w:cs="Times New Roman"/>
+          <w:color w:val="EDEDED"/>
+          <w:kern w:val="0"/>
+          <w:sz w:val="21"/>
+          <w:szCs w:val="21"/>
+          <w14:ligatures w14:val="none"/>
+        </w:rPr>
+        <w:t xml:space="preserve">    block </w:t>
+      </w:r>
+      <w:r>
+        <w:rPr>
+          <w:rFonts w:ascii="Consolas" w:eastAsia="Times New Roman" w:hAnsi="Consolas" w:cs="Times New Roman"/>
+          <w:color w:val="F05B8D"/>
+          <w:kern w:val="0"/>
+          <w:sz w:val="21"/>
+          <w:szCs w:val="21"/>
+          <w14:ligatures w14:val="none"/>
+        </w:rPr>
+        <w:t>=</w:t>
+      </w:r>
+      <w:r>
+        <w:rPr>
+          <w:rFonts w:ascii="Consolas" w:eastAsia="Times New Roman" w:hAnsi="Consolas" w:cs="Times New Roman"/>
+          <w:color w:val="EDEDED"/>
+          <w:kern w:val="0"/>
+          <w:sz w:val="21"/>
+          <w:szCs w:val="21"/>
+          <w14:ligatures w14:val="none"/>
+        </w:rPr>
+        <w:t xml:space="preserve"> </w:t>
+      </w:r>
+      <w:r>
+        <w:rPr>
+          <w:rFonts w:ascii="Consolas" w:eastAsia="Times New Roman" w:hAnsi="Consolas" w:cs="Times New Roman"/>
+          <w:color w:val="B675F1"/>
+          <w:kern w:val="0"/>
+          <w:sz w:val="21"/>
+          <w:szCs w:val="21"/>
+          <w14:ligatures w14:val="none"/>
+        </w:rPr>
+        <w:t>y_short</w:t>
+      </w:r>
+      <w:r>
+        <w:rPr>
+          <w:rFonts w:ascii="Consolas" w:eastAsia="Times New Roman" w:hAnsi="Consolas" w:cs="Times New Roman"/>
+          <w:color w:val="EDEDED"/>
+          <w:kern w:val="0"/>
+          <w:sz w:val="21"/>
+          <w:szCs w:val="21"/>
+          <w14:ligatures w14:val="none"/>
+        </w:rPr>
+        <w:t>(k</w:t>
+      </w:r>
+      <w:r>
+        <w:rPr>
+          <w:rFonts w:ascii="Consolas" w:eastAsia="Times New Roman" w:hAnsi="Consolas" w:cs="Times New Roman"/>
+          <w:color w:val="F05B8D"/>
+          <w:kern w:val="0"/>
+          <w:sz w:val="21"/>
+          <w:szCs w:val="21"/>
+          <w14:ligatures w14:val="none"/>
+        </w:rPr>
+        <w:t>:</w:t>
+      </w:r>
+      <w:r>
+        <w:rPr>
+          <w:rFonts w:ascii="Consolas" w:eastAsia="Times New Roman" w:hAnsi="Consolas" w:cs="Times New Roman"/>
+          <w:color w:val="EDEDED"/>
+          <w:kern w:val="0"/>
+          <w:sz w:val="21"/>
+          <w:szCs w:val="21"/>
+          <w14:ligatures w14:val="none"/>
+        </w:rPr>
+        <w:t>e);</w:t>
+      </w:r>
+    </w:p>
+    <w:p>
+      <w:pPr>
+        <w:shd w:val="clear" w:color="auto" w:fill="0A0A0A"/>
+        <w:spacing w:line="285" w:lineRule="atLeast"/>
+        <w:jc w:val="left"/>
+        <w:rPr>
+          <w:rFonts w:ascii="Consolas" w:eastAsia="Times New Roman" w:hAnsi="Consolas" w:cs="Times New Roman"/>
+          <w:color w:val="EDEDED"/>
+          <w:kern w:val="0"/>
+          <w:sz w:val="21"/>
+          <w:szCs w:val="21"/>
+          <w14:ligatures w14:val="none"/>
+        </w:rPr>
+      </w:pPr>
+      <w:r>
+        <w:rPr>
+          <w:rFonts w:ascii="Consolas" w:eastAsia="Times New Roman" w:hAnsi="Consolas" w:cs="Times New Roman"/>
+          <w:color w:val="EDEDED"/>
+          <w:kern w:val="0"/>
+          <w:sz w:val="21"/>
+          <w:szCs w:val="21"/>
+          <w14:ligatures w14:val="none"/>
+        </w:rPr>
+        <w:t xml:space="preserve">    </w:t>
+      </w:r>
+      <w:r>
+        <w:rPr>
+          <w:rFonts w:ascii="Consolas" w:eastAsia="Times New Roman" w:hAnsi="Consolas" w:cs="Times New Roman"/>
+          <w:color w:val="F05B8D"/>
+          <w:kern w:val="0"/>
+          <w:sz w:val="21"/>
+          <w:szCs w:val="21"/>
+          <w14:ligatures w14:val="none"/>
+        </w:rPr>
+        <w:t>if</w:t>
+      </w:r>
+      <w:r>
+        <w:rPr>
+          <w:rFonts w:ascii="Consolas" w:eastAsia="Times New Roman" w:hAnsi="Consolas" w:cs="Times New Roman"/>
+          <w:color w:val="EDEDED"/>
+          <w:kern w:val="0"/>
+          <w:sz w:val="21"/>
+          <w:szCs w:val="21"/>
+          <w14:ligatures w14:val="none"/>
+        </w:rPr>
+        <w:t xml:space="preserve"> e </w:t>
+      </w:r>
+      <w:r>
+        <w:rPr>
+          <w:rFonts w:ascii="Consolas" w:eastAsia="Times New Roman" w:hAnsi="Consolas" w:cs="Times New Roman"/>
+          <w:color w:val="F05B8D"/>
+          <w:kern w:val="0"/>
+          <w:sz w:val="21"/>
+          <w:szCs w:val="21"/>
+          <w14:ligatures w14:val="none"/>
+        </w:rPr>
+        <w:t>&lt;</w:t>
+      </w:r>
+      <w:r>
+        <w:rPr>
+          <w:rFonts w:ascii="Consolas" w:eastAsia="Times New Roman" w:hAnsi="Consolas" w:cs="Times New Roman"/>
+          <w:color w:val="EDEDED"/>
+          <w:kern w:val="0"/>
+          <w:sz w:val="21"/>
+          <w:szCs w:val="21"/>
+          <w14:ligatures w14:val="none"/>
+        </w:rPr>
+        <w:t xml:space="preserve"> L</w:t>
+      </w:r>
+    </w:p>
+    <w:p>
+      <w:pPr>
+        <w:shd w:val="clear" w:color="auto" w:fill="0A0A0A"/>
+        <w:spacing w:line="285" w:lineRule="atLeast"/>
+        <w:jc w:val="left"/>
+        <w:rPr>
+          <w:rFonts w:ascii="Consolas" w:eastAsia="Times New Roman" w:hAnsi="Consolas" w:cs="Times New Roman"/>
+          <w:color w:val="EDEDED"/>
+          <w:kern w:val="0"/>
+          <w:sz w:val="21"/>
+          <w:szCs w:val="21"/>
+          <w14:ligatures w14:val="none"/>
+        </w:rPr>
+      </w:pPr>
+      <w:r>
+        <w:rPr>
+          <w:rFonts w:ascii="Consolas" w:eastAsia="Times New Roman" w:hAnsi="Consolas" w:cs="Times New Roman"/>
+          <w:color w:val="EDEDED"/>
+          <w:kern w:val="0"/>
+          <w:sz w:val="21"/>
+          <w:szCs w:val="21"/>
+          <w14:ligatures w14:val="none"/>
+        </w:rPr>
+        <w:t xml:space="preserve">        </w:t>
+      </w:r>
+      <w:r>
+        <w:rPr>
+          <w:rFonts w:ascii="Consolas" w:eastAsia="Times New Roman" w:hAnsi="Consolas" w:cs="Times New Roman"/>
+          <w:color w:val="B675F1"/>
+          <w:kern w:val="0"/>
+          <w:sz w:val="21"/>
+          <w:szCs w:val="21"/>
+          <w14:ligatures w14:val="none"/>
+        </w:rPr>
+        <w:t>fprintf</w:t>
+      </w:r>
+      <w:r>
+        <w:rPr>
+          <w:rFonts w:ascii="Consolas" w:eastAsia="Times New Roman" w:hAnsi="Consolas" w:cs="Times New Roman"/>
+          <w:color w:val="EDEDED"/>
+          <w:kern w:val="0"/>
+          <w:sz w:val="21"/>
+          <w:szCs w:val="21"/>
+          <w14:ligatures w14:val="none"/>
+        </w:rPr>
+        <w:t xml:space="preserve">(fid, </w:t>
+      </w:r>
+      <w:r>
+        <w:rPr>
+          <w:rFonts w:ascii="Consolas" w:eastAsia="Times New Roman" w:hAnsi="Consolas" w:cs="Times New Roman"/>
+          <w:color w:val="58C760"/>
+          <w:kern w:val="0"/>
+          <w:sz w:val="21"/>
+          <w:szCs w:val="21"/>
+          <w14:ligatures w14:val="none"/>
+        </w:rPr>
+        <w:t>'</w:t>
+      </w:r>
+      <w:r>
+        <w:rPr>
+          <w:rFonts w:ascii="Consolas" w:eastAsia="Times New Roman" w:hAnsi="Consolas" w:cs="Times New Roman"/>
+          <w:color w:val="62A6FF"/>
+          <w:kern w:val="0"/>
+          <w:sz w:val="21"/>
+          <w:szCs w:val="21"/>
+          <w14:ligatures w14:val="none"/>
+        </w:rPr>
+        <w:t>%d</w:t>
+      </w:r>
+      <w:r>
+        <w:rPr>
+          <w:rFonts w:ascii="Consolas" w:eastAsia="Times New Roman" w:hAnsi="Consolas" w:cs="Times New Roman"/>
+          <w:color w:val="58C760"/>
+          <w:kern w:val="0"/>
+          <w:sz w:val="21"/>
+          <w:szCs w:val="21"/>
+          <w14:ligatures w14:val="none"/>
+        </w:rPr>
+        <w:t>, '</w:t>
+      </w:r>
+      <w:r>
+        <w:rPr>
+          <w:rFonts w:ascii="Consolas" w:eastAsia="Times New Roman" w:hAnsi="Consolas" w:cs="Times New Roman"/>
+          <w:color w:val="EDEDED"/>
+          <w:kern w:val="0"/>
+          <w:sz w:val="21"/>
+          <w:szCs w:val="21"/>
+          <w14:ligatures w14:val="none"/>
+        </w:rPr>
+        <w:t>, block);</w:t>
+      </w:r>
+    </w:p>
+    <w:p>
+      <w:pPr>
+        <w:shd w:val="clear" w:color="auto" w:fill="0A0A0A"/>
+        <w:spacing w:line="285" w:lineRule="atLeast"/>
+        <w:jc w:val="left"/>
+        <w:rPr>
+          <w:rFonts w:ascii="Consolas" w:eastAsia="Times New Roman" w:hAnsi="Consolas" w:cs="Times New Roman"/>
+          <w:color w:val="EDEDED"/>
+          <w:kern w:val="0"/>
+          <w:sz w:val="21"/>
+          <w:szCs w:val="21"/>
+          <w14:ligatures w14:val="none"/>
+        </w:rPr>
+      </w:pPr>
+      <w:r>
+        <w:rPr>
+          <w:rFonts w:ascii="Consolas" w:eastAsia="Times New Roman" w:hAnsi="Consolas" w:cs="Times New Roman"/>
+          <w:color w:val="EDEDED"/>
+          <w:kern w:val="0"/>
+          <w:sz w:val="21"/>
+          <w:szCs w:val="21"/>
+          <w14:ligatures w14:val="none"/>
+        </w:rPr>
+        <w:t xml:space="preserve">    </w:t>
+      </w:r>
+      <w:r>
+        <w:rPr>
+          <w:rFonts w:ascii="Consolas" w:eastAsia="Times New Roman" w:hAnsi="Consolas" w:cs="Times New Roman"/>
+          <w:color w:val="F05B8D"/>
+          <w:kern w:val="0"/>
+          <w:sz w:val="21"/>
+          <w:szCs w:val="21"/>
+          <w14:ligatures w14:val="none"/>
+        </w:rPr>
+        <w:t>else</w:t>
+      </w:r>
+    </w:p>
+    <w:p>
+      <w:pPr>
+        <w:shd w:val="clear" w:color="auto" w:fill="0A0A0A"/>
+        <w:spacing w:line="285" w:lineRule="atLeast"/>
+        <w:jc w:val="left"/>
+        <w:rPr>
+          <w:rFonts w:ascii="Consolas" w:eastAsia="Times New Roman" w:hAnsi="Consolas" w:cs="Times New Roman"/>
+          <w:color w:val="EDEDED"/>
+          <w:kern w:val="0"/>
+          <w:sz w:val="21"/>
+          <w:szCs w:val="21"/>
+          <w14:ligatures w14:val="none"/>
+        </w:rPr>
+      </w:pPr>
+      <w:r>
+        <w:rPr>
+          <w:rFonts w:ascii="Consolas" w:eastAsia="Times New Roman" w:hAnsi="Consolas" w:cs="Times New Roman"/>
+          <w:color w:val="EDEDED"/>
+          <w:kern w:val="0"/>
+          <w:sz w:val="21"/>
+          <w:szCs w:val="21"/>
+          <w14:ligatures w14:val="none"/>
+        </w:rPr>
+        <w:t xml:space="preserve">        </w:t>
+      </w:r>
+      <w:r>
+        <w:rPr>
+          <w:rFonts w:ascii="Consolas" w:eastAsia="Times New Roman" w:hAnsi="Consolas" w:cs="Times New Roman"/>
+          <w:color w:val="F05B8D"/>
+          <w:kern w:val="0"/>
+          <w:sz w:val="21"/>
+          <w:szCs w:val="21"/>
+          <w14:ligatures w14:val="none"/>
+        </w:rPr>
+        <w:t>if</w:t>
+      </w:r>
+      <w:r>
+        <w:rPr>
+          <w:rFonts w:ascii="Consolas" w:eastAsia="Times New Roman" w:hAnsi="Consolas" w:cs="Times New Roman"/>
+          <w:color w:val="EDEDED"/>
+          <w:kern w:val="0"/>
+          <w:sz w:val="21"/>
+          <w:szCs w:val="21"/>
+          <w14:ligatures w14:val="none"/>
+        </w:rPr>
+        <w:t xml:space="preserve"> </w:t>
+      </w:r>
+      <w:r>
+        <w:rPr>
+          <w:rFonts w:ascii="Consolas" w:eastAsia="Times New Roman" w:hAnsi="Consolas" w:cs="Times New Roman"/>
+          <w:color w:val="B675F1"/>
+          <w:kern w:val="0"/>
+          <w:sz w:val="21"/>
+          <w:szCs w:val="21"/>
+          <w14:ligatures w14:val="none"/>
+        </w:rPr>
+        <w:t>numel</w:t>
+      </w:r>
+      <w:r>
+        <w:rPr>
+          <w:rFonts w:ascii="Consolas" w:eastAsia="Times New Roman" w:hAnsi="Consolas" w:cs="Times New Roman"/>
+          <w:color w:val="EDEDED"/>
+          <w:kern w:val="0"/>
+          <w:sz w:val="21"/>
+          <w:szCs w:val="21"/>
+          <w14:ligatures w14:val="none"/>
+        </w:rPr>
+        <w:t xml:space="preserve">(block) </w:t>
+      </w:r>
+      <w:r>
+        <w:rPr>
+          <w:rFonts w:ascii="Consolas" w:eastAsia="Times New Roman" w:hAnsi="Consolas" w:cs="Times New Roman"/>
+          <w:color w:val="F05B8D"/>
+          <w:kern w:val="0"/>
+          <w:sz w:val="21"/>
+          <w:szCs w:val="21"/>
+          <w14:ligatures w14:val="none"/>
+        </w:rPr>
+        <w:t>&gt;</w:t>
+      </w:r>
+      <w:r>
+        <w:rPr>
+          <w:rFonts w:ascii="Consolas" w:eastAsia="Times New Roman" w:hAnsi="Consolas" w:cs="Times New Roman"/>
+          <w:color w:val="EDEDED"/>
+          <w:kern w:val="0"/>
+          <w:sz w:val="21"/>
+          <w:szCs w:val="21"/>
+          <w14:ligatures w14:val="none"/>
+        </w:rPr>
+        <w:t xml:space="preserve"> </w:t>
+      </w:r>
+      <w:r>
+        <w:rPr>
+          <w:rFonts w:ascii="Consolas" w:eastAsia="Times New Roman" w:hAnsi="Consolas" w:cs="Times New Roman"/>
+          <w:color w:val="62A6FF"/>
+          <w:kern w:val="0"/>
+          <w:sz w:val="21"/>
+          <w:szCs w:val="21"/>
+          <w14:ligatures w14:val="none"/>
+        </w:rPr>
+        <w:t>1</w:t>
+      </w:r>
+    </w:p>
+    <w:p>
+      <w:pPr>
+        <w:shd w:val="clear" w:color="auto" w:fill="0A0A0A"/>
+        <w:spacing w:line="285" w:lineRule="atLeast"/>
+        <w:jc w:val="left"/>
+        <w:rPr>
+          <w:rFonts w:ascii="Consolas" w:eastAsia="Times New Roman" w:hAnsi="Consolas" w:cs="Times New Roman"/>
+          <w:color w:val="EDEDED"/>
+          <w:kern w:val="0"/>
+          <w:sz w:val="21"/>
+          <w:szCs w:val="21"/>
+          <w14:ligatures w14:val="none"/>
+        </w:rPr>
+      </w:pPr>
+      <w:r>
+        <w:rPr>
+          <w:rFonts w:ascii="Consolas" w:eastAsia="Times New Roman" w:hAnsi="Consolas" w:cs="Times New Roman"/>
+          <w:color w:val="EDEDED"/>
+          <w:kern w:val="0"/>
+          <w:sz w:val="21"/>
+          <w:szCs w:val="21"/>
+          <w14:ligatures w14:val="none"/>
+        </w:rPr>
+        <w:t xml:space="preserve">            </w:t>
+      </w:r>
+      <w:r>
+        <w:rPr>
+          <w:rFonts w:ascii="Consolas" w:eastAsia="Times New Roman" w:hAnsi="Consolas" w:cs="Times New Roman"/>
+          <w:color w:val="B675F1"/>
+          <w:kern w:val="0"/>
+          <w:sz w:val="21"/>
+          <w:szCs w:val="21"/>
+          <w14:ligatures w14:val="none"/>
+        </w:rPr>
+        <w:t>fprintf</w:t>
+      </w:r>
+      <w:r>
+        <w:rPr>
+          <w:rFonts w:ascii="Consolas" w:eastAsia="Times New Roman" w:hAnsi="Consolas" w:cs="Times New Roman"/>
+          <w:color w:val="EDEDED"/>
+          <w:kern w:val="0"/>
+          <w:sz w:val="21"/>
+          <w:szCs w:val="21"/>
+          <w14:ligatures w14:val="none"/>
+        </w:rPr>
+        <w:t xml:space="preserve">(fid, </w:t>
+      </w:r>
+      <w:r>
+        <w:rPr>
+          <w:rFonts w:ascii="Consolas" w:eastAsia="Times New Roman" w:hAnsi="Consolas" w:cs="Times New Roman"/>
+          <w:color w:val="58C760"/>
+          <w:kern w:val="0"/>
+          <w:sz w:val="21"/>
+          <w:szCs w:val="21"/>
+          <w14:ligatures w14:val="none"/>
+        </w:rPr>
+        <w:t>'</w:t>
+      </w:r>
+      <w:r>
+        <w:rPr>
+          <w:rFonts w:ascii="Consolas" w:eastAsia="Times New Roman" w:hAnsi="Consolas" w:cs="Times New Roman"/>
+          <w:color w:val="62A6FF"/>
+          <w:kern w:val="0"/>
+          <w:sz w:val="21"/>
+          <w:szCs w:val="21"/>
+          <w14:ligatures w14:val="none"/>
+        </w:rPr>
+        <w:t>%d</w:t>
+      </w:r>
+      <w:r>
+        <w:rPr>
+          <w:rFonts w:ascii="Consolas" w:eastAsia="Times New Roman" w:hAnsi="Consolas" w:cs="Times New Roman"/>
+          <w:color w:val="58C760"/>
+          <w:kern w:val="0"/>
+          <w:sz w:val="21"/>
+          <w:szCs w:val="21"/>
+          <w14:ligatures w14:val="none"/>
+        </w:rPr>
+        <w:t>, '</w:t>
+      </w:r>
+      <w:r>
+        <w:rPr>
+          <w:rFonts w:ascii="Consolas" w:eastAsia="Times New Roman" w:hAnsi="Consolas" w:cs="Times New Roman"/>
+          <w:color w:val="EDEDED"/>
+          <w:kern w:val="0"/>
+          <w:sz w:val="21"/>
+          <w:szCs w:val="21"/>
+          <w14:ligatures w14:val="none"/>
+        </w:rPr>
+        <w:t xml:space="preserve">, </w:t>
+      </w:r>
+      <w:r>
+        <w:rPr>
+          <w:rFonts w:ascii="Consolas" w:eastAsia="Times New Roman" w:hAnsi="Consolas" w:cs="Times New Roman"/>
+          <w:color w:val="B675F1"/>
+          <w:kern w:val="0"/>
+          <w:sz w:val="21"/>
+          <w:szCs w:val="21"/>
+          <w14:ligatures w14:val="none"/>
+        </w:rPr>
+        <w:t>block</w:t>
+      </w:r>
+      <w:r>
+        <w:rPr>
+          <w:rFonts w:ascii="Consolas" w:eastAsia="Times New Roman" w:hAnsi="Consolas" w:cs="Times New Roman"/>
+          <w:color w:val="EDEDED"/>
+          <w:kern w:val="0"/>
+          <w:sz w:val="21"/>
+          <w:szCs w:val="21"/>
+          <w14:ligatures w14:val="none"/>
+        </w:rPr>
+        <w:t>(</w:t>
+      </w:r>
+      <w:r>
+        <w:rPr>
+          <w:rFonts w:ascii="Consolas" w:eastAsia="Times New Roman" w:hAnsi="Consolas" w:cs="Times New Roman"/>
+          <w:color w:val="62A6FF"/>
+          <w:kern w:val="0"/>
+          <w:sz w:val="21"/>
+          <w:szCs w:val="21"/>
+          <w14:ligatures w14:val="none"/>
+        </w:rPr>
+        <w:t>1</w:t>
+      </w:r>
+      <w:r>
+        <w:rPr>
+          <w:rFonts w:ascii="Consolas" w:eastAsia="Times New Roman" w:hAnsi="Consolas" w:cs="Times New Roman"/>
+          <w:color w:val="F05B8D"/>
+          <w:kern w:val="0"/>
+          <w:sz w:val="21"/>
+          <w:szCs w:val="21"/>
+          <w14:ligatures w14:val="none"/>
+        </w:rPr>
+        <w:t>:end-</w:t>
+      </w:r>
+      <w:r>
+        <w:rPr>
+          <w:rFonts w:ascii="Consolas" w:eastAsia="Times New Roman" w:hAnsi="Consolas" w:cs="Times New Roman"/>
+          <w:color w:val="62A6FF"/>
+          <w:kern w:val="0"/>
+          <w:sz w:val="21"/>
+          <w:szCs w:val="21"/>
+          <w14:ligatures w14:val="none"/>
+        </w:rPr>
+        <w:t>1</w:t>
+      </w:r>
+      <w:r>
+        <w:rPr>
+          <w:rFonts w:ascii="Consolas" w:eastAsia="Times New Roman" w:hAnsi="Consolas" w:cs="Times New Roman"/>
+          <w:color w:val="EDEDED"/>
+          <w:kern w:val="0"/>
+          <w:sz w:val="21"/>
+          <w:szCs w:val="21"/>
+          <w14:ligatures w14:val="none"/>
+        </w:rPr>
+        <w:t>));</w:t>
+      </w:r>
+    </w:p>
+    <w:p>
+      <w:pPr>
+        <w:shd w:val="clear" w:color="auto" w:fill="0A0A0A"/>
+        <w:spacing w:line="285" w:lineRule="atLeast"/>
+        <w:jc w:val="left"/>
+        <w:rPr>
+          <w:rFonts w:ascii="Consolas" w:eastAsia="Times New Roman" w:hAnsi="Consolas" w:cs="Times New Roman"/>
+          <w:color w:val="EDEDED"/>
+          <w:kern w:val="0"/>
+          <w:sz w:val="21"/>
+          <w:szCs w:val="21"/>
+          <w14:ligatures w14:val="none"/>
+        </w:rPr>
+      </w:pPr>
+      <w:r>
+        <w:rPr>
+          <w:rFonts w:ascii="Consolas" w:eastAsia="Times New Roman" w:hAnsi="Consolas" w:cs="Times New Roman"/>
+          <w:color w:val="EDEDED"/>
+          <w:kern w:val="0"/>
+          <w:sz w:val="21"/>
+          <w:szCs w:val="21"/>
+          <w14:ligatures w14:val="none"/>
+        </w:rPr>
+        <w:t xml:space="preserve">        </w:t>
+      </w:r>
+      <w:r>
+        <w:rPr>
+          <w:rFonts w:ascii="Consolas" w:eastAsia="Times New Roman" w:hAnsi="Consolas" w:cs="Times New Roman"/>
+          <w:color w:val="F05B8D"/>
+          <w:kern w:val="0"/>
+          <w:sz w:val="21"/>
+          <w:szCs w:val="21"/>
+          <w14:ligatures w14:val="none"/>
+        </w:rPr>
+        <w:t>end</w:t>
+      </w:r>
+    </w:p>
+    <w:p>
+      <w:pPr>
+        <w:shd w:val="clear" w:color="auto" w:fill="0A0A0A"/>
+        <w:spacing w:line="285" w:lineRule="atLeast"/>
+        <w:jc w:val="left"/>
+        <w:rPr>
+          <w:rFonts w:ascii="Consolas" w:eastAsia="Times New Roman" w:hAnsi="Consolas" w:cs="Times New Roman"/>
+          <w:color w:val="EDEDED"/>
+          <w:kern w:val="0"/>
+          <w:sz w:val="21"/>
+          <w:szCs w:val="21"/>
+          <w14:ligatures w14:val="none"/>
+        </w:rPr>
+      </w:pPr>
+      <w:r>
+        <w:rPr>
+          <w:rFonts w:ascii="Consolas" w:eastAsia="Times New Roman" w:hAnsi="Consolas" w:cs="Times New Roman"/>
+          <w:color w:val="EDEDED"/>
+          <w:kern w:val="0"/>
+          <w:sz w:val="21"/>
+          <w:szCs w:val="21"/>
+          <w14:ligatures w14:val="none"/>
+        </w:rPr>
+        <w:t xml:space="preserve">        </w:t>
+      </w:r>
+      <w:r>
+        <w:rPr>
+          <w:rFonts w:ascii="Consolas" w:eastAsia="Times New Roman" w:hAnsi="Consolas" w:cs="Times New Roman"/>
+          <w:color w:val="B675F1"/>
+          <w:kern w:val="0"/>
+          <w:sz w:val="21"/>
+          <w:szCs w:val="21"/>
+          <w14:ligatures w14:val="none"/>
+        </w:rPr>
+        <w:t>fprintf</w:t>
+      </w:r>
+      <w:r>
+        <w:rPr>
+          <w:rFonts w:ascii="Consolas" w:eastAsia="Times New Roman" w:hAnsi="Consolas" w:cs="Times New Roman"/>
+          <w:color w:val="EDEDED"/>
+          <w:kern w:val="0"/>
+          <w:sz w:val="21"/>
+          <w:szCs w:val="21"/>
+          <w14:ligatures w14:val="none"/>
+        </w:rPr>
+        <w:t xml:space="preserve">(fid, </w:t>
+      </w:r>
+      <w:r>
+        <w:rPr>
+          <w:rFonts w:ascii="Consolas" w:eastAsia="Times New Roman" w:hAnsi="Consolas" w:cs="Times New Roman"/>
+          <w:color w:val="58C760"/>
+          <w:kern w:val="0"/>
+          <w:sz w:val="21"/>
+          <w:szCs w:val="21"/>
+          <w14:ligatures w14:val="none"/>
+        </w:rPr>
+        <w:t>'</w:t>
+      </w:r>
+      <w:r>
+        <w:rPr>
+          <w:rFonts w:ascii="Consolas" w:eastAsia="Times New Roman" w:hAnsi="Consolas" w:cs="Times New Roman"/>
+          <w:color w:val="62A6FF"/>
+          <w:kern w:val="0"/>
+          <w:sz w:val="21"/>
+          <w:szCs w:val="21"/>
+          <w14:ligatures w14:val="none"/>
+        </w:rPr>
+        <w:t>%d\n</w:t>
+      </w:r>
+      <w:r>
+        <w:rPr>
+          <w:rFonts w:ascii="Consolas" w:eastAsia="Times New Roman" w:hAnsi="Consolas" w:cs="Times New Roman"/>
+          <w:color w:val="58C760"/>
+          <w:kern w:val="0"/>
+          <w:sz w:val="21"/>
+          <w:szCs w:val="21"/>
+          <w14:ligatures w14:val="none"/>
+        </w:rPr>
+        <w:t>'</w:t>
+      </w:r>
+      <w:r>
+        <w:rPr>
+          <w:rFonts w:ascii="Consolas" w:eastAsia="Times New Roman" w:hAnsi="Consolas" w:cs="Times New Roman"/>
+          <w:color w:val="EDEDED"/>
+          <w:kern w:val="0"/>
+          <w:sz w:val="21"/>
+          <w:szCs w:val="21"/>
+          <w14:ligatures w14:val="none"/>
+        </w:rPr>
+        <w:t xml:space="preserve">, </w:t>
+      </w:r>
+      <w:r>
+        <w:rPr>
+          <w:rFonts w:ascii="Consolas" w:eastAsia="Times New Roman" w:hAnsi="Consolas" w:cs="Times New Roman"/>
+          <w:color w:val="B675F1"/>
+          <w:kern w:val="0"/>
+          <w:sz w:val="21"/>
+          <w:szCs w:val="21"/>
+          <w14:ligatures w14:val="none"/>
+        </w:rPr>
+        <w:t>block</w:t>
+      </w:r>
+      <w:r>
+        <w:rPr>
+          <w:rFonts w:ascii="Consolas" w:eastAsia="Times New Roman" w:hAnsi="Consolas" w:cs="Times New Roman"/>
+          <w:color w:val="EDEDED"/>
+          <w:kern w:val="0"/>
+          <w:sz w:val="21"/>
+          <w:szCs w:val="21"/>
+          <w14:ligatures w14:val="none"/>
+        </w:rPr>
+        <w:t>(</w:t>
+      </w:r>
+      <w:r>
+        <w:rPr>
+          <w:rFonts w:ascii="Consolas" w:eastAsia="Times New Roman" w:hAnsi="Consolas" w:cs="Times New Roman"/>
+          <w:color w:val="F05B8D"/>
+          <w:kern w:val="0"/>
+          <w:sz w:val="21"/>
+          <w:szCs w:val="21"/>
+          <w14:ligatures w14:val="none"/>
+        </w:rPr>
+        <w:t>end</w:t>
+      </w:r>
+      <w:r>
+        <w:rPr>
+          <w:rFonts w:ascii="Consolas" w:eastAsia="Times New Roman" w:hAnsi="Consolas" w:cs="Times New Roman"/>
+          <w:color w:val="EDEDED"/>
+          <w:kern w:val="0"/>
+          <w:sz w:val="21"/>
+          <w:szCs w:val="21"/>
+          <w14:ligatures w14:val="none"/>
+        </w:rPr>
+        <w:t>));</w:t>
+      </w:r>
+    </w:p>
+    <w:p>
+      <w:pPr>
+        <w:shd w:val="clear" w:color="auto" w:fill="0A0A0A"/>
+        <w:spacing w:line="285" w:lineRule="atLeast"/>
+        <w:jc w:val="left"/>
+        <w:rPr>
+          <w:rFonts w:ascii="Consolas" w:eastAsia="Times New Roman" w:hAnsi="Consolas" w:cs="Times New Roman"/>
+          <w:color w:val="EDEDED"/>
+          <w:kern w:val="0"/>
+          <w:sz w:val="21"/>
+          <w:szCs w:val="21"/>
+          <w14:ligatures w14:val="none"/>
+        </w:rPr>
+      </w:pPr>
+      <w:r>
+        <w:rPr>
+          <w:rFonts w:ascii="Consolas" w:eastAsia="Times New Roman" w:hAnsi="Consolas" w:cs="Times New Roman"/>
+          <w:color w:val="EDEDED"/>
+          <w:kern w:val="0"/>
+          <w:sz w:val="21"/>
+          <w:szCs w:val="21"/>
+          <w14:ligatures w14:val="none"/>
+        </w:rPr>
+        <w:t xml:space="preserve">    </w:t>
+      </w:r>
+      <w:r>
+        <w:rPr>
+          <w:rFonts w:ascii="Consolas" w:eastAsia="Times New Roman" w:hAnsi="Consolas" w:cs="Times New Roman"/>
+          <w:color w:val="F05B8D"/>
+          <w:kern w:val="0"/>
+          <w:sz w:val="21"/>
+          <w:szCs w:val="21"/>
+          <w14:ligatures w14:val="none"/>
+        </w:rPr>
+        <w:t>end</w:t>
+      </w:r>
+    </w:p>
+    <w:p>
+      <w:pPr>
+        <w:shd w:val="clear" w:color="auto" w:fill="0A0A0A"/>
+        <w:spacing w:line="285" w:lineRule="atLeast"/>
+        <w:jc w:val="left"/>
+        <w:rPr>
+          <w:rFonts w:ascii="Consolas" w:eastAsia="Times New Roman" w:hAnsi="Consolas" w:cs="Times New Roman"/>
+          <w:color w:val="EDEDED"/>
+          <w:kern w:val="0"/>
+          <w:sz w:val="21"/>
+          <w:szCs w:val="21"/>
+          <w14:ligatures w14:val="none"/>
+        </w:rPr>
+      </w:pPr>
+      <w:r>
+        <w:rPr>
+          <w:rFonts w:ascii="Consolas" w:eastAsia="Times New Roman" w:hAnsi="Consolas" w:cs="Times New Roman"/>
+          <w:color w:val="F05B8D"/>
+          <w:kern w:val="0"/>
+          <w:sz w:val="21"/>
+          <w:szCs w:val="21"/>
+          <w14:ligatures w14:val="none"/>
+        </w:rPr>
+        <w:t>end</w:t>
+      </w:r>
+    </w:p>
+    <w:p>
+      <w:pPr>
+        <w:shd w:val="clear" w:color="auto" w:fill="0A0A0A"/>
+        <w:spacing w:line="285" w:lineRule="atLeast"/>
+        <w:jc w:val="left"/>
+        <w:rPr>
+          <w:rFonts w:ascii="Consolas" w:eastAsia="Times New Roman" w:hAnsi="Consolas" w:cs="Times New Roman"/>
+          <w:color w:val="EDEDED"/>
+          <w:kern w:val="0"/>
+          <w:sz w:val="21"/>
+          <w:szCs w:val="21"/>
+          <w14:ligatures w14:val="none"/>
+        </w:rPr>
+      </w:pPr>
+    </w:p>
+    <w:p>
+      <w:pPr>
+        <w:shd w:val="clear" w:color="auto" w:fill="0A0A0A"/>
+        <w:spacing w:line="285" w:lineRule="atLeast"/>
+        <w:jc w:val="left"/>
+        <w:rPr>
+          <w:rFonts w:ascii="Consolas" w:eastAsia="Times New Roman" w:hAnsi="Consolas" w:cs="Times New Roman"/>
+          <w:color w:val="EDEDED"/>
+          <w:kern w:val="0"/>
+          <w:sz w:val="21"/>
+          <w:szCs w:val="21"/>
+          <w14:ligatures w14:val="none"/>
+        </w:rPr>
+      </w:pPr>
+      <w:r>
+        <w:rPr>
+          <w:rFonts w:ascii="Consolas" w:eastAsia="Times New Roman" w:hAnsi="Consolas" w:cs="Times New Roman"/>
+          <w:color w:val="B675F1"/>
+          <w:kern w:val="0"/>
+          <w:sz w:val="21"/>
+          <w:szCs w:val="21"/>
+          <w14:ligatures w14:val="none"/>
+        </w:rPr>
+        <w:t>fprintf</w:t>
+      </w:r>
+      <w:r>
+        <w:rPr>
+          <w:rFonts w:ascii="Consolas" w:eastAsia="Times New Roman" w:hAnsi="Consolas" w:cs="Times New Roman"/>
+          <w:color w:val="EDEDED"/>
+          <w:kern w:val="0"/>
+          <w:sz w:val="21"/>
+          <w:szCs w:val="21"/>
+          <w14:ligatures w14:val="none"/>
+        </w:rPr>
+        <w:t xml:space="preserve">(fid, </w:t>
+      </w:r>
+      <w:r>
+        <w:rPr>
+          <w:rFonts w:ascii="Consolas" w:eastAsia="Times New Roman" w:hAnsi="Consolas" w:cs="Times New Roman"/>
+          <w:color w:val="58C760"/>
+          <w:kern w:val="0"/>
+          <w:sz w:val="21"/>
+          <w:szCs w:val="21"/>
+          <w14:ligatures w14:val="none"/>
+        </w:rPr>
+        <w:t>'};</w:t>
+      </w:r>
+      <w:r>
+        <w:rPr>
+          <w:rFonts w:ascii="Consolas" w:eastAsia="Times New Roman" w:hAnsi="Consolas" w:cs="Times New Roman"/>
+          <w:color w:val="62A6FF"/>
+          <w:kern w:val="0"/>
+          <w:sz w:val="21"/>
+          <w:szCs w:val="21"/>
+          <w14:ligatures w14:val="none"/>
+        </w:rPr>
+        <w:t>\n\n</w:t>
+      </w:r>
+      <w:r>
+        <w:rPr>
+          <w:rFonts w:ascii="Consolas" w:eastAsia="Times New Roman" w:hAnsi="Consolas" w:cs="Times New Roman"/>
+          <w:color w:val="58C760"/>
+          <w:kern w:val="0"/>
+          <w:sz w:val="21"/>
+          <w:szCs w:val="21"/>
+          <w14:ligatures w14:val="none"/>
+        </w:rPr>
+        <w:t>'</w:t>
+      </w:r>
+      <w:r>
+        <w:rPr>
+          <w:rFonts w:ascii="Consolas" w:eastAsia="Times New Roman" w:hAnsi="Consolas" w:cs="Times New Roman"/>
+          <w:color w:val="EDEDED"/>
+          <w:kern w:val="0"/>
+          <w:sz w:val="21"/>
+          <w:szCs w:val="21"/>
+          <w14:ligatures w14:val="none"/>
+        </w:rPr>
+        <w:t>);</w:t>
+      </w:r>
+    </w:p>
+    <w:p>
+      <w:pPr>
+        <w:shd w:val="clear" w:color="auto" w:fill="0A0A0A"/>
+        <w:spacing w:line="285" w:lineRule="atLeast"/>
+        <w:jc w:val="left"/>
+        <w:rPr>
+          <w:rFonts w:ascii="Consolas" w:eastAsia="Times New Roman" w:hAnsi="Consolas" w:cs="Times New Roman"/>
+          <w:color w:val="EDEDED"/>
+          <w:kern w:val="0"/>
+          <w:sz w:val="21"/>
+          <w:szCs w:val="21"/>
+          <w14:ligatures w14:val="none"/>
+        </w:rPr>
+      </w:pPr>
+      <w:r>
+        <w:rPr>
+          <w:rFonts w:ascii="Consolas" w:eastAsia="Times New Roman" w:hAnsi="Consolas" w:cs="Times New Roman"/>
+          <w:color w:val="B675F1"/>
+          <w:kern w:val="0"/>
+          <w:sz w:val="21"/>
+          <w:szCs w:val="21"/>
+          <w14:ligatures w14:val="none"/>
+        </w:rPr>
+        <w:t>fprintf</w:t>
+      </w:r>
+      <w:r>
+        <w:rPr>
+          <w:rFonts w:ascii="Consolas" w:eastAsia="Times New Roman" w:hAnsi="Consolas" w:cs="Times New Roman"/>
+          <w:color w:val="EDEDED"/>
+          <w:kern w:val="0"/>
+          <w:sz w:val="21"/>
+          <w:szCs w:val="21"/>
+          <w14:ligatures w14:val="none"/>
+        </w:rPr>
+        <w:t xml:space="preserve">(fid, </w:t>
+      </w:r>
+      <w:r>
+        <w:rPr>
+          <w:rFonts w:ascii="Consolas" w:eastAsia="Times New Roman" w:hAnsi="Consolas" w:cs="Times New Roman"/>
+          <w:color w:val="58C760"/>
+          <w:kern w:val="0"/>
+          <w:sz w:val="21"/>
+          <w:szCs w:val="21"/>
+          <w14:ligatures w14:val="none"/>
+        </w:rPr>
+        <w:t>'#endif</w:t>
+      </w:r>
+      <w:r>
+        <w:rPr>
+          <w:rFonts w:ascii="Consolas" w:eastAsia="Times New Roman" w:hAnsi="Consolas" w:cs="Times New Roman"/>
+          <w:color w:val="62A6FF"/>
+          <w:kern w:val="0"/>
+          <w:sz w:val="21"/>
+          <w:szCs w:val="21"/>
+          <w14:ligatures w14:val="none"/>
+        </w:rPr>
+        <w:t>\n</w:t>
+      </w:r>
+      <w:r>
+        <w:rPr>
+          <w:rFonts w:ascii="Consolas" w:eastAsia="Times New Roman" w:hAnsi="Consolas" w:cs="Times New Roman"/>
+          <w:color w:val="58C760"/>
+          <w:kern w:val="0"/>
+          <w:sz w:val="21"/>
+          <w:szCs w:val="21"/>
+          <w14:ligatures w14:val="none"/>
+        </w:rPr>
+        <w:t>'</w:t>
+      </w:r>
+      <w:r>
+        <w:rPr>
+          <w:rFonts w:ascii="Consolas" w:eastAsia="Times New Roman" w:hAnsi="Consolas" w:cs="Times New Roman"/>
+          <w:color w:val="EDEDED"/>
+          <w:kern w:val="0"/>
+          <w:sz w:val="21"/>
+          <w:szCs w:val="21"/>
+          <w14:ligatures w14:val="none"/>
+        </w:rPr>
+        <w:t>);</w:t>
+      </w:r>
+    </w:p>
+    <w:p>
+      <w:pPr>
+        <w:shd w:val="clear" w:color="auto" w:fill="0A0A0A"/>
+        <w:spacing w:line="285" w:lineRule="atLeast"/>
+        <w:jc w:val="left"/>
+        <w:rPr>
+          <w:rFonts w:ascii="Consolas" w:eastAsia="Times New Roman" w:hAnsi="Consolas" w:cs="Times New Roman"/>
+          <w:color w:val="EDEDED"/>
+          <w:kern w:val="0"/>
+          <w:sz w:val="21"/>
+          <w:szCs w:val="21"/>
+          <w14:ligatures w14:val="none"/>
+        </w:rPr>
+      </w:pPr>
+      <w:r>
+        <w:rPr>
+          <w:rFonts w:ascii="Consolas" w:eastAsia="Times New Roman" w:hAnsi="Consolas" w:cs="Times New Roman"/>
+          <w:color w:val="B675F1"/>
+          <w:kern w:val="0"/>
+          <w:sz w:val="21"/>
+          <w:szCs w:val="21"/>
+          <w14:ligatures w14:val="none"/>
+        </w:rPr>
+        <w:t>fclose</w:t>
+      </w:r>
+      <w:r>
+        <w:rPr>
+          <w:rFonts w:ascii="Consolas" w:eastAsia="Times New Roman" w:hAnsi="Consolas" w:cs="Times New Roman"/>
+          <w:color w:val="EDEDED"/>
+          <w:kern w:val="0"/>
+          <w:sz w:val="21"/>
+          <w:szCs w:val="21"/>
+          <w14:ligatures w14:val="none"/>
+        </w:rPr>
+        <w:t>(fid);</w:t>
+      </w:r>
+    </w:p>
+    <w:p>
+      <w:pPr>
         <w:pStyle w:val="Content"/>
         <w:rPr>
           <w:lang w:val="vi-VN"/>
         </w:rPr>
       </w:pPr>
+      <w:r>
+        <w:rPr>
+          <w:lang w:val="vi-VN"/>
+        </w:rPr>
+        <w:lastRenderedPageBreak/>
+        <w:drawing>
+          <wp:inline distT="0" distB="0" distL="0" distR="0" wp14:anchorId="507EC18B" wp14:editId="30328DAB">
+            <wp:extent cx="5940425" cy="3181350"/>
+            <wp:effectExtent l="0" t="0" r="3175" b="0"/>
+            <wp:docPr id="232830640" name="Picture 1"/>
+            <wp:cNvGraphicFramePr>
+              <a:graphicFrameLocks xmlns:a="http://schemas.openxmlformats.org/drawingml/2006/main" noChangeAspect="1"/>
+            </wp:cNvGraphicFramePr>
+            <a:graphic xmlns:a="http://schemas.openxmlformats.org/drawingml/2006/main">
+              <a:graphicData uri="http://schemas.openxmlformats.org/drawingml/2006/picture">
+                <pic:pic xmlns:pic="http://schemas.openxmlformats.org/drawingml/2006/picture">
+                  <pic:nvPicPr>
+                    <pic:cNvPr id="232830640" name=""/>
+                    <pic:cNvPicPr/>
+                  </pic:nvPicPr>
+                  <pic:blipFill>
+                    <a:blip r:embed="rId15"/>
+                    <a:stretch>
+                      <a:fillRect/>
+                    </a:stretch>
+                  </pic:blipFill>
+                  <pic:spPr>
+                    <a:xfrm>
+                      <a:off x="0" y="0"/>
+                      <a:ext cx="5940425" cy="3181350"/>
+                    </a:xfrm>
+                    <a:prstGeom prst="rect">
+                      <a:avLst/>
+                    </a:prstGeom>
+                  </pic:spPr>
+                </pic:pic>
+              </a:graphicData>
+            </a:graphic>
+          </wp:inline>
+        </w:drawing>
+      </w:r>
+      <w:r>
+        <w:rPr>
+          <w:lang w:val="vi-VN"/>
+        </w:rPr>
+        <w:drawing>
+          <wp:inline distT="0" distB="0" distL="0" distR="0" wp14:anchorId="7A5C43F3" wp14:editId="0889A8AE">
+            <wp:extent cx="5940425" cy="3181350"/>
+            <wp:effectExtent l="0" t="0" r="3175" b="0"/>
+            <wp:docPr id="1531304892" name="Picture 1"/>
+            <wp:cNvGraphicFramePr>
+              <a:graphicFrameLocks xmlns:a="http://schemas.openxmlformats.org/drawingml/2006/main" noChangeAspect="1"/>
+            </wp:cNvGraphicFramePr>
+            <a:graphic xmlns:a="http://schemas.openxmlformats.org/drawingml/2006/main">
+              <a:graphicData uri="http://schemas.openxmlformats.org/drawingml/2006/picture">
+                <pic:pic xmlns:pic="http://schemas.openxmlformats.org/drawingml/2006/picture">
+                  <pic:nvPicPr>
+                    <pic:cNvPr id="1531304892" name=""/>
+                    <pic:cNvPicPr/>
+                  </pic:nvPicPr>
+                  <pic:blipFill>
+                    <a:blip r:embed="rId16"/>
+                    <a:stretch>
+                      <a:fillRect/>
+                    </a:stretch>
+                  </pic:blipFill>
+                  <pic:spPr>
+                    <a:xfrm>
+                      <a:off x="0" y="0"/>
+                      <a:ext cx="5940425" cy="3181350"/>
+                    </a:xfrm>
+                    <a:prstGeom prst="rect">
+                      <a:avLst/>
+                    </a:prstGeom>
+                  </pic:spPr>
+                </pic:pic>
+              </a:graphicData>
+            </a:graphic>
+          </wp:inline>
+        </w:drawing>
+      </w:r>
+    </w:p>
+    <w:p>
+      <w:pPr>
+        <w:pStyle w:val="Heading3"/>
+        <w:rPr>
+          <w:lang w:val="vi-VN"/>
+        </w:rPr>
+      </w:pPr>
+      <w:r>
+        <w:rPr>
+          <w:lang w:val="vi-VN"/>
+        </w:rPr>
+        <w:lastRenderedPageBreak/>
+        <w:t>Bài 2, giảm Fs xuống 16kHz</w:t>
+      </w:r>
+    </w:p>
+    <w:p>
+      <w:pPr>
+        <w:pStyle w:val="Content"/>
+        <w:rPr>
+          <w:lang w:val="vi-VN"/>
+        </w:rPr>
+      </w:pPr>
+      <w:r>
+        <w:rPr>
+          <w:lang w:val="vi-VN"/>
+        </w:rPr>
+        <w:drawing>
+          <wp:inline distT="0" distB="0" distL="0" distR="0" wp14:anchorId="6F464933" wp14:editId="5D77A7E8">
+            <wp:extent cx="5940425" cy="3181350"/>
+            <wp:effectExtent l="0" t="0" r="3175" b="0"/>
+            <wp:docPr id="669404626" name="Picture 1"/>
+            <wp:cNvGraphicFramePr>
+              <a:graphicFrameLocks xmlns:a="http://schemas.openxmlformats.org/drawingml/2006/main" noChangeAspect="1"/>
+            </wp:cNvGraphicFramePr>
+            <a:graphic xmlns:a="http://schemas.openxmlformats.org/drawingml/2006/main">
+              <a:graphicData uri="http://schemas.openxmlformats.org/drawingml/2006/picture">
+                <pic:pic xmlns:pic="http://schemas.openxmlformats.org/drawingml/2006/picture">
+                  <pic:nvPicPr>
+                    <pic:cNvPr id="669404626" name=""/>
+                    <pic:cNvPicPr/>
+                  </pic:nvPicPr>
+                  <pic:blipFill>
+                    <a:blip r:embed="rId17"/>
+                    <a:stretch>
+                      <a:fillRect/>
+                    </a:stretch>
+                  </pic:blipFill>
+                  <pic:spPr>
+                    <a:xfrm>
+                      <a:off x="0" y="0"/>
+                      <a:ext cx="5940425" cy="3181350"/>
+                    </a:xfrm>
+                    <a:prstGeom prst="rect">
+                      <a:avLst/>
+                    </a:prstGeom>
+                  </pic:spPr>
+                </pic:pic>
+              </a:graphicData>
+            </a:graphic>
+          </wp:inline>
+        </w:drawing>
+      </w:r>
+    </w:p>
+    <w:p>
+      <w:pPr>
+        <w:pStyle w:val="Content"/>
+        <w:rPr>
+          <w:lang w:val="vi-VN"/>
+        </w:rPr>
+      </w:pPr>
+      <w:r>
+        <w:rPr>
+          <w:lang w:val="vi-VN"/>
+        </w:rPr>
+        <w:drawing>
+          <wp:inline distT="0" distB="0" distL="0" distR="0" wp14:anchorId="4167024A" wp14:editId="63936388">
+            <wp:extent cx="5940425" cy="3181350"/>
+            <wp:effectExtent l="0" t="0" r="3175" b="0"/>
+            <wp:docPr id="862619290" name="Picture 1"/>
+            <wp:cNvGraphicFramePr>
+              <a:graphicFrameLocks xmlns:a="http://schemas.openxmlformats.org/drawingml/2006/main" noChangeAspect="1"/>
+            </wp:cNvGraphicFramePr>
+            <a:graphic xmlns:a="http://schemas.openxmlformats.org/drawingml/2006/main">
+              <a:graphicData uri="http://schemas.openxmlformats.org/drawingml/2006/picture">
+                <pic:pic xmlns:pic="http://schemas.openxmlformats.org/drawingml/2006/picture">
+                  <pic:nvPicPr>
+                    <pic:cNvPr id="862619290" name=""/>
+                    <pic:cNvPicPr/>
+                  </pic:nvPicPr>
+                  <pic:blipFill>
+                    <a:blip r:embed="rId18"/>
+                    <a:stretch>
+                      <a:fillRect/>
+                    </a:stretch>
+                  </pic:blipFill>
+                  <pic:spPr>
+                    <a:xfrm>
+                      <a:off x="0" y="0"/>
+                      <a:ext cx="5940425" cy="3181350"/>
+                    </a:xfrm>
+                    <a:prstGeom prst="rect">
+                      <a:avLst/>
+                    </a:prstGeom>
+                  </pic:spPr>
+                </pic:pic>
+              </a:graphicData>
+            </a:graphic>
+          </wp:inline>
+        </w:drawing>
+      </w:r>
+    </w:p>
+    <w:p>
+      <w:pPr>
+        <w:pStyle w:val="Heading3"/>
+        <w:rPr>
+          <w:lang w:val="vi-VN"/>
+        </w:rPr>
+      </w:pPr>
+      <w:r>
+        <w:rPr>
+          <w:lang w:val="vi-VN"/>
+        </w:rPr>
+        <w:lastRenderedPageBreak/>
+        <w:t>Sóng tam giác</w:t>
+      </w:r>
+    </w:p>
+    <w:p>
+      <w:pPr>
+        <w:pStyle w:val="Content"/>
+        <w:rPr>
+          <w:lang w:val="vi-VN"/>
+        </w:rPr>
+      </w:pPr>
+      <w:r>
+        <w:rPr>
+          <w:lang w:val="vi-VN"/>
+        </w:rPr>
+        <w:drawing>
+          <wp:inline distT="0" distB="0" distL="0" distR="0" wp14:anchorId="38B8229F" wp14:editId="4358D1AE">
+            <wp:extent cx="5940425" cy="3181350"/>
+            <wp:effectExtent l="0" t="0" r="3175" b="0"/>
+            <wp:docPr id="506953025" name="Picture 1"/>
+            <wp:cNvGraphicFramePr>
+              <a:graphicFrameLocks xmlns:a="http://schemas.openxmlformats.org/drawingml/2006/main" noChangeAspect="1"/>
+            </wp:cNvGraphicFramePr>
+            <a:graphic xmlns:a="http://schemas.openxmlformats.org/drawingml/2006/main">
+              <a:graphicData uri="http://schemas.openxmlformats.org/drawingml/2006/picture">
+                <pic:pic xmlns:pic="http://schemas.openxmlformats.org/drawingml/2006/picture">
+                  <pic:nvPicPr>
+                    <pic:cNvPr id="506953025" name=""/>
+                    <pic:cNvPicPr/>
+                  </pic:nvPicPr>
+                  <pic:blipFill>
+                    <a:blip r:embed="rId19"/>
+                    <a:stretch>
+                      <a:fillRect/>
+                    </a:stretch>
+                  </pic:blipFill>
+                  <pic:spPr>
+                    <a:xfrm>
+                      <a:off x="0" y="0"/>
+                      <a:ext cx="5940425" cy="3181350"/>
+                    </a:xfrm>
+                    <a:prstGeom prst="rect">
+                      <a:avLst/>
+                    </a:prstGeom>
+                  </pic:spPr>
+                </pic:pic>
+              </a:graphicData>
+            </a:graphic>
+          </wp:inline>
+        </w:drawing>
+      </w:r>
+    </w:p>
+    <w:p>
+      <w:pPr>
+        <w:pStyle w:val="Content"/>
+        <w:rPr>
+          <w:lang w:val="vi-VN"/>
+        </w:rPr>
+      </w:pPr>
+      <w:r>
+        <w:rPr>
+          <w:lang w:val="vi-VN"/>
+        </w:rPr>
+        <w:drawing>
+          <wp:inline distT="0" distB="0" distL="0" distR="0" wp14:anchorId="45F70ECA" wp14:editId="3D7BDED7">
+            <wp:extent cx="5940425" cy="3181350"/>
+            <wp:effectExtent l="0" t="0" r="3175" b="0"/>
+            <wp:docPr id="2031627538" name="Picture 1"/>
+            <wp:cNvGraphicFramePr>
+              <a:graphicFrameLocks xmlns:a="http://schemas.openxmlformats.org/drawingml/2006/main" noChangeAspect="1"/>
+            </wp:cNvGraphicFramePr>
+            <a:graphic xmlns:a="http://schemas.openxmlformats.org/drawingml/2006/main">
+              <a:graphicData uri="http://schemas.openxmlformats.org/drawingml/2006/picture">
+                <pic:pic xmlns:pic="http://schemas.openxmlformats.org/drawingml/2006/picture">
+                  <pic:nvPicPr>
+                    <pic:cNvPr id="2031627538" name=""/>
+                    <pic:cNvPicPr/>
+                  </pic:nvPicPr>
+                  <pic:blipFill>
+                    <a:blip r:embed="rId20"/>
+                    <a:stretch>
+                      <a:fillRect/>
+                    </a:stretch>
+                  </pic:blipFill>
+                  <pic:spPr>
+                    <a:xfrm>
+                      <a:off x="0" y="0"/>
+                      <a:ext cx="5940425" cy="3181350"/>
+                    </a:xfrm>
+                    <a:prstGeom prst="rect">
+                      <a:avLst/>
+                    </a:prstGeom>
+                  </pic:spPr>
+                </pic:pic>
+              </a:graphicData>
+            </a:graphic>
+          </wp:inline>
+        </w:drawing>
+      </w:r>
+    </w:p>
+    <w:p>
+      <w:pPr>
+        <w:pStyle w:val="Heading3"/>
+        <w:rPr>
+          <w:lang w:val="vi-VN"/>
+        </w:rPr>
+      </w:pPr>
+      <w:r>
+        <w:rPr>
+          <w:lang w:val="vi-VN"/>
+        </w:rPr>
+        <w:lastRenderedPageBreak/>
+        <w:t>PSK 2s</w:t>
+      </w:r>
+    </w:p>
+    <w:p>
+      <w:pPr>
+        <w:pStyle w:val="Content"/>
+        <w:rPr>
+          <w:lang w:val="vi-VN"/>
+        </w:rPr>
+      </w:pPr>
+      <w:r>
+        <w:rPr>
+          <w:lang w:val="vi-VN"/>
+        </w:rPr>
+        <w:drawing>
+          <wp:inline distT="0" distB="0" distL="0" distR="0" wp14:anchorId="4D7AE8C6" wp14:editId="1A1A1AF8">
+            <wp:extent cx="5940425" cy="3181350"/>
+            <wp:effectExtent l="0" t="0" r="3175" b="0"/>
+            <wp:docPr id="233897212" name="Picture 1"/>
+            <wp:cNvGraphicFramePr>
+              <a:graphicFrameLocks xmlns:a="http://schemas.openxmlformats.org/drawingml/2006/main" noChangeAspect="1"/>
+            </wp:cNvGraphicFramePr>
+            <a:graphic xmlns:a="http://schemas.openxmlformats.org/drawingml/2006/main">
+              <a:graphicData uri="http://schemas.openxmlformats.org/drawingml/2006/picture">
+                <pic:pic xmlns:pic="http://schemas.openxmlformats.org/drawingml/2006/picture">
+                  <pic:nvPicPr>
+                    <pic:cNvPr id="233897212" name=""/>
+                    <pic:cNvPicPr/>
+                  </pic:nvPicPr>
+                  <pic:blipFill>
+                    <a:blip r:embed="rId21"/>
+                    <a:stretch>
+                      <a:fillRect/>
+                    </a:stretch>
+                  </pic:blipFill>
+                  <pic:spPr>
+                    <a:xfrm>
+                      <a:off x="0" y="0"/>
+                      <a:ext cx="5940425" cy="3181350"/>
+                    </a:xfrm>
+                    <a:prstGeom prst="rect">
+                      <a:avLst/>
+                    </a:prstGeom>
+                  </pic:spPr>
+                </pic:pic>
+              </a:graphicData>
+            </a:graphic>
+          </wp:inline>
+        </w:drawing>
+      </w:r>
+      <w:r>
+        <w:rPr>
+          <w:lang w:val="vi-VN"/>
+        </w:rPr>
+        <w:drawing>
+          <wp:inline distT="0" distB="0" distL="0" distR="0" wp14:anchorId="6416B851" wp14:editId="28049B17">
+            <wp:extent cx="5940425" cy="3181350"/>
+            <wp:effectExtent l="0" t="0" r="3175" b="0"/>
+            <wp:docPr id="390894159" name="Picture 1"/>
+            <wp:cNvGraphicFramePr>
+              <a:graphicFrameLocks xmlns:a="http://schemas.openxmlformats.org/drawingml/2006/main" noChangeAspect="1"/>
+            </wp:cNvGraphicFramePr>
+            <a:graphic xmlns:a="http://schemas.openxmlformats.org/drawingml/2006/main">
+              <a:graphicData uri="http://schemas.openxmlformats.org/drawingml/2006/picture">
+                <pic:pic xmlns:pic="http://schemas.openxmlformats.org/drawingml/2006/picture">
+                  <pic:nvPicPr>
+                    <pic:cNvPr id="390894159" name=""/>
+                    <pic:cNvPicPr/>
+                  </pic:nvPicPr>
+                  <pic:blipFill>
+                    <a:blip r:embed="rId22"/>
+                    <a:stretch>
+                      <a:fillRect/>
+                    </a:stretch>
+                  </pic:blipFill>
+                  <pic:spPr>
+                    <a:xfrm>
+                      <a:off x="0" y="0"/>
+                      <a:ext cx="5940425" cy="3181350"/>
+                    </a:xfrm>
+                    <a:prstGeom prst="rect">
+                      <a:avLst/>
+                    </a:prstGeom>
+                  </pic:spPr>
+                </pic:pic>
+              </a:graphicData>
+            </a:graphic>
+          </wp:inline>
+        </w:drawing>
+      </w:r>
     </w:p>
     <w:sectPr>
-      <w:footerReference w:type="default" r:id="rId15"/>
+      <w:footerReference w:type="default" r:id="rId23"/>
       <w:pgSz w:w="11907" w:h="16840" w:code="9"/>
       <w:pgMar w:top="1134" w:right="1134" w:bottom="1134" w:left="1418" w:header="720" w:footer="720" w:gutter="0"/>
       <w:pgNumType w:start="1"/>

</xml_diff>